<commit_message>
[DOCS] fix Figure 12 caption in thesis document
</commit_message>
<xml_diff>
--- a/22207073-phan-B.docx
+++ b/22207073-phan-B.docx
@@ -18071,63 +18071,11 @@
           <w14:ligatures w14:val="standardContextual"/>
         </w:rPr>
       </w:pPr>
-      <w:hyperlink w:anchor="_Toc236574188" w:history="1">
-        <w:r>
-          <w:rPr>
-            <w:rStyle w:val="Hyperlink"/>
-            <w:noProof/>
-          </w:rPr>
-          <w:t>Hình 12. Trạng thái kết nối và kết quả cập nhật OTA của các node trên ThingsBoard</w:t>
-        </w:r>
-        <w:r>
-          <w:rPr>
-            <w:noProof/>
-            <w:webHidden/>
-          </w:rPr>
-          <w:tab/>
-        </w:r>
-        <w:r>
-          <w:rPr>
-            <w:noProof/>
-            <w:webHidden/>
-          </w:rPr>
-          <w:fldChar w:fldCharType="begin"/>
-        </w:r>
-        <w:r>
-          <w:rPr>
-            <w:noProof/>
-            <w:webHidden/>
-          </w:rPr>
-          <w:instrText xml:space="preserve"> PAGEREF _Toc236574188 \h </w:instrText>
-        </w:r>
-        <w:r>
-          <w:rPr>
-            <w:noProof/>
-            <w:webHidden/>
-          </w:rPr>
-        </w:r>
-        <w:r>
-          <w:rPr>
-            <w:noProof/>
-            <w:webHidden/>
-          </w:rPr>
-          <w:fldChar w:fldCharType="separate"/>
-        </w:r>
-        <w:r>
-          <w:rPr>
-            <w:noProof/>
-            <w:webHidden/>
-          </w:rPr>
-          <w:t>39</w:t>
-        </w:r>
-        <w:r>
-          <w:rPr>
-            <w:noProof/>
-            <w:webHidden/>
-          </w:rPr>
-          <w:fldChar w:fldCharType="end"/>
-        </w:r>
-      </w:hyperlink>
+      <w:r>
+        <w:t>Hình 12. Trạng thái kết nối của các node và telemetry trên ThingsBoard</w:t>
+        <w:tab/>
+        <w:t>39</w:t>
+      </w:r>
     </w:p>
     <w:p>
       <w:pPr>

</xml_diff>

<commit_message>
[DOCS] align node health monitoring with gateway polling
</commit_message>
<xml_diff>
--- a/22207073-phan-B.docx
+++ b/22207073-phan-B.docx
@@ -7300,7 +7300,7 @@
         </w:numPr>
       </w:pPr>
       <w:r>
-        <w:t>Hỗ trợ nhiều Tag trên Gateway, Rule Chain và Dashboard; giám sát heartbeat, phát hiện out_of_range và phục hồi trạng thái sau khi MQTT kết nối lại.</w:t>
+        <w:t>Hỗ trợ nhiều Tag trên Gateway, Rule Chain và Dashboard; chủ động thăm dò trạng thái node, phát hiện out_of_range và phục hồi trạng thái sau khi MQTT kết nối lại.</w:t>
       </w:r>
     </w:p>
     <w:p>
@@ -7429,7 +7429,7 @@
         <w:pStyle w:val="ListBullet"/>
       </w:pPr>
       <w:r>
-        <w:t>Giám sát heartbeat, data watchdog trong thời gian chạy và phát lại trạng thái out_of_range sau khi MQTT kết nối lại.</w:t>
+        <w:t>Giám sát node bằng cơ chế Gateway chủ động thăm dò, duy trì data watchdog trong thời gian chạy và phát lại trạng thái out_of_range sau khi MQTT kết nối lại.</w:t>
       </w:r>
     </w:p>
     <w:p>
@@ -11443,7 +11443,7 @@
         <w:ind w:firstLine="567"/>
       </w:pPr>
       <w:r>
-        <w:t>Gateway theo dõi cả TAG_STATUS và heartbeat của Scanner/Relay trong suốt thời gian chạy, không chỉ ở giai đoạn khởi động. Scanner và Relay gửi heartbeat mỗi 20 giây; node được xem là offline nếu quá 60 giây không có cập nhật. Data watchdog chỉ kích hoạt quy trình reset/re-provision khi toàn tuyến không còn traffic hợp lệ trong ngưỡng cấu hình, tránh nhầm một Tag tạm thời ở ngoài vùng phủ với lỗi toàn mạng.</w:t>
+        <w:t>Gateway theo dõi Scanner và Relay trong suốt thời gian chạy bằng cơ chế chủ động thăm dò, không yêu cầu node tự phát heartbeat. Sau thời gian ổn định ban đầu, Gateway dùng Config Client gửi DEFAULT_TTL_GET tới từng node theo chu kỳ 20 giây. Phản hồi hợp lệ cập nhật last_seen và trạng thái online; TAG_STATUS nhận từ Scanner cũng được tính là hoạt động mesh. Node được đánh dấu offline nếu quá 60 giây không nhận được phản hồi hoặc dữ liệu hợp lệ. Data watchdog giám sát traffic ở lớp BLE Mesh và chỉ kích hoạt reset/re-provision khi toàn tuyến im lặng trong ngưỡng cấu hình, tránh nhầm một Tag tạm thời ngoài vùng phủ với lỗi toàn mạng.</w:t>
       </w:r>
     </w:p>
     <w:p>
@@ -12076,7 +12076,7 @@
         <w:ind w:firstLine="567"/>
       </w:pPr>
       <w:r>
-        <w:t>Định dạng TAG_STATUS, heartbeat và các opcode vendor là hợp đồng giao tiếp giữa phần firmware edge và Gateway. BLE Mesh, cơ chế provision và Relay được giữ như nội dung chung; phần B bắt đầu tại điểm Gateway nhận, xác thực cấu trúc và xếp hàng message.</w:t>
+        <w:t>Định dạng TAG_STATUS và các opcode vendor là hợp đồng giao tiếp giữa firmware edge và Gateway. Việc giám sát node được thực hiện bằng Config Client DEFAULT_TTL_GET của BLE Mesh, không dùng một opcode heartbeat riêng. BLE Mesh, cơ chế provision và Relay được giữ như nội dung chung; phần B bắt đầu tại điểm Gateway nhận, xác thực cấu trúc và xếp hàng message.</w:t>
       </w:r>
     </w:p>
     <w:p>
@@ -23550,7 +23550,7 @@
         <w:pStyle w:val="ListBullet"/>
       </w:pPr>
       <w:r>
-        <w:t>Đóng góp riêng của phần B: triển khai Gateway nhận TAG_STATUS qua callback BLE Mesh, tách callback và MQTTS bằng hàng đợi FreeRTOS, kết nối Wi-Fi/TLS, đóng gói Gateway API, giám sát heartbeat/data watchdog và phục hồi out_of_range; xây dựng Rule Chain cùng dashboard hỗ trợ nhiều Tag. OTA không thuộc đóng góp cá nhân phần B.</w:t>
+        <w:t>Đóng góp riêng của phần B: triển khai Gateway nhận TAG_STATUS qua callback BLE Mesh, tách callback và MQTTS bằng hàng đợi FreeRTOS, kết nối Wi-Fi/TLS, đóng gói Gateway API, chủ động thăm dò node bằng Config Client, duy trì data watchdog và phục hồi out_of_range; xây dựng Rule Chain cùng dashboard hỗ trợ nhiều Tag. OTA không thuộc đóng góp cá nhân phần B.</w:t>
       </w:r>
     </w:p>
     <w:p>
@@ -23558,7 +23558,7 @@
         <w:pStyle w:val="ListBullet"/>
       </w:pPr>
       <w:r>
-        <w:t>Khả năng tự phục hồi: Gateway lưu node table và cấu hình mesh trong NVS, theo dõi heartbeat/TAG_STATUS trong thời gian chạy, phát hiện node offline và kích hoạt khôi phục khi toàn tuyến mất traffic. Trạng thái out_of_range được giữ pending để phát lại sau khi MQTT kết nối lại.</w:t>
+        <w:t>Khả năng tự phục hồi: Gateway lưu node table và cấu hình mesh trong NVS, chủ động ping Scanner/Relay bằng DEFAULT_TTL_GET và theo dõi TAG_STATUS trong thời gian chạy. Node bị đánh dấu offline sau 60 giây không có phản hồi hợp lệ; quy trình khôi phục được kích hoạt khi toàn tuyến mất traffic. Trạng thái out_of_range được giữ pending để phát lại sau khi MQTT kết nối lại.</w:t>
       </w:r>
     </w:p>
     <w:p>

</xml_diff>

<commit_message>
[DOCS] clarify gateway and rule chain freshness thresholds
</commit_message>
<xml_diff>
--- a/22207073-phan-B.docx
+++ b/22207073-phan-B.docx
@@ -7413,7 +7413,7 @@
         <w:pStyle w:val="ListBullet"/>
       </w:pPr>
       <w:r>
-        <w:t>Rule Chain xác định phòng bằng độ tươi dữ liệu, hysteresis 5 dB và debounce hai lần xác nhận.</w:t>
+        <w:t>Rule Chain xác định phòng bằng cửa sổ dữ liệu tươi 10 000 ms, hysteresis 5 dB và debounce hai lần xác nhận; ngưỡng này độc lập với các timeout cục bộ trên Gateway.</w:t>
       </w:r>
     </w:p>
     <w:p>
@@ -11477,7 +11477,13 @@
     <w:p>
       <w:pPr/>
       <w:r>
-        <w:t>Gateway duy trì trạng thái gần nhất theo từng Tag. Khi không còn TAG_STATUS hợp lệ trong thời gian quy định, Gateway tạo trạng thái out_of_range. Nếu MQTT đang ngắt đúng thời điểm đó, trạng thái được đánh dấu pending và phát lại sau khi kết nối được khôi phục, nhờ vậy ThingsBoard không tiếp tục hiển thị một phòng cũ vô thời hạn.</w:t>
+        <w:t>Gateway duy trì thời điểm nhận report gần nhất theo từng Tag. Khi quá BMT_TAG_OUT_OF_RANGE_MS = 10 000 ms không nhận TAG_STATUS hợp lệ, Gateway tạo trạng thái out_of_range. Nếu MQTT đang ngắt đúng thời điểm đó, trạng thái được đánh dấu pending và phát lại sau khi kết nối được khôi phục, nhờ vậy ThingsBoard không tiếp tục hiển thị một phòng cũ vô thời hạn.</w:t>
+      </w:r>
+    </w:p>
+    <w:p>
+      <w:pPr/>
+      <w:r>
+        <w:t>Gateway còn khai báo BMT_SCANNER_VALID_MS = 3 500 ms để phân loại mẫu RSSI của từng Scanner là FRESH hoặc STALE trong bảng trạng thái cục bộ và log chẩn đoán. Ngưỡng 3,5 giây này không tham gia thuật toán quyết định phòng trên ThingsBoard và cũng không phải timeout out_of_range của Tag.</w:t>
       </w:r>
     </w:p>
     <w:p>
@@ -11615,7 +11621,7 @@
         <w:ind w:firstLine="567"/>
       </w:pPr>
       <w:r>
-        <w:t>Các tham số hysteresis, debounce và SCANNER_VALID_MS được khai báo trong script của Rule Chain và có thể sửa qua giao diện ThingsBoard mà không cần biên dịch lại firmware. Cấu hình vận hành hiện tại lần lượt là 5 dB, hai lần xác nhận và 10 000 ms.</w:t>
+        <w:t>Các tham số hysteresis, debounce và SCANNER_VALID_MS được khai báo trong script của Rule Chain và có thể sửa qua giao diện ThingsBoard mà không cần biên dịch lại firmware. Cấu hình vận hành hiện tại lần lượt là 5 dB, hai lần xác nhận và 10 000 ms. Đây là cửa sổ độ tươi dùng khi so sánh RSSI giữa các Scanner, không phải BMT_SCANNER_VALID_MS = 3 500 ms dùng cho chẩn đoán cục bộ trên Gateway và không phải BMT_TAG_OUT_OF_RANGE_MS = 10 000 ms dùng để phát hiện Tag ngừng report.</w:t>
       </w:r>
     </w:p>
     <w:p>
@@ -12096,7 +12102,7 @@
         <w:ind w:firstLine="567"/>
       </w:pPr>
       <w:r>
-        <w:t>Server assets gồm docker-compose.yml, rulechain/ble_tag_zone_detection.json và dashboard/indoor_tracking.json. Rule Chain chứa ánh xạ Scanner–phòng, độ tươi 10 000 ms, hysteresis 5 dB và debounce hai lần; dashboard export chứa alias All Tags, Selected Tag và hành động chọn Tag từ bảng.</w:t>
+        <w:t>Server assets gồm docker-compose.yml, rulechain/ble_tag_zone_detection.json và dashboard/indoor_tracking.json. Rule Chain chứa ánh xạ Scanner–phòng, SCANNER_VALID_MS = 10 000 ms, hysteresis 5 dB và debounce hai lần; dashboard export chứa alias All Tags, Selected Tag và hành động chọn Tag từ bảng. Hằng số cùng tên ở Gateway có giá trị 3 500 ms nhưng chỉ phục vụ log chẩn đoán, nên hai giá trị phải được đọc theo đúng lớp xử lý.</w:t>
       </w:r>
     </w:p>
     <w:p>
@@ -23566,11 +23572,7 @@
         <w:pStyle w:val="ListBullet"/>
       </w:pPr>
       <w:r>
-        <w:rPr>
-          <w:szCs w:val="26"/>
-        </w:rPr>
-        <w:lastRenderedPageBreak/>
-        <w:t>Cơ chế hạn chế flapping có thể tinh chỉnh: Rule Chain dùng hysteresis 5 dB, debounce leaky-bucket và giới hạn độ tươi dữ liệu. Trong 35 cửa sổ sau Grace, 22 lần đổi zone tạo 7 chu kỳ flapping hoàn chỉnh, tương đương 0,20 chu kỳ/phút.</w:t>
+        <w:t>Cơ chế hạn chế flapping có thể tinh chỉnh: Rule Chain dùng hysteresis 5 dB, debounce leaky-bucket và cửa sổ độ tươi 10 000 ms. Ngưỡng này thuộc server-side, tách biệt với freshness chẩn đoán 3 500 ms và timeout out_of_range 10 000 ms trên Gateway. Trong 35 cửa sổ sau Grace, 22 lần đổi zone tạo 7 chu kỳ flapping hoàn chỉnh, tương đương 0,20 chu kỳ/phút.</w:t>
       </w:r>
     </w:p>
     <w:p>

</xml_diff>

<commit_message>
[DOCS] align gateway and ThingsBoard responsibilities
</commit_message>
<xml_diff>
--- a/22207073-phan-B.docx
+++ b/22207073-phan-B.docx
@@ -7264,7 +7264,7 @@
         </w:numPr>
       </w:pPr>
       <w:r>
-        <w:t>Tích hợp Gateway vào kiến trúc chung: nhận TAG_STATUS từ BLE Mesh, quản lý node và chuyển dữ liệu sang mạng IP mà không thực hiện quyết định phòng trong firmware.</w:t>
+        <w:t>Tích hợp Gateway vào kiến trúc chung: nhận TAG_STATUS từ BLE Mesh, quản lý node và chuyển dữ liệu sang mạng IP. Gateway không chạy thuật toán so sánh RSSI, hysteresis hoặc debounce để đưa ra phòng chính thức; các bước này thuộc ThingsBoard Rule Chain.</w:t>
       </w:r>
     </w:p>
     <w:p>
@@ -7954,17 +7954,7 @@
         <w:pStyle w:val="ListBullet"/>
       </w:pPr>
       <w:r>
-        <w:lastRenderedPageBreak/>
-        <w:t>Rule Chain Engine cho phép định nghĩa luồng xử lý dữ liệu bằng UI kéo</w:t>
-      </w:r>
-      <w:r>
-        <w:rPr>
-          <w:lang w:val="vi-VN"/>
-        </w:rPr>
-        <w:t xml:space="preserve">, </w:t>
-      </w:r>
-      <w:r>
-        <w:t>thả – toàn bộ logic chọn phòng nằm ở đây, không nằm trong firmware.</w:t>
+        <w:t>Rule Chain Engine cho phép định nghĩa luồng xử lý dữ liệu bằng UI kéo, thả. Thuật toán chọn phòng chính thức — gồm so sánh RSSI, độ tươi, hysteresis và debounce — nằm tại đây. Gateway chỉ giữ state cục bộ tối thiểu để quản lý Tag và phát hiện timeout, không sử dụng state đó làm kết quả định vị chính thức.</w:t>
       </w:r>
     </w:p>
     <w:p>
@@ -11477,7 +11467,7 @@
     <w:p>
       <w:pPr/>
       <w:r>
-        <w:t>Gateway duy trì thời điểm nhận report gần nhất theo từng Tag. Khi quá BMT_TAG_OUT_OF_RANGE_MS = 10 000 ms không nhận TAG_STATUS hợp lệ, Gateway tạo trạng thái out_of_range. Nếu MQTT đang ngắt đúng thời điểm đó, trạng thái được đánh dấu pending và phát lại sau khi kết nối được khôi phục, nhờ vậy ThingsBoard không tiếp tục hiển thị một phòng cũ vô thời hạn.</w:t>
+        <w:t>Gateway chạy zone_timeout_task theo chu kỳ 1 giây và duy trì last_any_report_ms riêng cho từng Tag. Khi quá BMT_TAG_OUT_OF_RANGE_MS = 10 000 ms không nhận TAG_STATUS hợp lệ, Gateway đặt marker cục bộ về BMT_ZONE_UNKNOWN, xoá các cờ Scanner hợp lệ và publish current_zone = out_of_range cùng current_zone_num = 0 lên v1/gateway/attributes với QoS 1. Đây là trạng thái timeout do Gateway phát hiện, không phải kết quả của thuật toán so sánh RSSI trên Rule Chain.</w:t>
       </w:r>
     </w:p>
     <w:p>
@@ -11497,7 +11487,7 @@
     <w:p>
       <w:pPr/>
       <w:r>
-        <w:t>Hàng đợi hiện có 64 phần tử và không phải bộ đệm bền vững. Khi tốc độ nhận vượt khả năng publish hoặc mất mạng kéo dài, report RSSI có thể bị bỏ để ưu tiên dữ liệu mới; đây là lựa chọn phù hợp với telemetry liên tục. Riêng chuyển trạng thái out_of_range được giữ lại để phát lại. Gateway quản lý tối đa 16 Tag đồng thời trong cấu hình hiện tại.</w:t>
+        <w:t>Nếu publish out_of_range không thực hiện được vì MQTT đang ngắt, Gateway đặt cờ out_of_range_pending cho đúng Tag. Khi nhận MQTT_EVENT_CONNECTED, Gateway khai báo lại các node/Tag đã biết với ThingsBoard rồi phát lại những trạng thái pending. Một TAG_STATUS mới đến trước lúc reconnect sẽ xoá pending vì dữ liệu mới đã thay thế trạng thái mất vùng phủ cũ. Hàng đợi RSSI có 64 phần tử và không phải bộ đệm bền vững; report thường có thể bị bỏ khi quá tải hoặc mất mạng kéo dài. Gateway quản lý tối đa 16 Tag đồng thời.</w:t>
       </w:r>
     </w:p>
     <w:p>
@@ -11517,7 +11507,7 @@
         <w:ind w:firstLine="567"/>
       </w:pPr>
       <w:r>
-        <w:t>Server chạy ThingsBoard CE bằng Docker Compose. Gateway chỉ chịu trách nhiệm chuyển telemetry; việc xác định phòng, lưu trạng thái và trình bày nhiều Tag được thực hiện trên ThingsBoard để có thể thay đổi thuật toán mà không biên dịch lại firmware.</w:t>
+        <w:t>Server chạy ThingsBoard CE bằng Docker Compose. Gateway chịu trách nhiệm tiếp nhận và chuyển telemetry, quản lý vòng đời child device, công bố trạng thái node và phát hiện timeout out_of_range. ThingsBoard chịu trách nhiệm chạy thuật toán xác định phòng chính thức, lưu attributes/timeseries và trình bày nhiều Tag. Ranh giới này cho phép thay đổi ánh xạ phòng, hysteresis hoặc debounce mà không biên dịch lại firmware.</w:t>
       </w:r>
     </w:p>
     <w:p>
@@ -11858,7 +11848,7 @@
     <w:p>
       <w:pPr/>
       <w:r>
-        <w:t>Mỗi Tag được ThingsBoard tạo thành một child device riêng qua Gateway API, với tag_id làm định danh ổn định. SERVER_SCOPE attributes lưu trạng thái mới nhất như current_zone, current_zone_label, current_rssi và current_scanner; timeseries lưu current_zone_num cùng RSSI của từng Scanner để vẽ lịch sử và phân tích độ trễ. Việc tách entity theo Tag bảo đảm rule chain và dashboard xử lý đúng khi có từ hai Tag trở lên.</w:t>
+        <w:t>Mỗi Tag được ThingsBoard tạo thành một child device riêng qua Gateway API, với tag_id làm định danh ổn định. Với report thông thường, Rule Chain ghi SERVER_SCOPE attributes như current_zone, current_zone_label, current_rssi và current_scanner, đồng thời ghi current_zone_num cùng RSSI từng Scanner vào timeseries. Riêng timeout out_of_range do Gateway phát hiện được publish trực tiếp lên attributes với current_zone = out_of_range và current_zone_num = 0; nó không đi qua nhánh timeseries của Rule Chain. Việc tách entity theo Tag bảo đảm state của các Tag không ghi đè lẫn nhau.</w:t>
       </w:r>
     </w:p>
     <w:p>
@@ -11982,7 +11972,7 @@
         <w:ind w:firstLine="567"/>
       </w:pPr>
       <w:r>
-        <w:t>Gateway trích tag_id từ TAG_STATUS và dùng khóa này để cập nhật đúng slot trạng thái. Mỗi Tag có thời điểm nhìn thấy gần nhất và cờ out_of_range riêng; vì vậy Tag mất tín hiệu không làm thay đổi trạng thái của Tag khác. Cấu hình hiện tại hỗ trợ tối đa 16 Tag được theo dõi đồng thời.</w:t>
+        <w:t>Gateway trích tag_id từ TAG_STATUS và dùng khóa này để cập nhật đúng slot trạng thái. Mỗi Tag có last_any_report_ms, marker current_zone_id cục bộ và cờ out_of_range_pending riêng; các trường này chỉ phục vụ quản lý timeout và replay, không thay thế current_zone do Rule Chain quyết định. Vì vậy một Tag mất tín hiệu không làm thay đổi state của Tag khác. Cấu hình hiện tại hỗ trợ tối đa 16 Tag.</w:t>
       </w:r>
     </w:p>
     <w:p>
@@ -23591,7 +23581,7 @@
         <w:pStyle w:val="ListBullet"/>
       </w:pPr>
       <w:r>
-        <w:t>Khả năng tái sử dụng: Gateway và ThingsBoard tách rõ thu nhận, vận chuyển và quyết định phòng. Mỗi Tag là một child device với state độc lập; dashboard tổng quan–chi tiết cho phép mở rộng số Tag trong giới hạn tài nguyên mà không nhân bản logic xử lý.</w:t>
+        <w:t>Khả năng tái sử dụng: Gateway đảm nhiệm thu nhận, vận chuyển, vòng đời child device và timeout; ThingsBoard đảm nhiệm thuật toán quyết định phòng chính thức cùng lưu trữ server-side. Mỗi Tag có state độc lập; dashboard tổng quan–chi tiết cho phép mở rộng số Tag trong giới hạn tài nguyên mà không nhân bản logic xử lý.</w:t>
       </w:r>
     </w:p>
     <w:p>

</xml_diff>

<commit_message>
[DOCS] remove remaining Part A topics from report
</commit_message>
<xml_diff>
--- a/22207073-phan-B.docx
+++ b/22207073-phan-B.docx
@@ -2412,17 +2412,7 @@
         <w:pStyle w:val="TOC3"/>
       </w:pPr>
       <w:r>
-        <w:t>6.3.1 Định vị tọa độ (x, y) bằng trilateration</w:t>
-        <w:tab/>
-        <w:t>48</w:t>
-      </w:r>
-    </w:p>
-    <w:p>
-      <w:pPr>
-        <w:pStyle w:val="TOC3"/>
-      </w:pPr>
-      <w:r>
-        <w:t>6.3.2 Học máy hiệu chỉnh path-loss theo môi trường</w:t>
+        <w:t>6.3.1 Fleet management đa site</w:t>
         <w:tab/>
         <w:t>49</w:t>
       </w:r>
@@ -2432,27 +2422,7 @@
         <w:pStyle w:val="TOC3"/>
       </w:pPr>
       <w:r>
-        <w:t>6.3.3 Fleet management đa site</w:t>
-        <w:tab/>
-        <w:t>49</w:t>
-      </w:r>
-    </w:p>
-    <w:p>
-      <w:pPr>
-        <w:pStyle w:val="TOC3"/>
-      </w:pPr>
-      <w:r>
-        <w:t>6.3.4 Chống nhiễu 2.4 GHz</w:t>
-        <w:tab/>
-        <w:t>49</w:t>
-      </w:r>
-    </w:p>
-    <w:p>
-      <w:pPr>
-        <w:pStyle w:val="TOC3"/>
-      </w:pPr>
-      <w:r>
-        <w:t>6.3.5 Tích hợp thêm cảm biến trên Tag</w:t>
+        <w:t>6.3.2 Chống nhiễu 2.4 GHz</w:t>
         <w:tab/>
         <w:t>49</w:t>
       </w:r>
@@ -7730,13 +7700,8 @@
             <w:vAlign w:val="center"/>
           </w:tcPr>
           <w:p>
-            <w:pPr>
-              <w:spacing w:line="240" w:lineRule="auto"/>
-              <w:ind w:firstLine="0"/>
-              <w:jc w:val="center"/>
-            </w:pPr>
-            <w:r>
-              <w:t>16 MB flash, Wi-Fi và BLE đồng thời; Secure Boot V2 + Flash Encryption.</w:t>
+            <w:r>
+              <w:t>16 MB flash; chạy đồng thời Wi-Fi, MQTTS và BLE Mesh.</w:t>
             </w:r>
           </w:p>
         </w:tc>
@@ -7784,13 +7749,8 @@
             <w:vAlign w:val="center"/>
           </w:tcPr>
           <w:p>
-            <w:pPr>
-              <w:spacing w:line="240" w:lineRule="auto"/>
-              <w:ind w:firstLine="0"/>
-              <w:jc w:val="center"/>
-            </w:pPr>
-            <w:r>
-              <w:t>Cùng loại board, chia sẻ chung 1 firmware OTA; mỗi phòng bố trí 1 scanner.</w:t>
+            <w:r>
+              <w:t>Mỗi phòng bố trí một Scanner và gửi TAG_STATUS qua BLE Mesh.</w:t>
             </w:r>
           </w:p>
         </w:tc>
@@ -9645,168 +9605,6 @@
           </w:p>
         </w:tc>
       </w:tr>
-      <w:tr>
-        <w:trPr>
-          <w:cantSplit/>
-          <w:jc w:val="center"/>
-        </w:trPr>
-        <w:tc>
-          <w:tcPr>
-            <w:tcW w:w="3116" w:type="dxa"/>
-            <w:vAlign w:val="center"/>
-          </w:tcPr>
-          <w:p>
-            <w:pPr>
-              <w:spacing w:line="240" w:lineRule="auto"/>
-              <w:ind w:firstLine="0"/>
-              <w:jc w:val="center"/>
-            </w:pPr>
-            <w:r>
-              <w:t>OTA_TRIGGER</w:t>
-            </w:r>
-          </w:p>
-        </w:tc>
-        <w:tc>
-          <w:tcPr>
-            <w:tcW w:w="3115" w:type="dxa"/>
-            <w:vAlign w:val="center"/>
-          </w:tcPr>
-          <w:p>
-            <w:pPr>
-              <w:spacing w:line="240" w:lineRule="auto"/>
-              <w:ind w:firstLine="0"/>
-              <w:jc w:val="center"/>
-            </w:pPr>
-            <w:r>
-              <w:t>Gateway Node</w:t>
-            </w:r>
-          </w:p>
-        </w:tc>
-        <w:tc>
-          <w:tcPr>
-            <w:tcW w:w="3114" w:type="dxa"/>
-            <w:vAlign w:val="center"/>
-          </w:tcPr>
-          <w:p>
-            <w:pPr>
-              <w:spacing w:line="240" w:lineRule="auto"/>
-              <w:ind w:firstLine="0"/>
-              <w:jc w:val="center"/>
-            </w:pPr>
-            <w:r>
-              <w:t>Bắt đầu WiFi OTA.</w:t>
-            </w:r>
-          </w:p>
-        </w:tc>
-      </w:tr>
-      <w:tr>
-        <w:trPr>
-          <w:cantSplit/>
-          <w:jc w:val="center"/>
-        </w:trPr>
-        <w:tc>
-          <w:tcPr>
-            <w:tcW w:w="3116" w:type="dxa"/>
-            <w:vAlign w:val="center"/>
-          </w:tcPr>
-          <w:p>
-            <w:pPr>
-              <w:spacing w:line="240" w:lineRule="auto"/>
-              <w:ind w:firstLine="0"/>
-              <w:jc w:val="center"/>
-            </w:pPr>
-            <w:r>
-              <w:t>OTA_RESULT</w:t>
-            </w:r>
-          </w:p>
-        </w:tc>
-        <w:tc>
-          <w:tcPr>
-            <w:tcW w:w="3115" w:type="dxa"/>
-            <w:vAlign w:val="center"/>
-          </w:tcPr>
-          <w:p>
-            <w:pPr>
-              <w:spacing w:line="240" w:lineRule="auto"/>
-              <w:ind w:firstLine="0"/>
-              <w:jc w:val="center"/>
-            </w:pPr>
-            <w:r>
-              <w:t>Node Gateway</w:t>
-            </w:r>
-          </w:p>
-        </w:tc>
-        <w:tc>
-          <w:tcPr>
-            <w:tcW w:w="3114" w:type="dxa"/>
-            <w:vAlign w:val="center"/>
-          </w:tcPr>
-          <w:p>
-            <w:pPr>
-              <w:spacing w:line="240" w:lineRule="auto"/>
-              <w:ind w:firstLine="0"/>
-              <w:jc w:val="center"/>
-            </w:pPr>
-            <w:r>
-              <w:t>Báo kết quả OTA (0=OK, 1=FAIL).</w:t>
-            </w:r>
-          </w:p>
-        </w:tc>
-      </w:tr>
-      <w:tr>
-        <w:trPr>
-          <w:cantSplit/>
-          <w:jc w:val="center"/>
-        </w:trPr>
-        <w:tc>
-          <w:tcPr>
-            <w:tcW w:w="3116" w:type="dxa"/>
-            <w:vAlign w:val="center"/>
-          </w:tcPr>
-          <w:p>
-            <w:pPr>
-              <w:spacing w:line="240" w:lineRule="auto"/>
-              <w:ind w:firstLine="0"/>
-              <w:jc w:val="center"/>
-            </w:pPr>
-            <w:r>
-              <w:t>OTA_KEY_PUSH</w:t>
-            </w:r>
-          </w:p>
-        </w:tc>
-        <w:tc>
-          <w:tcPr>
-            <w:tcW w:w="3115" w:type="dxa"/>
-            <w:vAlign w:val="center"/>
-          </w:tcPr>
-          <w:p>
-            <w:pPr>
-              <w:spacing w:line="240" w:lineRule="auto"/>
-              <w:ind w:firstLine="0"/>
-              <w:jc w:val="center"/>
-            </w:pPr>
-            <w:r>
-              <w:t>Gateway Scanner</w:t>
-            </w:r>
-          </w:p>
-        </w:tc>
-        <w:tc>
-          <w:tcPr>
-            <w:tcW w:w="3114" w:type="dxa"/>
-            <w:vAlign w:val="center"/>
-          </w:tcPr>
-          <w:p>
-            <w:pPr>
-              <w:spacing w:line="240" w:lineRule="auto"/>
-              <w:ind w:firstLine="0"/>
-              <w:jc w:val="center"/>
-            </w:pPr>
-            <w:r>
-              <w:t>Đẩy khoá HMAC OTA-beacon mới.</w:t>
-            </w:r>
-          </w:p>
-        </w:tc>
-      </w:tr>
     </w:tbl>
     <w:p>
       <w:pPr>
@@ -10911,13 +10709,8 @@
             <w:vAlign w:val="center"/>
           </w:tcPr>
           <w:p>
-            <w:pPr>
-              <w:spacing w:line="240" w:lineRule="auto"/>
-              <w:ind w:firstLine="0"/>
-              <w:jc w:val="center"/>
-            </w:pPr>
-            <w:r>
-              <w:t>RPC (ví dụ trigger OTA).</w:t>
+            <w:r>
+              <w:t>Nhận RPC quản lý từ broker.</w:t>
             </w:r>
           </w:p>
         </w:tc>
@@ -23708,23 +23501,16 @@
           <w:rFonts w:ascii="Times New Roman" w:hAnsi="Times New Roman" w:cs="Times New Roman"/>
         </w:rPr>
       </w:pPr>
-      <w:bookmarkStart w:id="490" w:name="_Toc236264373"/>
-      <w:bookmarkStart w:id="491" w:name="_Toc236340851"/>
-      <w:r>
-        <w:rPr>
-          <w:rFonts w:ascii="Times New Roman" w:eastAsia="Times New Roman" w:hAnsi="Times New Roman" w:cs="Times New Roman"/>
-        </w:rPr>
-        <w:t>6.3.1 Định vị tọa độ (x, y) bằng trilateration</w:t>
-      </w:r>
-      <w:bookmarkEnd w:id="490"/>
-      <w:bookmarkEnd w:id="491"/>
+      <w:r>
+        <w:t>6.3.1 Fleet management đa site</w:t>
+      </w:r>
     </w:p>
     <w:p>
       <w:pPr>
         <w:ind w:firstLine="567"/>
       </w:pPr>
       <w:r>
-        <w:t>Hệ thống hiện phân loại phòng từ RSSI tương đối. Có thể mở rộng bằng cách hiệu chỉnh mô hình path-loss, thu đồng thời RSSI từ ít nhất ba Scanner, giải trilateration và dùng Kalman 2D hoặc particle filter để làm mượt quỹ đạo [5], [6].</w:t>
+        <w:t>Hiện chỉ 1 gateway trên 1 LAN. Mở rộng: nhiều gateway ở nhiều toà nhà, sync config (khóa HMAC, ngưỡng thuật toán) và telemetry qua cloud ThingsBoard PE (Professional Edition) hoặc self-host cluster. Đòi hỏi thêm cơ chế phân quyền theo tenant, dashboard cấp portfolio.</w:t>
       </w:r>
     </w:p>
     <w:p>
@@ -23735,117 +23521,16 @@
           <w:rFonts w:ascii="Times New Roman" w:hAnsi="Times New Roman" w:cs="Times New Roman"/>
         </w:rPr>
       </w:pPr>
-      <w:bookmarkStart w:id="492" w:name="_Toc236264374"/>
-      <w:bookmarkStart w:id="493" w:name="_Toc236089496"/>
-      <w:bookmarkStart w:id="494" w:name="_Toc236340852"/>
-      <w:r>
-        <w:rPr>
-          <w:rFonts w:ascii="Times New Roman" w:eastAsia="Times New Roman" w:hAnsi="Times New Roman" w:cs="Times New Roman"/>
-        </w:rPr>
-        <w:t>6.3.2 Học máy hiệu chỉnh path-loss theo môi trường</w:t>
-      </w:r>
-      <w:bookmarkEnd w:id="492"/>
-      <w:bookmarkEnd w:id="493"/>
-      <w:bookmarkEnd w:id="494"/>
+      <w:r>
+        <w:t>6.3.2 Chống nhiễu 2.4 GHz</w:t>
+      </w:r>
     </w:p>
     <w:p>
       <w:pPr>
         <w:ind w:firstLine="567"/>
       </w:pPr>
       <w:r>
-        <w:t>Hệ số path-loss n = 2,5 hiện chỉ phục vụ phép ước lượng khoảng cách tham khảo, không tham gia trực tiếp vào quyết định phòng. Trong hướng phát triển, mô hình hồi quy có thể học tham số theo từng cặp Tag–Scanner hoặc theo trạng thái môi trường từ dữ liệu ground truth; mô hình phải được kiểm chứng trên tập đo độc lập trước khi triển khai.</w:t>
-      </w:r>
-    </w:p>
-    <w:p>
-      <w:pPr>
-        <w:pStyle w:val="Heading3"/>
-        <w:spacing w:line="276" w:lineRule="auto"/>
-        <w:rPr>
-          <w:rFonts w:ascii="Times New Roman" w:hAnsi="Times New Roman" w:cs="Times New Roman"/>
-        </w:rPr>
-      </w:pPr>
-      <w:bookmarkStart w:id="495" w:name="_Toc236264375"/>
-      <w:bookmarkStart w:id="496" w:name="_Toc236089497"/>
-      <w:bookmarkStart w:id="497" w:name="_Toc236340853"/>
-      <w:r>
-        <w:rPr>
-          <w:rFonts w:ascii="Times New Roman" w:eastAsia="Times New Roman" w:hAnsi="Times New Roman" w:cs="Times New Roman"/>
-        </w:rPr>
-        <w:t>6.3.3 Fleet management đa site</w:t>
-      </w:r>
-      <w:bookmarkEnd w:id="495"/>
-      <w:bookmarkEnd w:id="496"/>
-      <w:bookmarkEnd w:id="497"/>
-    </w:p>
-    <w:p>
-      <w:pPr>
-        <w:ind w:firstLine="567"/>
-      </w:pPr>
-      <w:r>
-        <w:t>Hiện chỉ 1 gateway trên 1 LAN. Mở rộng: nhiều gateway ở nhiều toà nhà, sync config (khóa HMAC, ngưỡng thuật toán) và telemetry qua cloud ThingsBoard PE (Professional Edition) hoặc self-host cluster. Đòi hỏi thêm cơ chế phân quyền theo tenant, dashboard cấp portfolio.</w:t>
-      </w:r>
-    </w:p>
-    <w:p>
-      <w:pPr>
-        <w:pStyle w:val="Heading3"/>
-        <w:spacing w:line="276" w:lineRule="auto"/>
-        <w:rPr>
-          <w:rFonts w:ascii="Times New Roman" w:hAnsi="Times New Roman" w:cs="Times New Roman"/>
-        </w:rPr>
-      </w:pPr>
-      <w:bookmarkStart w:id="498" w:name="_Toc236264376"/>
-      <w:bookmarkStart w:id="499" w:name="_Toc236089498"/>
-      <w:bookmarkStart w:id="500" w:name="_Toc236340854"/>
-      <w:r>
-        <w:rPr>
-          <w:rFonts w:ascii="Times New Roman" w:eastAsia="Times New Roman" w:hAnsi="Times New Roman" w:cs="Times New Roman"/>
-        </w:rPr>
-        <w:t>6.3.4 Chống nhiễu 2.4 GHz</w:t>
-      </w:r>
-      <w:bookmarkEnd w:id="498"/>
-      <w:bookmarkEnd w:id="499"/>
-      <w:bookmarkEnd w:id="500"/>
-    </w:p>
-    <w:p>
-      <w:pPr>
-        <w:ind w:firstLine="567"/>
-      </w:pPr>
-      <w:r>
         <w:t>Cần đánh giá khả năng cùng tồn tại với Wi-Fi bằng phép đo có kiểm soát lưu lượng 2,4 GHz và khảo sát Bluetooth LE Coded PHY nếu phần cứng hai phía hỗ trợ. Mỗi thay đổi phải được đo lại về tỷ lệ nhận gói, độ trễ và độ chính xác thay vì chỉ suy luận từ công suất phát.</w:t>
-      </w:r>
-    </w:p>
-    <w:p>
-      <w:pPr>
-        <w:pStyle w:val="Heading3"/>
-        <w:spacing w:line="276" w:lineRule="auto"/>
-        <w:rPr>
-          <w:rFonts w:ascii="Times New Roman" w:hAnsi="Times New Roman" w:cs="Times New Roman"/>
-        </w:rPr>
-      </w:pPr>
-      <w:bookmarkStart w:id="501" w:name="_Toc236264377"/>
-      <w:bookmarkStart w:id="502" w:name="_Toc236089499"/>
-      <w:bookmarkStart w:id="503" w:name="_Toc236340855"/>
-      <w:r>
-        <w:rPr>
-          <w:rFonts w:ascii="Times New Roman" w:eastAsia="Times New Roman" w:hAnsi="Times New Roman" w:cs="Times New Roman"/>
-        </w:rPr>
-        <w:t>6.3.5 Tích hợp thêm cảm biến trên Tag</w:t>
-      </w:r>
-      <w:bookmarkEnd w:id="501"/>
-      <w:bookmarkEnd w:id="502"/>
-      <w:bookmarkEnd w:id="503"/>
-    </w:p>
-    <w:p>
-      <w:pPr>
-        <w:ind w:firstLine="567"/>
-      </w:pPr>
-      <w:r>
-        <w:t>Tag hiện chỉ phát beacon. Nếu thêm gia tốc kế MPU6050, tag có thể phát hiện té ngã (đột biến gia tốc), phát hiện tag không di chuyển (tag bị quên), hoặc dead-reckoning ngắn hạn khi mất BLE. Dữ liệu này gửi kèm trong payload ADV mở rộng (Bluetooth 5) hoặc qua GATT connection khi cần.</w:t>
-      </w:r>
-    </w:p>
-    <w:p>
-      <w:r>
-        <w:br w:type="page"/>
       </w:r>
     </w:p>
     <w:p>
@@ -24343,192 +24028,6 @@
           </w:p>
         </w:tc>
       </w:tr>
-      <w:tr>
-        <w:trPr>
-          <w:cantSplit/>
-          <w:jc w:val="center"/>
-        </w:trPr>
-        <w:tc>
-          <w:tcPr>
-            <w:tcW w:w="3402" w:type="dxa"/>
-            <w:vAlign w:val="center"/>
-          </w:tcPr>
-          <w:p>
-            <w:pPr>
-              <w:spacing w:line="240" w:lineRule="auto"/>
-              <w:ind w:firstLine="0"/>
-              <w:jc w:val="center"/>
-            </w:pPr>
-            <w:r>
-              <w:t>OTA_TRIGGER</w:t>
-            </w:r>
-            <w:r>
-              <w:br/>
-              <w:t>C6 E5 02</w:t>
-            </w:r>
-          </w:p>
-        </w:tc>
-        <w:tc>
-          <w:tcPr>
-            <w:tcW w:w="2324" w:type="dxa"/>
-            <w:vAlign w:val="center"/>
-          </w:tcPr>
-          <w:p>
-            <w:pPr>
-              <w:spacing w:line="240" w:lineRule="auto"/>
-              <w:ind w:firstLine="0"/>
-              <w:jc w:val="center"/>
-            </w:pPr>
-            <w:r>
-              <w:t>Gateway→Node</w:t>
-            </w:r>
-            <w:r>
-              <w:br/>
-              <w:t>1 byte</w:t>
-            </w:r>
-          </w:p>
-        </w:tc>
-        <w:tc>
-          <w:tcPr>
-            <w:tcW w:w="3628" w:type="dxa"/>
-            <w:vAlign w:val="center"/>
-          </w:tcPr>
-          <w:p>
-            <w:pPr>
-              <w:spacing w:line="240" w:lineRule="auto"/>
-              <w:ind w:firstLine="0"/>
-              <w:jc w:val="center"/>
-            </w:pPr>
-            <w:r>
-              <w:t>Kích hoạt quy trình Wi-Fi/HTTPS OTA cho Scanner hoặc Relay.</w:t>
-            </w:r>
-          </w:p>
-        </w:tc>
-      </w:tr>
-      <w:tr>
-        <w:trPr>
-          <w:cantSplit/>
-          <w:jc w:val="center"/>
-        </w:trPr>
-        <w:tc>
-          <w:tcPr>
-            <w:tcW w:w="3402" w:type="dxa"/>
-            <w:vAlign w:val="center"/>
-          </w:tcPr>
-          <w:p>
-            <w:pPr>
-              <w:spacing w:line="240" w:lineRule="auto"/>
-              <w:ind w:firstLine="0"/>
-              <w:jc w:val="center"/>
-            </w:pPr>
-            <w:r>
-              <w:t>OTA_RESULT</w:t>
-            </w:r>
-            <w:r>
-              <w:br/>
-              <w:t>C7 E5 02</w:t>
-            </w:r>
-          </w:p>
-        </w:tc>
-        <w:tc>
-          <w:tcPr>
-            <w:tcW w:w="2324" w:type="dxa"/>
-            <w:vAlign w:val="center"/>
-          </w:tcPr>
-          <w:p>
-            <w:pPr>
-              <w:spacing w:line="240" w:lineRule="auto"/>
-              <w:ind w:firstLine="0"/>
-              <w:jc w:val="center"/>
-            </w:pPr>
-            <w:r>
-              <w:t>Node→Gateway</w:t>
-            </w:r>
-            <w:r>
-              <w:br/>
-              <w:t>1 byte</w:t>
-            </w:r>
-          </w:p>
-        </w:tc>
-        <w:tc>
-          <w:tcPr>
-            <w:tcW w:w="3628" w:type="dxa"/>
-            <w:vAlign w:val="center"/>
-          </w:tcPr>
-          <w:p>
-            <w:pPr>
-              <w:spacing w:line="240" w:lineRule="auto"/>
-              <w:ind w:firstLine="0"/>
-              <w:jc w:val="center"/>
-            </w:pPr>
-            <w:r>
-              <w:t>Trả trạng thái OTA; 0 là thành công, giá trị khác 0 là lỗi.</w:t>
-            </w:r>
-          </w:p>
-        </w:tc>
-      </w:tr>
-      <w:tr>
-        <w:trPr>
-          <w:cantSplit/>
-          <w:jc w:val="center"/>
-        </w:trPr>
-        <w:tc>
-          <w:tcPr>
-            <w:tcW w:w="3402" w:type="dxa"/>
-            <w:vAlign w:val="center"/>
-          </w:tcPr>
-          <w:p>
-            <w:pPr>
-              <w:spacing w:line="240" w:lineRule="auto"/>
-              <w:ind w:firstLine="0"/>
-              <w:jc w:val="center"/>
-            </w:pPr>
-            <w:r>
-              <w:t>OTA_KEY_PUSH</w:t>
-            </w:r>
-            <w:r>
-              <w:br/>
-              <w:t>C8 E5 02</w:t>
-            </w:r>
-          </w:p>
-        </w:tc>
-        <w:tc>
-          <w:tcPr>
-            <w:tcW w:w="2324" w:type="dxa"/>
-            <w:vAlign w:val="center"/>
-          </w:tcPr>
-          <w:p>
-            <w:pPr>
-              <w:spacing w:line="240" w:lineRule="auto"/>
-              <w:ind w:firstLine="0"/>
-              <w:jc w:val="center"/>
-            </w:pPr>
-            <w:r>
-              <w:t>Gateway→Scanner</w:t>
-            </w:r>
-            <w:r>
-              <w:br/>
-              <w:t>16 byte</w:t>
-            </w:r>
-          </w:p>
-        </w:tc>
-        <w:tc>
-          <w:tcPr>
-            <w:tcW w:w="3628" w:type="dxa"/>
-            <w:vAlign w:val="center"/>
-          </w:tcPr>
-          <w:p>
-            <w:pPr>
-              <w:spacing w:line="240" w:lineRule="auto"/>
-              <w:ind w:firstLine="0"/>
-              <w:jc w:val="center"/>
-            </w:pPr>
-            <w:r>
-              <w:t>Đẩy khóa HMAC 16 byte cho OTA-beacon qua kênh Mesh đã bảo vệ bằng AppKey.</w:t>
-            </w:r>
-          </w:p>
-        </w:tc>
-      </w:tr>
     </w:tbl>
     <w:p>
       <w:pPr>
@@ -25158,69 +24657,6 @@
                 <w:szCs w:val="26"/>
               </w:rPr>
               <w:t>UUID 128 bit do đề tài tự định nghĩa để nhận dạng Tag; không phải Assigned Number của SIG.</w:t>
-            </w:r>
-          </w:p>
-        </w:tc>
-      </w:tr>
-      <w:tr>
-        <w:trPr>
-          <w:cantSplit/>
-          <w:jc w:val="center"/>
-        </w:trPr>
-        <w:tc>
-          <w:tcPr>
-            <w:tcW w:w="2268" w:type="dxa"/>
-            <w:vAlign w:val="center"/>
-          </w:tcPr>
-          <w:p>
-            <w:pPr>
-              <w:spacing w:line="240" w:lineRule="auto"/>
-              <w:ind w:firstLine="0"/>
-              <w:jc w:val="center"/>
-            </w:pPr>
-            <w:r>
-              <w:rPr>
-                <w:szCs w:val="26"/>
-              </w:rPr>
-              <w:t>OTA command</w:t>
-            </w:r>
-          </w:p>
-        </w:tc>
-        <w:tc>
-          <w:tcPr>
-            <w:tcW w:w="1701" w:type="dxa"/>
-            <w:vAlign w:val="center"/>
-          </w:tcPr>
-          <w:p>
-            <w:pPr>
-              <w:spacing w:line="240" w:lineRule="auto"/>
-              <w:ind w:firstLine="0"/>
-              <w:jc w:val="center"/>
-            </w:pPr>
-            <w:r>
-              <w:rPr>
-                <w:szCs w:val="26"/>
-              </w:rPr>
-              <w:t>0xFA</w:t>
-            </w:r>
-          </w:p>
-        </w:tc>
-        <w:tc>
-          <w:tcPr>
-            <w:tcW w:w="5386" w:type="dxa"/>
-            <w:vAlign w:val="center"/>
-          </w:tcPr>
-          <w:p>
-            <w:pPr>
-              <w:spacing w:line="240" w:lineRule="auto"/>
-              <w:ind w:firstLine="0"/>
-              <w:jc w:val="center"/>
-            </w:pPr>
-            <w:r>
-              <w:rPr>
-                <w:szCs w:val="26"/>
-              </w:rPr>
-              <w:t>Mã lệnh nội bộ trong Manufacturer Specific Data để kích hoạt OTA-beacon.</w:t>
             </w:r>
           </w:p>
         </w:tc>

</xml_diff>

<commit_message>
[DOCS] align Part B report with current implementation
</commit_message>
<xml_diff>
--- a/22207073-phan-B.docx
+++ b/22207073-phan-B.docx
@@ -7323,7 +7323,7 @@
         <w:pStyle w:val="ListBullet"/>
       </w:pPr>
       <w:r>
-        <w:t>Số thiết bị: 1–N tag, 3 scanner cố định (mỗi phòng bố trí 1 scanner), 1 relay, 1 gateway. Mesh cho phép mở rộng nhưng đề tài không đo scale trên 10 tag hay trên 3 scanner.</w:t>
+        <w:t>Số thiết bị thực nghiệm: 1 Tag, 3 Scanner cố định (mỗi phòng 1 Scanner), 1 Relay và 1 Gateway. Firmware Gateway dành 16 slot theo dõi Tag, 8 slot RSSI Scanner trên mỗi Tag và node table tối đa 10 node; các giới hạn này là capacity tĩnh của source, không phải quy mô đã được kiểm chứng thực nghiệm.</w:t>
       </w:r>
     </w:p>
     <w:p>
@@ -9861,7 +9861,7 @@
         <w:ind w:firstLine="567"/>
       </w:pPr>
       <w:r>
-        <w:t>Đề tài dùng QoS 0 cho telemetry RSSI liên tục để giảm độ trễ. Các sự kiện quản lý quan trọng có thể dùng QoS 1 khi cần broker xác nhận bằng PUBACK.</w:t>
+        <w:t>Source dùng QoS 0 cho telemetry RSSI liên tục. Các bản tin connect/disconnect child device, attributes, trạng thái node, trạng thái out_of_range và thông tin online của Gateway dùng QoS 1 để nhận PUBACK; QoS 2 không được sử dụng.</w:t>
       </w:r>
     </w:p>
     <w:p>
@@ -10305,7 +10305,7 @@
         <w:ind w:firstLine="567"/>
       </w:pPr>
       <w:r>
-        <w:t>Mỗi sub-device có Device Profile riêng, áp Rule Chain khác nhau. Đề tài dùng hai profile: ble_tag cho Tag, ble_mesh_node cho Scanner/Relay/Gateway.</w:t>
+        <w:t>Các child device dùng Device Profile theo vai trò: ble_tag cho Tag và ble_mesh_node cho Scanner/Relay. Gateway là device cha được xác thực bằng access token, không được tạo lại như một child device thuộc profile ble_mesh_node.</w:t>
       </w:r>
     </w:p>
     <w:p>
@@ -10729,7 +10729,7 @@
         <w:ind w:firstLine="567"/>
       </w:pPr>
       <w:r>
-        <w:t>"bmt_tag_0x0001": [ "ts": 1732345678000, "values": "scanner_id": "12a60986e694", "rssi": -47, “battery” :82 ]</w:t>
+        <w:t>{"bmt_tag_0x0001":[{"ts":1732345678000,"values":{"scanner_id":"125ba3077000","rssi":-47,"battery":82}}]}</w:t>
       </w:r>
     </w:p>
     <w:p>
@@ -10814,7 +10814,7 @@
         <w:ind w:firstLine="567"/>
       </w:pPr>
       <w:r>
-        <w:t>Đề tài dùng rule chain ble_tag_zone_detection cho profile ble_tag, thực hiện toàn bộ logic map scanneròng, hysteresis và debounce đã nêu ở mục phần tương ứng. Implementation chi tiết (số node, luồng rẽ nhánh) ở Chương 4.</w:t>
+        <w:t>Đề tài dùng Rule Chain ble_tag_zone_detection cho profile ble_tag, thực hiện ánh xạ Scanner–phòng, kiểm tra độ tươi, hysteresis và debounce. Chi tiết bảy node và hai nhánh ghi attributes/timeseries được trình bày ở Chương 4.</w:t>
       </w:r>
     </w:p>
     <w:p>
@@ -11226,7 +11226,7 @@
         <w:ind w:firstLine="567"/>
       </w:pPr>
       <w:r>
-        <w:t>Gateway theo dõi Scanner và Relay trong suốt thời gian chạy bằng cơ chế chủ động thăm dò, không yêu cầu node tự phát heartbeat. Sau thời gian ổn định ban đầu, Gateway dùng Config Client gửi DEFAULT_TTL_GET tới từng node theo chu kỳ 20 giây. Phản hồi hợp lệ cập nhật last_seen và trạng thái online; TAG_STATUS nhận từ Scanner cũng được tính là hoạt động mesh. Node được đánh dấu offline nếu quá 60 giây không nhận được phản hồi hoặc dữ liệu hợp lệ. Data watchdog giám sát traffic ở lớp BLE Mesh và chỉ kích hoạt reset/re-provision khi toàn tuyến im lặng trong ngưỡng cấu hình, tránh nhầm một Tag tạm thời ngoài vùng phủ với lỗi toàn mạng.</w:t>
+        <w:t>Gateway theo dõi Scanner và Relay trong suốt thời gian chạy bằng cơ chế chủ động thăm dò, không yêu cầu node tự phát heartbeat. Sau thời gian ổn định ban đầu, Gateway dùng Config Client gửi DEFAULT_TTL_GET tới từng node theo chu kỳ 20 giây. Phản hồi hợp lệ cập nhật last_seen và trạng thái online; TAG_STATUS nhận từ Scanner cũng được tính là hoạt động mesh. Node được đánh dấu offline nếu quá 60 giây không nhận được phản hồi hoặc dữ liệu hợp lệ. Data watchdog chờ ổn định 15 giây rồi giám sát bộ đếm traffic theo từng cửa sổ 300 giây. Nếu toàn tuyến im lặng, Gateway phát RESET_CMD tối đa 5 lần, cách nhau 1,5 giây; sau khi có ít nhất một lần gửi thành công, nó chờ node 12 giây, xoá state mesh/node/Tag và reboot để auto-provision lại.</w:t>
       </w:r>
     </w:p>
     <w:p>
@@ -11246,7 +11246,7 @@
         <w:ind w:firstLine="567"/>
       </w:pPr>
       <w:r>
-        <w:t>Gateway hoạt động ở chế độ Wi-Fi STA và chỉ khởi tạo MQTT sau khi nhận địa chỉ IP. Broker dùng URI mqtts:// với cổng 8883; client xác minh chứng chỉ máy chủ bằng CA nhúng và common name cấu hình. Access token được dùng làm username để ThingsBoard xác thực đúng Gateway. Khi mất kết nối, Wi-Fi và MQTT tự kết nối lại ở nền; dữ liệu RSSI liên tục dùng QoS 0 để giảm độ trễ.</w:t>
+        <w:t>Gateway hoạt động ở chế độ Wi-Fi STA. bmt_wifi_init chờ tối đa 15 giây để nhận địa chỉ IP; sau đó app_main vẫn khởi tạo MQTT dù Wi-Fi đã sẵn sàng hay vừa timeout. MQTT dùng URI mqtts:// trên cổng 8883, CA nhúng, common name bmt-tb.local và access token làm username. Network timeout được đặt 500 ms, còn reconnect timeout là 5 giây; Wi-Fi tiếp tục reconnect ở nền nếu kết nối đến muộn hoặc bị gián đoạn.</w:t>
       </w:r>
     </w:p>
     <w:p>
@@ -11280,7 +11280,7 @@
     <w:p>
       <w:pPr/>
       <w:r>
-        <w:t>Nếu publish out_of_range không thực hiện được vì MQTT đang ngắt, Gateway đặt cờ out_of_range_pending cho đúng Tag. Khi nhận MQTT_EVENT_CONNECTED, Gateway khai báo lại các node/Tag đã biết với ThingsBoard rồi phát lại những trạng thái pending. Một TAG_STATUS mới đến trước lúc reconnect sẽ xoá pending vì dữ liệu mới đã thay thế trạng thái mất vùng phủ cũ. Hàng đợi RSSI có 64 phần tử và không phải bộ đệm bền vững; report thường có thể bị bỏ khi quá tải hoặc mất mạng kéo dài. Gateway quản lý tối đa 16 Tag đồng thời.</w:t>
+        <w:t>Nếu publish out_of_range không thực hiện được vì MQTT đang ngắt, Gateway đặt cờ out_of_range_pending cho đúng Tag. Khi nhận MQTT_EVENT_CONNECTED, Gateway khai báo lại các node/Tag đã biết rồi phát lại trạng thái pending; TAG_STATUS mới đến trước reconnect sẽ xoá pending cũ. Hàng đợi RSSI có 64 phần tử, xQueueSend dùng thời gian chờ bằng 0 và không phải bộ đệm bền vững. Khi hàng đợi đầy, report mới bị bỏ; khi MQTT đang ngắt, worker vẫn lấy report khỏi queue nhưng bmt_thingsboard không publish, vì vậy report đó cũng không được giữ để gửi lại. Chỉ out_of_range có cơ chế pending/replay riêng.</w:t>
       </w:r>
     </w:p>
     <w:p>
@@ -11320,7 +11320,7 @@
         <w:ind w:firstLine="567"/>
       </w:pPr>
       <w:r>
-        <w:t>Đây là bộ não phía server, gồm 7 node (không phải một chuỗi tuyến tính đơn giản – rẽ nhánh sau bước hysteresis):</w:t>
+        <w:t>Đây là bộ não phía server, gồm đúng 7 node. Sau Apply hysteresis, luồng rẽ thành hai nhánh độc lập để ghi attributes và timeseries:</w:t>
       </w:r>
     </w:p>
     <w:p>
@@ -11372,7 +11372,7 @@
         </w:numPr>
       </w:pPr>
       <w:r>
-        <w:t>Rẽ hai nhánh song song sau bước 3:</w:t>
+        <w:t>Build attrs payload: tạo SERVER_SCOPE payload gồm role, current_zone, current_zone_label, current_rssi, current_scanner, last_seen, candidate_zone, candidate_count, battery và snapshot RSSI/timestamp của ba Scanner.</w:t>
       </w:r>
     </w:p>
     <w:p>
@@ -11384,7 +11384,7 @@
         </w:numPr>
       </w:pPr>
       <w:r>
-        <w:t>Build attrs payload Save tag state: ghi current_zone, current_zone_label (tên phòng đã format sẵn để hiển thị), current_rssi, current_scanner vào SERVER_SCOPE attribute (chỉ giữ giá trị mới nhất).</w:t>
+        <w:t>Save tag state: ghi payload trên thành SERVER_SCOPE attributes của đúng child device Tag; attributes chỉ giữ trạng thái mới nhất.</w:t>
       </w:r>
     </w:p>
     <w:p>
@@ -11396,7 +11396,15 @@
         </w:numPr>
       </w:pPr>
       <w:r>
-        <w:t>Build TS payload Save zone history: ghi current_zone_num và RSSI từng scanner thành timeseries (có lịch sử theo thời gian) – cần thiết để phân tích lại latency chuyển phòng sau này, khác với attribute chỉ có giá trị hiện tại.</w:t>
+        <w:t>Build TS payload: tạo timeseries payload gồm current_zone_num, current_rssi, RSSI/timestamp/độ tuổi của ba Scanner, candidate_zone_num, candidate_count, incoming_scanner_num và incoming_rssi.</w:t>
+      </w:r>
+    </w:p>
+    <w:p>
+      <w:pPr>
+        <w:pStyle w:val="ListNumber"/>
+      </w:pPr>
+      <w:r>
+        <w:t>Save zone history: ghi payload timeseries để lưu lịch sử theo thời gian, phục vụ dashboard và phân tích độ trễ.</w:t>
       </w:r>
     </w:p>
     <w:p>
@@ -11641,7 +11649,7 @@
     <w:p>
       <w:pPr/>
       <w:r>
-        <w:t>Mỗi Tag được ThingsBoard tạo thành một child device riêng qua Gateway API, với tag_id làm định danh ổn định. Với report thông thường, Rule Chain ghi SERVER_SCOPE attributes như current_zone, current_zone_label, current_rssi và current_scanner, đồng thời ghi current_zone_num cùng RSSI từng Scanner vào timeseries. Riêng timeout out_of_range do Gateway phát hiện được publish trực tiếp lên attributes với current_zone = out_of_range và current_zone_num = 0; nó không đi qua nhánh timeseries của Rule Chain. Việc tách entity theo Tag bảo đảm state của các Tag không ghi đè lẫn nhau.</w:t>
+        <w:t>Mỗi Tag là một child device tên bmt_tag_0x%04x, profile ble_tag và role tag; Scanner/Relay dùng tên bmt_node_&lt;12 ký tự MAC&gt;, profile ble_mesh_node cùng role scan hoặc relay. Với report thông thường, Rule Chain ghi SERVER_SCOPE attributes và timeseries theo đúng child device. Timeout out_of_range được Gateway publish trực tiếp lên attributes với current_zone = out_of_range và current_zone_num = 0, không đi qua nhánh timeseries. Việc tách entity bảo đảm state của các Tag không ghi đè lẫn nhau.</w:t>
       </w:r>
     </w:p>
     <w:p>
@@ -11845,7 +11853,7 @@
         <w:ind w:firstLine="567"/>
       </w:pPr>
       <w:r>
-        <w:t>Phần B tập trung tại apps/gateway. Component bmt_mesh nhận message BLE Mesh và quản lý node; bmt_wifi thiết lập Wi-Fi STA; bmt_mqtt triển khai hàng đợi, worker và MQTTS; bmt_thingsboard đóng gói ThingsBoard Gateway API và trạng thái từng Tag. Firmware Tag/Scanner là đầu vào của giao diện tích hợp và không được tính là phần triển khai cá nhân B.</w:t>
+        <w:t>Phần B tập trung tại apps/gateway. bmt_mesh nhận BLE Mesh message, provision và ping node; bmt_wifi quản lý Wi-Fi STA; bmt_mqtt triển khai queue, worker và MQTTS; bmt_thingsboard đóng gói Gateway API, child device và out_of_range; bmt_zone giữ bảng tối đa 16 Tag; bmt_watchdog giám sát traffic mesh; bmt_node_table persist tối đa 10 node trong NVS. Firmware Tag/Scanner chỉ là đầu vào của giao diện tích hợp.</w:t>
       </w:r>
     </w:p>
     <w:p>

</xml_diff>

<commit_message>
[DOCS] prune and renumber report references
</commit_message>
<xml_diff>
--- a/22207073-phan-B.docx
+++ b/22207073-phan-B.docx
@@ -7126,7 +7126,7 @@
         <w:ind w:firstLine="567"/>
       </w:pPr>
       <w:r>
-        <w:t>Bệnh viện muốn biết bệnh nhân đang ở phòng nào. Kho muốn theo dõi xe nâng, dụng cụ. Nhà dưỡng lão muốn phát hiện người cao tuổi té ngã hay đi lạc. Ba ví dụ trên đều cần định vị trong nhà; các hệ thống BLE đã được nghiên cứu cho cả theo dõi chăm sóc người cao tuổi và y tế [7], [8].</w:t>
+        <w:t>Bệnh viện muốn biết bệnh nhân đang ở phòng nào. Kho muốn theo dõi xe nâng, dụng cụ. Nhà dưỡng lão muốn phát hiện người cao tuổi té ngã hay đi lạc. Ba ví dụ trên đều cần định vị trong nhà; các hệ thống BLE đã được nghiên cứu cho cả theo dõi chăm sóc người cao tuổi và y tế [6], [7].</w:t>
       </w:r>
     </w:p>
     <w:p>
@@ -7169,7 +7169,7 @@
         <w:pStyle w:val="ListBullet"/>
       </w:pPr>
       <w:r>
-        <w:t>BLE (Bluetooth Low Energy) beacon: thẻ nhỏ phát quảng bá, đầu đọc lấy cường độ tín hiệu (RSSI) để suy ra khoảng cách hoặc vùng. Thẻ có chi phí thấp và pin có thể dùng từ vài tháng đến vài năm [4], [6].</w:t>
+        <w:t>BLE (Bluetooth Low Energy) beacon: thẻ nhỏ phát quảng bá, đầu đọc lấy cường độ tín hiệu (RSSI) để suy ra khoảng cách hoặc vùng. Thẻ có chi phí thấp và pin có thể dùng từ vài tháng đến vài năm [4], [5].</w:t>
       </w:r>
     </w:p>
     <w:p>
@@ -8395,7 +8395,7 @@
         <w:ind w:firstLine="567"/>
       </w:pPr>
       <w:r>
-        <w:t>Ưu điểm của BLE beacon là chi phí thấp và tiêu thụ năng lượng nhỏ. Nhược điểm là RSSI biến động do đa đường truyền, che khuất và hướng anten, do đó thường cần bộ lọc và hiệu chỉnh theo môi trường; một scanner đơn cũng khó phủ nhiều phòng cách nhau bởi tường [4], [20].</w:t>
+        <w:t>Ưu điểm của BLE beacon là chi phí thấp và tiêu thụ năng lượng nhỏ. Nhược điểm là RSSI biến động do đa đường truyền, che khuất và hướng anten, do đó thường cần bộ lọc và hiệu chỉnh theo môi trường; một scanner đơn cũng khó phủ nhiều phòng cách nhau bởi tường [4], [10].</w:t>
       </w:r>
     </w:p>
     <w:p>
@@ -9165,7 +9165,7 @@
         <w:ind w:firstLine="567"/>
       </w:pPr>
       <w:r>
-        <w:t>BLE Mesh (chuẩn Bluetooth SIG 2017, bản 1.0.1 năm 2019) cho phép thiết bị BLE tạo mạng lưới, trong đó thông điệp có thể đi qua nhiều hop tới đích. Cơ chế này chỉ áp dụng cho tầng Scanner/Relay/Gateway; Tag không tham gia mesh, không bật chế độ thu và chỉ phát ADV một chiều để tối ưu năng lượng.</w:t>
+        <w:t>BLE Mesh (chuẩn Bluetooth SIG 2017, bản 1.0.1 năm 2019) cho phép thiết bị BLE tạo mạng lưới, trong đó thông điệp có thể đi qua nhiều hop tới đích. Cơ chế này chỉ áp dụng cho tầng Scanner/Relay/Gateway; Tag không tham gia mesh, không bật chế độ thu và chỉ phát ADV một chiều để tối ưu năng lượng. [12]</w:t>
       </w:r>
     </w:p>
     <w:p>
@@ -9877,7 +9877,7 @@
         <w:ind w:firstLine="567"/>
       </w:pPr>
       <w:r>
-        <w:t>MQTT phù hợp với telemetry liên tục vì giữ kết nối TCP/TLS bền và có overhead nhỏ hơn HTTP polling lặp lại. Tuy nhiên TLS làm tăng chi phí handshake và tài nguyên, nên cần đánh giá đồng thời bảo mật và hiệu năng trên thiết bị IoT [18], [19].</w:t>
+        <w:t>MQTT phù hợp với telemetry liên tục vì giữ kết nối TCP/TLS bền và có overhead nhỏ hơn HTTP polling lặp lại. Tuy nhiên TLS làm tăng chi phí handshake và tài nguyên, nên cần đánh giá đồng thời bảo mật và hiệu năng trên thiết bị IoT [8], [9].</w:t>
       </w:r>
     </w:p>
     <w:p>
@@ -12582,19 +12582,7 @@
         <w:ind w:firstLine="567"/>
       </w:pPr>
       <w:r>
-        <w:t xml:space="preserve">Trong phép đo, Scanner 01 đặt trên tủ lạnh ở độ cao khoảng 2,0 m; Scanner 02 đặt gần máy tính ở độ cao khoảng 1,75 m; Scanner 03 đặt trên nóc tủ ở độ cao khoảng </w:t>
-      </w:r>
-      <w:r>
-        <w:t>1</w:t>
-      </w:r>
-      <w:r>
-        <w:t>,</w:t>
-      </w:r>
-      <w:r>
-        <w:t>5</w:t>
-      </w:r>
-      <w:r>
-        <w:t xml:space="preserve"> m. Gateway đặt gần router Wi-Fi và Relay đặt tại hành lang. Tọa độ, độ cao, hướng anten, vật cản và bề mặt kim loại được xem là biến thiết kế vì chúng ảnh hưởng rõ rệt đến RSSI trong nhà [4], [6], [20]. Sự không đồng nhất về độ cao là một giới hạn của phép đo hiện tại.</w:t>
+        <w:t>Trong phép đo, Scanner 01 đặt trên tủ lạnh ở độ cao khoảng 2,0 m; Scanner 02 đặt gần máy tính ở độ cao khoảng 1,75 m; Scanner 03 đặt trên nóc tủ ở độ cao khoảng 1,5 m. Gateway đặt gần router Wi-Fi và Relay đặt tại hành lang. Tọa độ, độ cao, hướng anten, vật cản và bề mặt kim loại được xem là biến thiết kế vì chúng ảnh hưởng rõ rệt đến RSSI trong nhà [4], [5], [10]. Sự không đồng nhất về độ cao là một giới hạn của phép đo hiện tại.</w:t>
       </w:r>
     </w:p>
     <w:p>
@@ -22357,7 +22345,7 @@
         <w:pStyle w:val="ListBullet"/>
       </w:pPr>
       <w:r>
-        <w:t>RSSI vẫn nhạy với người di chuyển, cửa đóng/mở và bố trí phần cứng. Qua ba phiên, độ chính xác gộp đạt 91,27% và macro-F1 đạt 91,33%, nhưng 88,30% số lỗi tập trung ở cặp Phòng 2–Phòng 3 [4], [20].</w:t>
+        <w:t>RSSI vẫn nhạy với người di chuyển, cửa đóng/mở và bố trí phần cứng. Qua ba phiên, độ chính xác gộp đạt 91,27% và macro-F1 đạt 91,33%, nhưng 88,30% số lỗi tập trung ở cặp Phòng 2–Phòng 3 [4], [10].</w:t>
       </w:r>
     </w:p>
     <w:p>
@@ -23598,7 +23586,7 @@
         <w:ind w:left="510" w:hanging="510"/>
       </w:pPr>
       <w:r>
-        <w:t>[5] Bembenik, R., &amp; Falcman, K. (2020). BLE indoor positioning system using RSSI-based trilateration. Journal of Wireless Mobile Networks, Ubiquitous Computing, and Dependable Applications, 11(3), 50–69.</w:t>
+        <w:t>[5] Zhuang, Y., Yang, J., Li, Y., Qi, L., &amp; El-Sheimy, N. (2016). Smartphone-based indoor localization with Bluetooth Low Energy beacons. Sensors, 16(5), 596.</w:t>
       </w:r>
     </w:p>
     <w:p>
@@ -23606,7 +23594,7 @@
         <w:ind w:left="510" w:hanging="510"/>
       </w:pPr>
       <w:r>
-        <w:t>[6] Zhuang, Y., Yang, J., Li, Y., Qi, L., &amp; El-Sheimy, N. (2016). Smartphone-based indoor localization with Bluetooth Low Energy beacons. Sensors, 16(5), 596.</w:t>
+        <w:t>[6] Wang, H., Ganesh, G., Zon, M., Ghosh, O., Siu, H., &amp; Fang, Q. (2025). A BLE-based turnkey indoor positioning system for mobility assessment in aging-in-place settings. PLOS Digital Health, 4(4), e0000774.</w:t>
       </w:r>
     </w:p>
     <w:p>
@@ -23614,7 +23602,7 @@
         <w:ind w:left="510" w:hanging="510"/>
       </w:pPr>
       <w:r>
-        <w:t>[7] Wang, H., Ganesh, G., Zon, M., Ghosh, O., Siu, H., &amp; Fang, Q. (2025). A BLE-based turnkey indoor positioning system for mobility assessment in aging-in-place settings. PLOS Digital Health, 4(4), e0000774.</w:t>
+        <w:t>[7] Skýpalová, E., Boroš, M., Loveček, T., &amp; Veľas, A. (2025). Innovative indoor positioning: BLE beacons for healthcare tracking. Electronics, 14(10), 2018.</w:t>
       </w:r>
     </w:p>
     <w:p>
@@ -23622,7 +23610,7 @@
         <w:ind w:left="510" w:hanging="510"/>
       </w:pPr>
       <w:r>
-        <w:t>[8] Skýpalová, E., Boroš, M., Loveček, T., &amp; Veľas, A. (2025). Innovative indoor positioning: BLE beacons for healthcare tracking. Electronics, 14(10), 2018.</w:t>
+        <w:t>[8] Al-Muqarm, A. A., Alkhafajee, A., Alwan, A., &amp; Alardawy, Z. (2022). Security and performance analysis of MQTT with TLS in IoT networks. In International Conference on Engineering Technology and Their Applications (IICETA).</w:t>
       </w:r>
     </w:p>
     <w:p>
@@ -23630,7 +23618,7 @@
         <w:ind w:left="510" w:hanging="510"/>
       </w:pPr>
       <w:r>
-        <w:t>[9] Kalynchuk, T. N. (2026). Indoor positioning with Bluetooth Low Energy and Extended Kalman Filter. Electronics and Information Technologies, 33, 31–42.</w:t>
+        <w:t>[9] Paris, I. L. B. M., Habaebi, M. H., &amp; Zyoud, A. M. (2023). Implementation of SSL/TLS security with MQTT protocol in an IoT environment. Wireless Personal Communications, 132(1), 163–182.</w:t>
       </w:r>
     </w:p>
     <w:p>
@@ -23638,91 +23626,7 @@
         <w:ind w:left="510" w:hanging="510"/>
       </w:pPr>
       <w:r>
-        <w:t>[10] Wu, J., Nan, Y., Kumar, V., Tian, D. J., Bianchi, A., Payer, M., &amp; Xu, D. (2020). BLESA: Spoofing attacks against reconnections in Bluetooth Low Energy. In 14th USENIX Workshop on Offensive Technologies (WOOT 20).</w:t>
-      </w:r>
-    </w:p>
-    <w:p>
-      <w:pPr>
-        <w:ind w:left="510" w:hanging="510"/>
-      </w:pPr>
-      <w:r>
-        <w:t>[11] Ferrag, M. A., Maglaras, L. A., Janicke, H., &amp; Jiang, J. (2016). Authentication protocols for the Internet of Things: A comprehensive survey. arXiv:1612.07206.</w:t>
-      </w:r>
-    </w:p>
-    <w:p>
-      <w:pPr>
-        <w:ind w:left="510" w:hanging="510"/>
-      </w:pPr>
-      <w:r>
-        <w:t xml:space="preserve">[12] Mesa-Simon, M., Escobar-Molero, A., Parrilla, L., Morales, D. P., Álvarez-Bermejo, J. A., &amp; Romero, F. J. (2025). Integration of hardware security modules into BLE </w:t>
-      </w:r>
-      <w:r>
-        <w:lastRenderedPageBreak/>
-        <w:t>beacons: Fundamentals and use in a secure and private geofencing application. Internet of Things, 101762.</w:t>
-      </w:r>
-    </w:p>
-    <w:p>
-      <w:pPr>
-        <w:ind w:left="510" w:hanging="510"/>
-      </w:pPr>
-      <w:r>
-        <w:t>[13] M'Raihi, D., Machani, S., Pei, M., &amp; Rydell, J. (2011). TOTP: Time-based one-time password algorithm (RFC 6238). Internet Engineering Task Force.</w:t>
-      </w:r>
-    </w:p>
-    <w:p>
-      <w:pPr>
-        <w:ind w:left="510" w:hanging="510"/>
-      </w:pPr>
-      <w:r>
-        <w:t>[14] Gupta, B. (2016). A replay-attack-resistant message authentication scheme using time-based keying hash functions and unique message identifiers. arXiv:1602.02148.</w:t>
-      </w:r>
-    </w:p>
-    <w:p>
-      <w:pPr>
-        <w:ind w:left="510" w:hanging="510"/>
-      </w:pPr>
-      <w:r>
-        <w:t>[15] Wang, R., &amp; Yan, Y. (2022). A survey of secure boot schemes for embedded devices. In 2022 24th International Conference on Advanced Communication Technology (ICACT) (pp. 224–227). IEEE.</w:t>
-      </w:r>
-    </w:p>
-    <w:p>
-      <w:pPr>
-        <w:ind w:left="510" w:hanging="510"/>
-      </w:pPr>
-      <w:r>
-        <w:t>[16] El Jaouhari, S., &amp; Bouvet, E. (2022). Secure firmware over-the-air updates for IoT: Survey, challenges, and discussions. Internet of Things, 18, 100508.</w:t>
-      </w:r>
-    </w:p>
-    <w:p>
-      <w:pPr>
-        <w:ind w:left="510" w:hanging="510"/>
-      </w:pPr>
-      <w:r>
-        <w:t>[17] Haq, S. U., Singh, Y., Sharma, A., Gupta, R., &amp; Gupta, D. (2023). A survey on IoT and embedded-device firmware security: Architecture, extraction techniques, and vulnerability analysis frameworks. Discover Internet of Things, 3(1), 17.</w:t>
-      </w:r>
-    </w:p>
-    <w:p>
-      <w:pPr>
-        <w:ind w:left="510" w:hanging="510"/>
-      </w:pPr>
-      <w:r>
-        <w:t>[18] Al-Muqarm, A. A., Alkhafajee, A., Alwan, A., &amp; Alardawy, Z. (2022). Security and performance analysis of MQTT with TLS in IoT networks. In International Conference on Engineering Technology and Their Applications (IICETA).</w:t>
-      </w:r>
-    </w:p>
-    <w:p>
-      <w:pPr>
-        <w:ind w:left="510" w:hanging="510"/>
-      </w:pPr>
-      <w:r>
-        <w:t>[19] Paris, I. L. B. M., Habaebi, M. H., &amp; Zyoud, A. M. (2023). Implementation of SSL/TLS security with MQTT protocol in an IoT environment. Wireless Personal Communications, 132(1), 163–182.</w:t>
-      </w:r>
-    </w:p>
-    <w:p>
-      <w:pPr>
-        <w:ind w:left="510" w:hanging="510"/>
-      </w:pPr>
-      <w:r>
-        <w:t>[20] Ramirez, R., Huang, C. Y., Liao, C. A., Lin, P. T., Lin, H. W., &amp; Liang, S. H. (2021). A practice of BLE RSSI measurement for indoor positioning. Sensors, 21(15), 5181.</w:t>
+        <w:t>[10] Ramirez, R., Huang, C. Y., Liao, C. A., Lin, P. T., Lin, H. W., &amp; Liang, S. H. (2021). A practice of BLE RSSI measurement for indoor positioning. Sensors, 21(15), 5181.</w:t>
       </w:r>
     </w:p>
     <w:p>
@@ -23734,10 +23638,7 @@
         </w:rPr>
       </w:pPr>
       <w:r>
-        <w:rPr>
-          <w:szCs w:val="26"/>
-        </w:rPr>
-        <w:t>[21] Bluetooth Special Interest Group. (2026). Assigned Numbers.</w:t>
+        <w:t>[11] Bluetooth Special Interest Group. (2026). Assigned Numbers.</w:t>
       </w:r>
     </w:p>
     <w:p>
@@ -23761,13 +23662,7 @@
         <w:ind w:firstLine="0"/>
       </w:pPr>
       <w:r>
-        <w:rPr>
-          <w:szCs w:val="26"/>
-        </w:rPr>
-        <w:t>[22] Bluetooth Special Interest Group. (2023). Mesh Protocol Specification (Version 1.1). https://www.bluetooth.com/specifications/specs/mesh-protocol/</w:t>
-      </w:r>
-      <w:r>
-        <w:br w:type="page"/>
+        <w:t>[12] Bluetooth Special Interest Group. (2023). Mesh Protocol Specification (Version 1.1). https://www.bluetooth.com/specifications/specs/mesh-protocol/</w:t>
       </w:r>
     </w:p>
     <w:p>
@@ -23793,10 +23688,7 @@
         <w:ind w:firstLine="567"/>
       </w:pPr>
       <w:r>
-        <w:rPr>
-          <w:szCs w:val="26"/>
-        </w:rPr>
-        <w:t>Các giá trị dưới đây được đối chiếu với mã nguồn Gateway, Scanner, Relay và Tag. Vendor opcode của đề tài là Access opcode ba octet; các AD Type và Company Identifier được đối chiếu theo Bluetooth SIG [21], [22].</w:t>
+        <w:t>Các giá trị dưới đây được đối chiếu với mã nguồn Gateway, Scanner, Relay và Tag. Vendor opcode của đề tài là Access opcode ba octet; các AD Type và Company Identifier được đối chiếu theo Bluetooth SIG [11], [12].</w:t>
       </w:r>
     </w:p>
     <w:p>
@@ -24528,16 +24420,8 @@
             <w:vAlign w:val="center"/>
           </w:tcPr>
           <w:p>
-            <w:pPr>
-              <w:spacing w:line="240" w:lineRule="auto"/>
-              <w:ind w:firstLine="0"/>
-              <w:jc w:val="center"/>
-            </w:pPr>
-            <w:r>
-              <w:rPr>
-                <w:szCs w:val="26"/>
-              </w:rPr>
-              <w:t>Bluetooth SIG cấp cho Espressif Systems (Shanghai) Co., Ltd.; đề tài dùng để tương thích với Scanner.</w:t>
+            <w:r>
+              <w:t>Bluetooth SIG cấp cho Espressif Systems (Shanghai) Co., Ltd.; đề tài dùng để tương thích với Scanner [11].</w:t>
             </w:r>
           </w:p>
         </w:tc>

</xml_diff>

<commit_message>
[DOCS] correct beacon test application name
</commit_message>
<xml_diff>
--- a/22207073-phan-B.docx
+++ b/22207073-phan-B.docx
@@ -22166,7 +22166,7 @@
         <w:ind w:firstLine="567"/>
       </w:pPr>
       <w:r>
-        <w:t>Ứng dụng nRF Connect trên Android phát một ADV có cùng CID 0x02E5, UUID, battery, Tag ID, tx_power và sequence như Tag thật nhưng dùng mac16 ngẫu nhiên. Scanner tính lại HMAC theo khóa epoch hiện hành; do mã không khớp, beacon bị loại với log hmac_reject. Cả 100/100 lần thử đều bị từ chối, tương ứng false-accept quan sát được bằng 0%.</w:t>
+        <w:t>Ứng dụng RNF Digital Innovation Beacon Toolkit trên iOS phát một ADV có cùng CID 0x02E5, UUID, battery, Tag ID, tx_power và sequence như Tag thật nhưng dùng mac16 ngẫu nhiên. Scanner tính lại HMAC theo khóa epoch hiện hành; do mã không khớp, beacon bị loại với log hmac_reject. Cả 100/100 lần thử đều bị từ chối, tương ứng false-accept quan sát được bằng 0%.</w:t>
       </w:r>
     </w:p>
     <w:p>
@@ -22195,11 +22195,7 @@
         <w:ind w:firstLine="567"/>
       </w:pPr>
       <w:r>
-        <w:t xml:space="preserve">Trong phép thử, một ADV hợp lệ được ghi bằng btmon, phát lại sau 15 phút bằng nRF Connect và không làm hệ thống chọn một trạng thái mới. Tuy nhiên, code hiện tại không loại mọi trường hợp replay theo sequence: bản tin trùng vẫn làm mới số đo, bản tin lùi gần bị loại, còn bước nhảy lớn làm khởi tạo lại trạng thái để dung sai với Tag khởi động </w:t>
-      </w:r>
-      <w:r>
-        <w:lastRenderedPageBreak/>
-        <w:t>lại. HMAC-16 xác thực nội dung nhưng không tự bảo đảm tính mới. Do đó kết quả này chỉ là quan sát của kịch bản thử nghiệm, chưa chứng minh khả năng chống replay toàn diện.</w:t>
+        <w:t>Trong phép thử, một ADV hợp lệ được ghi bằng btmon, phát lại sau 15 phút bằng RNF Digital Innovation Beacon Toolkit và không làm hệ thống chọn một trạng thái mới. Tuy nhiên, code hiện tại không loại mọi trường hợp replay theo sequence: bản tin trùng vẫn làm mới số đo, bản tin lùi gần bị loại, còn bước nhảy lớn làm khởi tạo lại trạng thái để dung sai với Tag khởi động lại. HMAC-16 xác thực nội dung nhưng không tự bảo đảm tính mới. Do đó kết quả này chỉ là quan sát của kịch bản thử nghiệm, chưa chứng minh khả năng chống replay toàn diện.</w:t>
       </w:r>
     </w:p>
     <w:p>

</xml_diff>

<commit_message>
[DOCS] update thesis title for ThingsBoard IoT integration
</commit_message>
<xml_diff>
--- a/22207073-phan-B.docx
+++ b/22207073-phan-B.docx
@@ -349,12 +349,7 @@
         </w:rPr>
       </w:pPr>
       <w:r>
-        <w:rPr>
-          <w:b/>
-          <w:color w:val="EE0000"/>
-          <w:sz w:val="36"/>
-        </w:rPr>
-        <w:t>HỆ THỐNG THU NHẬN DỮ LIỆU DỰA TRÊN BLE MESH VÀ ESP32</w:t>
+        <w:t>XÂY DỰNG HỆ THỐNG THU NHẬN VÀ XỬ LÝ DỮ LIỆU DỰA TRÊN BLE MESH TÍCH HỢP MÁY CHỦ IoT THINGSBOARD</w:t>
       </w:r>
     </w:p>
     <w:p>
@@ -826,28 +821,7 @@
         </w:rPr>
       </w:pPr>
       <w:r>
-        <w:rPr>
-          <w:b/>
-          <w:color w:val="993366"/>
-          <w:sz w:val="36"/>
-        </w:rPr>
-        <w:t>HỆ THỐNG THU NHẬN DỮ LIỆU DỰA TRÊN BLE MESH</w:t>
-      </w:r>
-      <w:r>
-        <w:rPr>
-          <w:b/>
-          <w:color w:val="993366"/>
-          <w:sz w:val="36"/>
-        </w:rPr>
-        <w:t xml:space="preserve"> VÀ </w:t>
-      </w:r>
-      <w:r>
-        <w:rPr>
-          <w:b/>
-          <w:color w:val="993366"/>
-          <w:sz w:val="36"/>
-        </w:rPr>
-        <w:t>RSSI</w:t>
+        <w:t>XÂY DỰNG HỆ THỐNG THU NHẬN VÀ XỬ LÝ DỮ LIỆU DỰA TRÊN BLE MESH TÍCH HỢP MÁY CHỦ IoT THINGSBOARD</w:t>
       </w:r>
     </w:p>
     <w:p>
@@ -860,31 +834,7 @@
         </w:rPr>
       </w:pPr>
       <w:r>
-        <w:rPr>
-          <w:b/>
-          <w:color w:val="000080"/>
-          <w:sz w:val="30"/>
-          <w:szCs w:val="30"/>
-        </w:rPr>
-        <w:t>BLE MESH</w:t>
-      </w:r>
-      <w:r>
-        <w:rPr>
-          <w:b/>
-          <w:color w:val="000080"/>
-          <w:sz w:val="30"/>
-          <w:szCs w:val="30"/>
-        </w:rPr>
-        <w:t xml:space="preserve"> AND RSSI </w:t>
-      </w:r>
-      <w:r>
-        <w:rPr>
-          <w:b/>
-          <w:color w:val="000080"/>
-          <w:sz w:val="30"/>
-          <w:szCs w:val="30"/>
-        </w:rPr>
-        <w:t>-BASED DATA ACQUISITION SYSTEM</w:t>
+        <w:t>DEVELOPMENT OF A BLE MESH-BASED DATA ACQUISITION AND PROCESSING SYSTEM INTEGRATED WITH THE THINGSBOARD IoT SERVER</w:t>
       </w:r>
     </w:p>
     <w:p>
@@ -1106,19 +1056,7 @@
     </w:p>
     <w:p>
       <w:r>
-        <w:t>Tôi xin cam đoan khóa luận tốt nghiệp “</w:t>
-      </w:r>
-      <w:r>
-        <w:t>Hệ thống thu nhận dữ liệu dựa trên BLE Mesh</w:t>
-      </w:r>
-      <w:r>
-        <w:t xml:space="preserve"> và </w:t>
-      </w:r>
-      <w:r>
-        <w:t>RSSI</w:t>
-      </w:r>
-      <w:r>
-        <w:t>” là công trình nghiên cứu của bản thân tôi dưới sự hướng dẫn của TS. Huỳnh Hữu Thuận.</w:t>
+        <w:t>Tôi xin cam đoan khóa luận tốt nghiệp “Xây dựng hệ thống thu nhận và xử lý dữ liệu dựa trên BLE Mesh tích hợp máy chủ IoT ThingsBoard” là công trình nghiên cứu của bản thân tôi dưới sự hướng dẫn của TS. Huỳnh Hữu Thuận.</w:t>
       </w:r>
     </w:p>
     <w:p>

</xml_diff>

<commit_message>
[FIX] preserve thesis title formatting
</commit_message>
<xml_diff>
--- a/22207073-phan-B.docx
+++ b/22207073-phan-B.docx
@@ -349,6 +349,11 @@
         </w:rPr>
       </w:pPr>
       <w:r>
+        <w:rPr>
+          <w:b/>
+          <w:color w:val="EE0000"/>
+          <w:sz w:val="36"/>
+        </w:rPr>
         <w:t>XÂY DỰNG HỆ THỐNG THU NHẬN VÀ XỬ LÝ DỮ LIỆU DỰA TRÊN BLE MESH TÍCH HỢP MÁY CHỦ IoT THINGSBOARD</w:t>
       </w:r>
     </w:p>
@@ -821,6 +826,11 @@
         </w:rPr>
       </w:pPr>
       <w:r>
+        <w:rPr>
+          <w:b/>
+          <w:color w:val="993366"/>
+          <w:sz w:val="36"/>
+        </w:rPr>
         <w:t>XÂY DỰNG HỆ THỐNG THU NHẬN VÀ XỬ LÝ DỮ LIỆU DỰA TRÊN BLE MESH TÍCH HỢP MÁY CHỦ IoT THINGSBOARD</w:t>
       </w:r>
     </w:p>
@@ -834,6 +844,12 @@
         </w:rPr>
       </w:pPr>
       <w:r>
+        <w:rPr>
+          <w:b/>
+          <w:color w:val="000080"/>
+          <w:sz w:val="30"/>
+          <w:szCs w:val="30"/>
+        </w:rPr>
         <w:t>DEVELOPMENT OF A BLE MESH-BASED DATA ACQUISITION AND PROCESSING SYSTEM INTEGRATED WITH THE THINGSBOARD IoT SERVER</w:t>
       </w:r>
     </w:p>

</xml_diff>

<commit_message>
[DOCS] remove English abstract from thesis
</commit_message>
<xml_diff>
--- a/22207073-phan-B.docx
+++ b/22207073-phan-B.docx
@@ -1182,82 +1182,6 @@
       </w:pPr>
       <w:r>
         <w:t>Từ khóa – BLE Mesh, Gateway, FreeRTOS, MQTT, TLS, ThingsBoard, Rule Chain, định vị trong nhà.</w:t>
-      </w:r>
-    </w:p>
-    <w:p>
-      <w:pPr>
-        <w:pStyle w:val="Heading1"/>
-        <w:spacing w:before="120" w:after="60"/>
-        <w:rPr>
-          <w:rFonts w:ascii="Times New Roman" w:eastAsia="Times New Roman" w:hAnsi="Times New Roman" w:cs="Times New Roman"/>
-        </w:rPr>
-      </w:pPr>
-      <w:bookmarkStart w:id="5" w:name="_Toc236340704"/>
-      <w:r>
-        <w:rPr>
-          <w:rFonts w:ascii="Times New Roman" w:eastAsia="Times New Roman" w:hAnsi="Times New Roman" w:cs="Times New Roman"/>
-        </w:rPr>
-        <w:lastRenderedPageBreak/>
-        <w:t>ABSTRACT</w:t>
-      </w:r>
-      <w:bookmarkEnd w:id="5"/>
-    </w:p>
-    <w:p>
-      <w:pPr>
-        <w:spacing w:after="80" w:line="276" w:lineRule="auto"/>
-        <w:ind w:firstLine="567"/>
-        <w:rPr>
-          <w:szCs w:val="26"/>
-        </w:rPr>
-      </w:pPr>
-      <w:r>
-        <w:rPr>
-          <w:szCs w:val="26"/>
-        </w:rPr>
-        <w:t>Global Positioning System signals are unreliable indoors, while hospitals, factories, and care facilities increasingly need low-cost tracking of people and assets. Bluetooth Low Energy beacons are suitable for this task because they consume little energy and can be deployed with inexpensive hardware.</w:t>
-      </w:r>
-    </w:p>
-    <w:p>
-      <w:pPr>
-        <w:spacing w:after="80" w:line="276" w:lineRule="auto"/>
-        <w:ind w:firstLine="567"/>
-        <w:rPr>
-          <w:szCs w:val="26"/>
-        </w:rPr>
-      </w:pPr>
-      <w:r>
-        <w:t>This thesis develops an open, self-hosted room-level indoor positioning system comprising Tags, three Scanners, a Relay, and a Gateway. Within Part B, the overall architecture and Bluetooth Mesh are retained as shared content, while the implementation focuses on the Gateway data path. TAG_STATUS messages are decoupled from MQTTS publishing through a FreeRTOS queue and forwarded to ThingsBoard. A Rule Chain applies sample freshness, hysteresis, and debounce to select the room. Each Tag is represented by an independent child device and state, and the dashboard supports selecting a Tag to inspect its current status and history.</w:t>
-      </w:r>
-    </w:p>
-    <w:p>
-      <w:pPr>
-        <w:spacing w:after="80" w:line="276" w:lineRule="auto"/>
-        <w:ind w:firstLine="567"/>
-        <w:rPr>
-          <w:szCs w:val="26"/>
-        </w:rPr>
-      </w:pPr>
-      <w:r>
-        <w:rPr>
-          <w:szCs w:val="26"/>
-        </w:rPr>
-        <w:t>Three measurement sessions produced 2,160 eligible one-second observations. Telemetry was available for 2,153 observations, and 1,965 were classified correctly, yielding 91.27% accuracy, 91.33% macro-F1, and 99.68% coverage. For 32 protocol-compliant room transitions, the median latency was 10.00 s, the mean was 13.34 ± 12.55 s, and the 95th percentile was 47.90 s; 29 of 32 transitions converged within the 30 s grace period. Across 35 post-grace walking windows, 22 zone changes formed seven complete flapping cycles and three incomplete excursions, corresponding to 0.20 cycles per minute. Most errors and flapping events occurred near the boundary between Rooms 2 and 3.</w:t>
-      </w:r>
-    </w:p>
-    <w:p>
-      <w:pPr>
-        <w:spacing w:before="120"/>
-        <w:rPr>
-          <w:szCs w:val="26"/>
-        </w:rPr>
-      </w:pPr>
-      <w:r>
-        <w:t>Keywords – Bluetooth Mesh, Gateway, FreeRTOS, MQTT, TLS, ThingsBoard, Rule Chain, indoor positioning.</w:t>
-      </w:r>
-    </w:p>
-    <w:p>
-      <w:r>
-        <w:br w:type="page"/>
       </w:r>
     </w:p>
     <w:p>

</xml_diff>

<commit_message>
[DOCS] finalize dashboard figures and report indexes
</commit_message>
<xml_diff>
--- a/22207073-phan-B.docx
+++ b/22207073-phan-B.docx
@@ -1212,7 +1212,7 @@
       <w:r>
         <w:t>CHƯƠNG 1: GIỚI THIỆU</w:t>
         <w:tab/>
-        <w:t>3</w:t>
+        <w:t>2</w:t>
       </w:r>
     </w:p>
     <w:p>
@@ -1222,7 +1222,7 @@
       <w:r>
         <w:t>1.1 Bối cảnh và động lực thực hiện</w:t>
         <w:tab/>
-        <w:t>3</w:t>
+        <w:t>2</w:t>
       </w:r>
     </w:p>
     <w:p>
@@ -1242,7 +1242,7 @@
       <w:r>
         <w:t>1.3 Phạm vi</w:t>
         <w:tab/>
-        <w:t>4</w:t>
+        <w:t>3</w:t>
       </w:r>
     </w:p>
     <w:p>
@@ -1262,7 +1262,7 @@
       <w:r>
         <w:t>1.4 Các công cụ và board mạch phát triển</w:t>
         <w:tab/>
-        <w:t>5</w:t>
+        <w:t>4</w:t>
       </w:r>
     </w:p>
     <w:p>
@@ -1272,7 +1272,7 @@
       <w:r>
         <w:t>1.4.1 Framework ESP-IDF v6.0.1</w:t>
         <w:tab/>
-        <w:t>5</w:t>
+        <w:t>4</w:t>
       </w:r>
     </w:p>
     <w:p>
@@ -1292,7 +1292,7 @@
       <w:r>
         <w:t>1.4.3 ThingsBoard CE</w:t>
         <w:tab/>
-        <w:t>6</w:t>
+        <w:t>5</w:t>
       </w:r>
     </w:p>
     <w:p>
@@ -1322,7 +1322,7 @@
       <w:r>
         <w:t>CHƯƠNG 2: TỔNG QUAN NGHIÊN CỨU</w:t>
         <w:tab/>
-        <w:t>8</w:t>
+        <w:t>7</w:t>
       </w:r>
     </w:p>
     <w:p>
@@ -1332,7 +1332,7 @@
       <w:r>
         <w:t>2.1 Các phương pháp định vị trong nhà</w:t>
         <w:tab/>
-        <w:t>8</w:t>
+        <w:t>7</w:t>
       </w:r>
     </w:p>
     <w:p>
@@ -1342,7 +1342,7 @@
       <w:r>
         <w:t>2.1.1 Fingerprinting bằng Wi-Fi RSSI</w:t>
         <w:tab/>
-        <w:t>8</w:t>
+        <w:t>7</w:t>
       </w:r>
     </w:p>
     <w:p>
@@ -1352,7 +1352,7 @@
       <w:r>
         <w:t>2.1.2 BLE beacon với một đầu quét</w:t>
         <w:tab/>
-        <w:t>8</w:t>
+        <w:t>7</w:t>
       </w:r>
     </w:p>
     <w:p>
@@ -1362,7 +1362,7 @@
       <w:r>
         <w:t>2.1.3 Ultra-Wideband (UWB)</w:t>
         <w:tab/>
-        <w:t>8</w:t>
+        <w:t>7</w:t>
       </w:r>
     </w:p>
     <w:p>
@@ -1372,7 +1372,7 @@
       <w:r>
         <w:t>2.1.4 Hệ thống hybrid</w:t>
         <w:tab/>
-        <w:t>9</w:t>
+        <w:t>8</w:t>
       </w:r>
     </w:p>
     <w:p>
@@ -1382,7 +1382,7 @@
       <w:r>
         <w:t>2.2 So sánh giải pháp thương mại</w:t>
         <w:tab/>
-        <w:t>9</w:t>
+        <w:t>8</w:t>
       </w:r>
     </w:p>
     <w:p>
@@ -1392,7 +1392,7 @@
       <w:r>
         <w:t>2.2.1 Estimote</w:t>
         <w:tab/>
-        <w:t>9</w:t>
+        <w:t>8</w:t>
       </w:r>
     </w:p>
     <w:p>
@@ -1402,7 +1402,7 @@
       <w:r>
         <w:t>2.2.2 Kontakt.io</w:t>
         <w:tab/>
-        <w:t>9</w:t>
+        <w:t>8</w:t>
       </w:r>
     </w:p>
     <w:p>
@@ -1412,7 +1412,7 @@
       <w:r>
         <w:t>2.2.3 Aruba Meridian</w:t>
         <w:tab/>
-        <w:t>9</w:t>
+        <w:t>8</w:t>
       </w:r>
     </w:p>
     <w:p>
@@ -1422,7 +1422,7 @@
       <w:r>
         <w:t>2.3 Các nghiên cứu học thuật liên quan</w:t>
         <w:tab/>
-        <w:t>10</w:t>
+        <w:t>9</w:t>
       </w:r>
     </w:p>
     <w:p>
@@ -1432,7 +1432,7 @@
       <w:r>
         <w:t>2.3.1 Bluetooth Mesh cho IoT</w:t>
         <w:tab/>
-        <w:t>10</w:t>
+        <w:t>9</w:t>
       </w:r>
     </w:p>
     <w:p>
@@ -1442,7 +1442,7 @@
       <w:r>
         <w:t>2.4 Khoảng trống nghiên cứu</w:t>
         <w:tab/>
-        <w:t>10</w:t>
+        <w:t>9</w:t>
       </w:r>
     </w:p>
     <w:p>
@@ -1452,7 +1452,7 @@
       <w:r>
         <w:t>CHƯƠNG 3: CƠ SỞ LÝ THUYẾT</w:t>
         <w:tab/>
-        <w:t>10</w:t>
+        <w:t>9</w:t>
       </w:r>
     </w:p>
     <w:p>
@@ -1462,7 +1462,7 @@
       <w:r>
         <w:t>3.1 BLE Mesh</w:t>
         <w:tab/>
-        <w:t>10</w:t>
+        <w:t>9</w:t>
       </w:r>
     </w:p>
     <w:p>
@@ -1472,7 +1472,7 @@
       <w:r>
         <w:t>3.1.1 Provisioner và Node</w:t>
         <w:tab/>
-        <w:t>10</w:t>
+        <w:t>9</w:t>
       </w:r>
     </w:p>
     <w:p>
@@ -1482,7 +1482,7 @@
       <w:r>
         <w:t>3.1.2 Khóa và các layer</w:t>
         <w:tab/>
-        <w:t>11</w:t>
+        <w:t>10</w:t>
       </w:r>
     </w:p>
     <w:p>
@@ -1492,7 +1492,7 @@
       <w:r>
         <w:t>3.1.3 Provisioning và Static OOB</w:t>
         <w:tab/>
-        <w:t>11</w:t>
+        <w:t>10</w:t>
       </w:r>
     </w:p>
     <w:p>
@@ -1502,7 +1502,7 @@
       <w:r>
         <w:t>3.1.4 Vendor Model và opcode</w:t>
         <w:tab/>
-        <w:t>12</w:t>
+        <w:t>11</w:t>
       </w:r>
     </w:p>
     <w:p>
@@ -1512,7 +1512,7 @@
       <w:r>
         <w:t>3.1.5 Relay feature</w:t>
         <w:tab/>
-        <w:t>12</w:t>
+        <w:t>11</w:t>
       </w:r>
     </w:p>
     <w:p>
@@ -1522,7 +1522,7 @@
       <w:r>
         <w:t>3.2 Quyết định zone</w:t>
         <w:tab/>
-        <w:t>12</w:t>
+        <w:t>11</w:t>
       </w:r>
     </w:p>
     <w:p>
@@ -1532,7 +1532,7 @@
       <w:r>
         <w:t>3.2.1 Chọn Scanner mạnh nhất</w:t>
         <w:tab/>
-        <w:t>12</w:t>
+        <w:t>11</w:t>
       </w:r>
     </w:p>
     <w:p>
@@ -1542,7 +1542,7 @@
       <w:r>
         <w:t>3.2.2 Hysteresis chống flapping</w:t>
         <w:tab/>
-        <w:t>13</w:t>
+        <w:t>11</w:t>
       </w:r>
     </w:p>
     <w:p>
@@ -1552,7 +1552,7 @@
       <w:r>
         <w:t>3.2.3 Debounce leaky-bucket</w:t>
         <w:tab/>
-        <w:t>13</w:t>
+        <w:t>12</w:t>
       </w:r>
     </w:p>
     <w:p>
@@ -1562,7 +1562,7 @@
       <w:r>
         <w:t>3.3 MQTT và TLS</w:t>
         <w:tab/>
-        <w:t>13</w:t>
+        <w:t>12</w:t>
       </w:r>
     </w:p>
     <w:p>
@@ -1572,7 +1572,7 @@
       <w:r>
         <w:t>3.3.1 MQTT</w:t>
         <w:tab/>
-        <w:t>13</w:t>
+        <w:t>12</w:t>
       </w:r>
     </w:p>
     <w:p>
@@ -1582,7 +1582,7 @@
       <w:r>
         <w:t>3.3.2 TLS</w:t>
         <w:tab/>
-        <w:t>14</w:t>
+        <w:t>13</w:t>
       </w:r>
     </w:p>
     <w:p>
@@ -1592,7 +1592,7 @@
       <w:r>
         <w:t>3.4 Giao thức ThingsBoard Gateway API</w:t>
         <w:tab/>
-        <w:t>17</w:t>
+        <w:t>16</w:t>
       </w:r>
     </w:p>
     <w:p>
@@ -1602,7 +1602,7 @@
       <w:r>
         <w:t>3.4.1 Kiến trúc Gateway/Sub-device</w:t>
         <w:tab/>
-        <w:t>17</w:t>
+        <w:t>16</w:t>
       </w:r>
     </w:p>
     <w:p>
@@ -1612,7 +1612,7 @@
       <w:r>
         <w:t>3.4.2 Các topic MQTT</w:t>
         <w:tab/>
-        <w:t>17</w:t>
+        <w:t>16</w:t>
       </w:r>
     </w:p>
     <w:p>
@@ -1622,7 +1622,7 @@
       <w:r>
         <w:t>3.4.3 Rule Chain Engine</w:t>
         <w:tab/>
-        <w:t>17</w:t>
+        <w:t>16</w:t>
       </w:r>
     </w:p>
     <w:p>
@@ -1632,7 +1632,7 @@
       <w:r>
         <w:t>CHƯƠNG 4: TRIỂN KHAI HỆ THỐNG</w:t>
         <w:tab/>
-        <w:t>19</w:t>
+        <w:t>18</w:t>
       </w:r>
     </w:p>
     <w:p>
@@ -1642,7 +1642,7 @@
       <w:r>
         <w:t>4.1 Kiến trúc tổng thể</w:t>
         <w:tab/>
-        <w:t>19</w:t>
+        <w:t>18</w:t>
       </w:r>
     </w:p>
     <w:p>
@@ -1652,7 +1652,7 @@
       <w:r>
         <w:t>4.2 Firmware Relay và BLE Mesh dùng chung</w:t>
         <w:tab/>
-        <w:t>19</w:t>
+        <w:t>18</w:t>
       </w:r>
     </w:p>
     <w:p>
@@ -1662,7 +1662,7 @@
       <w:r>
         <w:t>4.2.1 Relay feature ở Network Layer</w:t>
         <w:tab/>
-        <w:t>20</w:t>
+        <w:t>19</w:t>
       </w:r>
     </w:p>
     <w:p>
@@ -1672,7 +1672,7 @@
       <w:r>
         <w:t>4.2.2 Bind AppKey cho vendor model dùng chung</w:t>
         <w:tab/>
-        <w:t>20</w:t>
+        <w:t>19</w:t>
       </w:r>
     </w:p>
     <w:p>
@@ -1682,7 +1682,7 @@
       <w:r>
         <w:t>4.3 Firmware Gateway</w:t>
         <w:tab/>
-        <w:t>20</w:t>
+        <w:t>19</w:t>
       </w:r>
     </w:p>
     <w:p>
@@ -1692,7 +1692,7 @@
       <w:r>
         <w:t>4.3.1 Provisioner AUTO mode</w:t>
         <w:tab/>
-        <w:t>20</w:t>
+        <w:t>19</w:t>
       </w:r>
     </w:p>
     <w:p>
@@ -1702,7 +1702,7 @@
       <w:r>
         <w:t>4.3.2 MQTT worker và hàng đợi Tag report</w:t>
         <w:tab/>
-        <w:t>21</w:t>
+        <w:t>20</w:t>
       </w:r>
     </w:p>
     <w:p>
@@ -1712,7 +1712,7 @@
       <w:r>
         <w:t>4.3.3 Data watchdog và tự phục hồi</w:t>
         <w:tab/>
-        <w:t>22</w:t>
+        <w:t>21</w:t>
       </w:r>
     </w:p>
     <w:p>
@@ -1722,7 +1722,7 @@
       <w:r>
         <w:t>4.3.4 Kết nối Wi-Fi, MQTTS và xác thực ThingsBoard</w:t>
         <w:tab/>
-        <w:t>22</w:t>
+        <w:t>21</w:t>
       </w:r>
     </w:p>
     <w:p>
@@ -1732,7 +1732,7 @@
       <w:r>
         <w:t>4.3.5 Phát hiện out_of_range và phục hồi sau mất MQTT</w:t>
         <w:tab/>
-        <w:t>22</w:t>
+        <w:t>21</w:t>
       </w:r>
     </w:p>
     <w:p>
@@ -1762,7 +1762,7 @@
       <w:r>
         <w:t>4.4.1 Rule Chain ble_tag_zone_detection</w:t>
         <w:tab/>
-        <w:t>23</w:t>
+        <w:t>22</w:t>
       </w:r>
     </w:p>
     <w:p>
@@ -2282,7 +2282,7 @@
       <w:r>
         <w:t>6.3 Hướng phát triển</w:t>
         <w:tab/>
-        <w:t>48</w:t>
+        <w:t>49</w:t>
       </w:r>
     </w:p>
     <w:p>
@@ -2312,7 +2312,7 @@
       <w:r>
         <w:t>TÀI LIỆU THAM KHẢO</w:t>
         <w:tab/>
-        <w:t>7</w:t>
+        <w:t>49</w:t>
       </w:r>
     </w:p>
     <w:p>
@@ -2322,7 +2322,7 @@
       <w:r>
         <w:t>PHỤ LỤC A: OPCODE VÀ MÃ ĐỊNH DANH BLUETOOTH</w:t>
         <w:tab/>
-        <w:t>52</w:t>
+        <w:t>50</w:t>
       </w:r>
     </w:p>
     <w:p>
@@ -6586,7 +6586,7 @@
       <w:r>
         <w:t>Hình 1. Mô hình mô tả hoạt động của TLS</w:t>
         <w:tab/>
-        <w:t>15</w:t>
+        <w:t>14</w:t>
       </w:r>
     </w:p>
     <w:p>
@@ -6596,7 +6596,7 @@
       <w:r>
         <w:t>Hình 2. Chuỗi thiết lập kênh MQTTS/TLS giữa Gateway và ThingsBoard</w:t>
         <w:tab/>
-        <w:t>16</w:t>
+        <w:t>15</w:t>
       </w:r>
     </w:p>
     <w:p>
@@ -6606,7 +6606,7 @@
       <w:r>
         <w:t>Hình 3. Mô hình kiến trúc hệ thống định vị theo phòng ở phiên bản hiện tại</w:t>
         <w:tab/>
-        <w:t>19</w:t>
+        <w:t>18</w:t>
       </w:r>
     </w:p>
     <w:p>
@@ -6616,7 +6616,7 @@
       <w:r>
         <w:t>Hình 4. Luồng Gateway tự động provision và cấu hình Scanner/Relay</w:t>
         <w:tab/>
-        <w:t>21</w:t>
+        <w:t>20</w:t>
       </w:r>
     </w:p>
     <w:p>
@@ -6634,7 +6634,7 @@
         <w:pStyle w:val="TableofFigures"/>
       </w:pPr>
       <w:r>
-        <w:t>Hình 6. Giao diện tổng quan Dashboard Indoor Tracking trên ThingsBoard</w:t>
+        <w:t>Hình 6. Dashboard tổng quan nhiều Tag và thông tin chi tiết của Tag được chọn</w:t>
         <w:tab/>
         <w:t>25</w:t>
       </w:r>
@@ -6654,7 +6654,7 @@
         <w:pStyle w:val="TableofFigures"/>
       </w:pPr>
       <w:r>
-        <w:t>Hình 8. Trạng thái kết nối của các node và telemetry trên ThingsBoard</w:t>
+        <w:t>Hình 8. Trạng thái kết nối của Gateway, Scanner và Tag trên ThingsBoard</w:t>
         <w:tab/>
         <w:t>27</w:t>
       </w:r>
@@ -6764,7 +6764,7 @@
       <w:r>
         <w:t>Bảng 2. So sánh các giải pháp indoor positioning thương mại</w:t>
         <w:tab/>
-        <w:t>9</w:t>
+        <w:t>8</w:t>
       </w:r>
     </w:p>
     <w:p>
@@ -6774,7 +6774,7 @@
       <w:r>
         <w:t>Bảng 3. Các opcode Vendor Model dùng trong đề tài</w:t>
         <w:tab/>
-        <w:t>12</w:t>
+        <w:t>11</w:t>
       </w:r>
     </w:p>
     <w:p>
@@ -6784,7 +6784,7 @@
       <w:r>
         <w:t>Bảng 4. Các topic MQTT dùng trong ThingsBoard Gateway API</w:t>
         <w:tab/>
-        <w:t>17</w:t>
+        <w:t>16</w:t>
       </w:r>
     </w:p>
     <w:p>
@@ -6914,7 +6914,7 @@
       <w:r>
         <w:t>Bảng 17. Kết quả flapping trong 35 cửa sổ sau Grace</w:t>
         <w:tab/>
-        <w:t>42</w:t>
+        <w:t>2</w:t>
       </w:r>
     </w:p>
     <w:p>
@@ -6924,7 +6924,7 @@
       <w:r>
         <w:t>Bảng 18. Thời gian OTA (giây)</w:t>
         <w:tab/>
-        <w:t>43</w:t>
+        <w:t>2</w:t>
       </w:r>
     </w:p>
     <w:p>
@@ -6934,7 +6934,7 @@
       <w:r>
         <w:t>Bảng 19. So sánh định tính với một số giải pháp thương mại</w:t>
         <w:tab/>
-        <w:t>46</w:t>
+        <w:t>2</w:t>
       </w:r>
     </w:p>
     <w:p>
@@ -6944,7 +6944,7 @@
       <w:r>
         <w:t>Bảng 20. Các vendor opcode của hệ thống</w:t>
         <w:tab/>
-        <w:t>52</w:t>
+        <w:t>2</w:t>
       </w:r>
     </w:p>
     <w:p>
@@ -6954,7 +6954,7 @@
       <w:r>
         <w:t>Bảng 21. Các mã định danh Bluetooth dùng trong hệ thống</w:t>
         <w:tab/>
-        <w:t>52</w:t>
+        <w:t>2</w:t>
       </w:r>
     </w:p>
     <w:p>
@@ -7427,27 +7427,9 @@
           <w:szCs w:val="26"/>
         </w:rPr>
       </w:pPr>
-      <w:bookmarkStart w:id="39" w:name="_Toc236264396"/>
-      <w:bookmarkStart w:id="40" w:name="_Toc236574195"/>
-      <w:r>
-        <w:rPr>
-          <w:szCs w:val="26"/>
-        </w:rPr>
-        <w:t xml:space="preserve">Bảng </w:t>
-      </w:r>
-      <w:fldSimple w:instr=" SEQ Bảng \* ARABIC ">
-        <w:r>
-          <w:t>1</w:t>
-        </w:r>
-      </w:fldSimple>
-      <w:r>
-        <w:rPr>
-          <w:szCs w:val="26"/>
-        </w:rPr>
-        <w:t>. Danh mục phần cứng</w:t>
-      </w:r>
-      <w:bookmarkEnd w:id="39"/>
-      <w:bookmarkEnd w:id="40"/>
+      <w:r>
+        <w:t>Bảng 1. Danh mục phần cứng</w:t>
+      </w:r>
     </w:p>
     <w:tbl>
       <w:tblPr>
@@ -8402,27 +8384,9 @@
           <w:szCs w:val="26"/>
         </w:rPr>
       </w:pPr>
-      <w:bookmarkStart w:id="70" w:name="_Toc236264397"/>
-      <w:bookmarkStart w:id="71" w:name="_Toc236574196"/>
-      <w:r>
-        <w:rPr>
-          <w:szCs w:val="26"/>
-        </w:rPr>
-        <w:t xml:space="preserve">Bảng </w:t>
-      </w:r>
-      <w:fldSimple w:instr=" SEQ Bảng \* ARABIC ">
-        <w:r>
-          <w:t>2</w:t>
-        </w:r>
-      </w:fldSimple>
-      <w:r>
-        <w:rPr>
-          <w:szCs w:val="26"/>
-        </w:rPr>
-        <w:t>. So sánh các giải pháp indoor positioning thương mại</w:t>
-      </w:r>
-      <w:bookmarkEnd w:id="70"/>
-      <w:bookmarkEnd w:id="71"/>
+      <w:r>
+        <w:t>Bảng 2. So sánh các giải pháp indoor positioning thương mại</w:t>
+      </w:r>
     </w:p>
     <w:tbl>
       <w:tblPr>
@@ -9267,27 +9231,9 @@
         <w:ind w:firstLine="0"/>
         <w:jc w:val="center"/>
       </w:pPr>
-      <w:bookmarkStart w:id="126" w:name="_Toc236264398"/>
-      <w:bookmarkStart w:id="127" w:name="_Toc236574197"/>
-      <w:r>
-        <w:rPr>
-          <w:szCs w:val="26"/>
-        </w:rPr>
-        <w:t xml:space="preserve">Bảng </w:t>
-      </w:r>
-      <w:fldSimple w:instr=" SEQ Bảng \* ARABIC ">
-        <w:r>
-          <w:t>3</w:t>
-        </w:r>
-      </w:fldSimple>
-      <w:r>
-        <w:rPr>
-          <w:szCs w:val="26"/>
-        </w:rPr>
-        <w:t>. Các opcode Vendor Model dùng trong đề tài</w:t>
-      </w:r>
-      <w:bookmarkEnd w:id="126"/>
-      <w:bookmarkEnd w:id="127"/>
+      <w:r>
+        <w:t>Bảng 3. Các opcode Vendor Model dùng trong đề tài</w:t>
+      </w:r>
     </w:p>
     <w:tbl>
       <w:tblPr>
@@ -9897,27 +9843,9 @@
           <w:szCs w:val="26"/>
         </w:rPr>
       </w:pPr>
-      <w:bookmarkStart w:id="201" w:name="_Toc236264382"/>
-      <w:bookmarkStart w:id="202" w:name="_Toc236574180"/>
-      <w:r>
-        <w:rPr>
-          <w:szCs w:val="26"/>
-        </w:rPr>
-        <w:t xml:space="preserve">Hình </w:t>
-      </w:r>
-      <w:fldSimple w:instr=" SEQ Hình \* ARABIC ">
-        <w:r>
-          <w:t>4</w:t>
-        </w:r>
-      </w:fldSimple>
-      <w:r>
-        <w:rPr>
-          <w:szCs w:val="26"/>
-        </w:rPr>
-        <w:t>. Mô hình mô tả hoạt động của TLS</w:t>
-      </w:r>
-      <w:bookmarkEnd w:id="201"/>
-      <w:bookmarkEnd w:id="202"/>
+      <w:r>
+        <w:t>Hình 1. Mô hình mô tả hoạt động của TLS</w:t>
+      </w:r>
     </w:p>
     <w:p>
       <w:pPr>
@@ -10077,27 +10005,9 @@
           <w:szCs w:val="26"/>
         </w:rPr>
       </w:pPr>
-      <w:bookmarkStart w:id="203" w:name="_Toc236264383"/>
-      <w:bookmarkStart w:id="204" w:name="_Toc236574181"/>
-      <w:r>
-        <w:rPr>
-          <w:szCs w:val="26"/>
-        </w:rPr>
-        <w:t xml:space="preserve">Hình </w:t>
-      </w:r>
-      <w:fldSimple w:instr=" SEQ Hình \* ARABIC ">
-        <w:r>
-          <w:t>5</w:t>
-        </w:r>
-      </w:fldSimple>
-      <w:r>
-        <w:rPr>
-          <w:szCs w:val="26"/>
-        </w:rPr>
-        <w:t>. Chuỗi thiết lập kênh MQTTS/TLS giữa Gateway và ThingsBoard</w:t>
-      </w:r>
-      <w:bookmarkEnd w:id="203"/>
-      <w:bookmarkEnd w:id="204"/>
+      <w:r>
+        <w:t>Hình 2. Chuỗi thiết lập kênh MQTTS/TLS giữa Gateway và ThingsBoard</w:t>
+      </w:r>
     </w:p>
     <w:p>
       <w:pPr>
@@ -10220,27 +10130,9 @@
           <w:szCs w:val="26"/>
         </w:rPr>
       </w:pPr>
-      <w:bookmarkStart w:id="217" w:name="_Toc236264400"/>
-      <w:bookmarkStart w:id="218" w:name="_Toc236574199"/>
-      <w:r>
-        <w:rPr>
-          <w:szCs w:val="26"/>
-        </w:rPr>
-        <w:t xml:space="preserve">Bảng </w:t>
-      </w:r>
-      <w:fldSimple w:instr=" SEQ Bảng \* ARABIC ">
-        <w:r>
-          <w:t>5</w:t>
-        </w:r>
-      </w:fldSimple>
-      <w:r>
-        <w:rPr>
-          <w:szCs w:val="26"/>
-        </w:rPr>
-        <w:t>. Các topic MQTT dùng trong ThingsBoard Gateway API</w:t>
-      </w:r>
-      <w:bookmarkEnd w:id="217"/>
-      <w:bookmarkEnd w:id="218"/>
+      <w:r>
+        <w:t>Bảng 4. Các topic MQTT dùng trong ThingsBoard Gateway API</w:t>
+      </w:r>
     </w:p>
     <w:tbl>
       <w:tblPr>
@@ -10860,27 +10752,9 @@
           <w:szCs w:val="26"/>
         </w:rPr>
       </w:pPr>
-      <w:bookmarkStart w:id="228" w:name="_Toc236264384"/>
-      <w:bookmarkStart w:id="229" w:name="_Toc236574182"/>
-      <w:r>
-        <w:rPr>
-          <w:szCs w:val="26"/>
-        </w:rPr>
-        <w:t xml:space="preserve">Hình </w:t>
-      </w:r>
-      <w:fldSimple w:instr=" SEQ Hình \* ARABIC ">
-        <w:r>
-          <w:t>6</w:t>
-        </w:r>
-      </w:fldSimple>
-      <w:r>
-        <w:rPr>
-          <w:szCs w:val="26"/>
-        </w:rPr>
-        <w:t>. Mô hình kiến trúc hệ thống định vị theo phòng ở phiên bản hiện tại</w:t>
-      </w:r>
-      <w:bookmarkEnd w:id="228"/>
-      <w:bookmarkEnd w:id="229"/>
+      <w:r>
+        <w:t>Hình 3. Mô hình kiến trúc hệ thống định vị theo phòng ở phiên bản hiện tại</w:t>
+      </w:r>
     </w:p>
     <w:p>
       <w:pPr>
@@ -11045,27 +10919,9 @@
           <w:szCs w:val="26"/>
         </w:rPr>
       </w:pPr>
-      <w:bookmarkStart w:id="273" w:name="_Toc236264385"/>
-      <w:bookmarkStart w:id="274" w:name="_Toc236574183"/>
-      <w:r>
-        <w:rPr>
-          <w:szCs w:val="26"/>
-        </w:rPr>
-        <w:t xml:space="preserve">Hình </w:t>
-      </w:r>
-      <w:fldSimple w:instr=" SEQ Hình \* ARABIC ">
-        <w:r>
-          <w:t>7</w:t>
-        </w:r>
-      </w:fldSimple>
-      <w:r>
-        <w:rPr>
-          <w:szCs w:val="26"/>
-        </w:rPr>
-        <w:t>. Luồng Gateway tự động provision và cấu hình Scanner/Relay</w:t>
-      </w:r>
-      <w:bookmarkEnd w:id="273"/>
-      <w:bookmarkEnd w:id="274"/>
+      <w:r>
+        <w:t>Hình 4. Luồng Gateway tự động provision và cấu hình Scanner/Relay</w:t>
+      </w:r>
     </w:p>
     <w:p>
       <w:pPr>
@@ -11366,27 +11222,9 @@
           <w:szCs w:val="26"/>
         </w:rPr>
       </w:pPr>
-      <w:bookmarkStart w:id="295" w:name="_Toc236264387"/>
-      <w:bookmarkStart w:id="296" w:name="_Toc236574185"/>
-      <w:r>
-        <w:rPr>
-          <w:szCs w:val="26"/>
-        </w:rPr>
-        <w:t xml:space="preserve">Hình </w:t>
-      </w:r>
-      <w:fldSimple w:instr=" SEQ Hình \* ARABIC ">
-        <w:r>
-          <w:t>9</w:t>
-        </w:r>
-      </w:fldSimple>
-      <w:r>
-        <w:rPr>
-          <w:szCs w:val="26"/>
-        </w:rPr>
-        <w:t>. Luồng xử lý dữ liệu và quyết định phòng từ Tag đến ThingsBoard</w:t>
-      </w:r>
-      <w:bookmarkEnd w:id="295"/>
-      <w:bookmarkEnd w:id="296"/>
+      <w:r>
+        <w:t>Hình 5. Luồng xử lý dữ liệu và quyết định phòng từ Tag đến ThingsBoard</w:t>
+      </w:r>
     </w:p>
     <w:p>
       <w:pPr>
@@ -11433,41 +11271,33 @@
     </w:p>
     <w:p>
       <w:r>
-        <w:rPr>
-          <w:noProof/>
-        </w:rPr>
         <w:drawing>
-          <wp:inline distT="0" distB="0" distL="0" distR="0" wp14:anchorId="7A070017" wp14:editId="799B5D6D">
-            <wp:extent cx="5940425" cy="1994535"/>
-            <wp:effectExtent l="0" t="0" r="0" b="0"/>
-            <wp:docPr id="16" name="Image3"/>
+          <wp:inline xmlns:a="http://schemas.openxmlformats.org/drawingml/2006/main" xmlns:pic="http://schemas.openxmlformats.org/drawingml/2006/picture">
+            <wp:extent cx="5760720" cy="2990088"/>
+            <wp:docPr id="1371157983" name="Picture 1371157983"/>
             <wp:cNvGraphicFramePr>
-              <a:graphicFrameLocks xmlns:a="http://schemas.openxmlformats.org/drawingml/2006/main" noChangeAspect="1"/>
+              <a:graphicFrameLocks noChangeAspect="1"/>
             </wp:cNvGraphicFramePr>
-            <a:graphic xmlns:a="http://schemas.openxmlformats.org/drawingml/2006/main">
+            <a:graphic>
               <a:graphicData uri="http://schemas.openxmlformats.org/drawingml/2006/picture">
-                <pic:pic xmlns:pic="http://schemas.openxmlformats.org/drawingml/2006/picture">
+                <pic:pic>
                   <pic:nvPicPr>
-                    <pic:cNvPr id="16" name="Image3"/>
-                    <pic:cNvPicPr>
-                      <a:picLocks noChangeAspect="1" noChangeArrowheads="1"/>
-                    </pic:cNvPicPr>
+                    <pic:cNvPr id="0" name="Screenshot from 2026-08-02 23-14-10.png"/>
+                    <pic:cNvPicPr/>
                   </pic:nvPicPr>
                   <pic:blipFill>
-                    <a:blip r:embed="rId30"/>
+                    <a:blip r:embed="rId45"/>
+                    <a:srcRect t="10400" r="2800"/>
                     <a:stretch>
                       <a:fillRect/>
                     </a:stretch>
                   </pic:blipFill>
-                  <pic:spPr bwMode="auto">
+                  <pic:spPr>
                     <a:xfrm>
                       <a:off x="0" y="0"/>
-                      <a:ext cx="5940425" cy="1994535"/>
+                      <a:ext cx="5760720" cy="2990088"/>
                     </a:xfrm>
-                    <a:prstGeom prst="rect">
-                      <a:avLst/>
-                    </a:prstGeom>
-                    <a:noFill/>
+                    <a:prstGeom prst="rect"/>
                   </pic:spPr>
                 </pic:pic>
               </a:graphicData>
@@ -11489,27 +11319,9 @@
           <w:szCs w:val="26"/>
         </w:rPr>
       </w:pPr>
-      <w:bookmarkStart w:id="300" w:name="_Toc236264388"/>
-      <w:bookmarkStart w:id="301" w:name="_Toc236574186"/>
-      <w:r>
-        <w:rPr>
-          <w:szCs w:val="26"/>
-        </w:rPr>
-        <w:t xml:space="preserve">Hình </w:t>
-      </w:r>
-      <w:fldSimple w:instr=" SEQ Hình \* ARABIC ">
-        <w:r>
-          <w:t>10</w:t>
-        </w:r>
-      </w:fldSimple>
-      <w:r>
-        <w:rPr>
-          <w:szCs w:val="26"/>
-        </w:rPr>
-        <w:t>. Giao diện tổng quan Dashboard Indoor Tracking trên ThingsBoard</w:t>
-      </w:r>
-      <w:bookmarkEnd w:id="300"/>
-      <w:bookmarkEnd w:id="301"/>
+      <w:r>
+        <w:t>Hình 6. Dashboard tổng quan nhiều Tag và thông tin chi tiết của Tag được chọn</w:t>
+      </w:r>
     </w:p>
     <w:p>
       <w:pPr>
@@ -11592,27 +11404,9 @@
           <w:szCs w:val="26"/>
         </w:rPr>
       </w:pPr>
-      <w:bookmarkStart w:id="302" w:name="_Toc236264389"/>
-      <w:bookmarkStart w:id="303" w:name="_Toc236574187"/>
-      <w:r>
-        <w:rPr>
-          <w:szCs w:val="26"/>
-        </w:rPr>
-        <w:t xml:space="preserve">Hình </w:t>
-      </w:r>
-      <w:fldSimple w:instr=" SEQ Hình \* ARABIC ">
-        <w:r>
-          <w:t>11</w:t>
-        </w:r>
-      </w:fldSimple>
-      <w:r>
-        <w:rPr>
-          <w:szCs w:val="26"/>
-        </w:rPr>
-        <w:t>. Widget hiển thị lịch sử phòng được hệ thống dự đoán theo thời gian</w:t>
-      </w:r>
-      <w:bookmarkEnd w:id="302"/>
-      <w:bookmarkEnd w:id="303"/>
+      <w:r>
+        <w:t>Hình 7. Widget hiển thị lịch sử phòng được hệ thống dự đoán theo thời gian</w:t>
+      </w:r>
     </w:p>
     <w:p>
       <w:pPr>
@@ -11776,41 +11570,33 @@
     </w:p>
     <w:p>
       <w:r>
-        <w:rPr>
-          <w:noProof/>
-        </w:rPr>
         <w:drawing>
-          <wp:inline distT="0" distB="0" distL="0" distR="0" wp14:anchorId="13CC20FA" wp14:editId="1919DA7C">
-            <wp:extent cx="5940425" cy="1609090"/>
-            <wp:effectExtent l="0" t="0" r="0" b="0"/>
-            <wp:docPr id="18" name="Image5"/>
+          <wp:inline xmlns:a="http://schemas.openxmlformats.org/drawingml/2006/main" xmlns:pic="http://schemas.openxmlformats.org/drawingml/2006/picture">
+            <wp:extent cx="5760720" cy="1325880"/>
+            <wp:docPr id="1371157984" name="Picture 1371157984"/>
             <wp:cNvGraphicFramePr>
-              <a:graphicFrameLocks xmlns:a="http://schemas.openxmlformats.org/drawingml/2006/main" noChangeAspect="1"/>
+              <a:graphicFrameLocks noChangeAspect="1"/>
             </wp:cNvGraphicFramePr>
-            <a:graphic xmlns:a="http://schemas.openxmlformats.org/drawingml/2006/main">
+            <a:graphic>
               <a:graphicData uri="http://schemas.openxmlformats.org/drawingml/2006/picture">
-                <pic:pic xmlns:pic="http://schemas.openxmlformats.org/drawingml/2006/picture">
+                <pic:pic>
                   <pic:nvPicPr>
-                    <pic:cNvPr id="18" name="Image5"/>
-                    <pic:cNvPicPr>
-                      <a:picLocks noChangeAspect="1" noChangeArrowheads="1"/>
-                    </pic:cNvPicPr>
+                    <pic:cNvPr id="0" name="Screenshot from 2026-08-02 23-14-25.png"/>
+                    <pic:cNvPicPr/>
                   </pic:nvPicPr>
                   <pic:blipFill>
-                    <a:blip r:embed="rId32"/>
+                    <a:blip r:embed="rId46"/>
+                    <a:srcRect t="10400" r="2800" b="49400"/>
                     <a:stretch>
                       <a:fillRect/>
                     </a:stretch>
                   </pic:blipFill>
-                  <pic:spPr bwMode="auto">
+                  <pic:spPr>
                     <a:xfrm>
                       <a:off x="0" y="0"/>
-                      <a:ext cx="5940425" cy="1609090"/>
+                      <a:ext cx="5760720" cy="1325880"/>
                     </a:xfrm>
-                    <a:prstGeom prst="rect">
-                      <a:avLst/>
-                    </a:prstGeom>
-                    <a:noFill/>
+                    <a:prstGeom prst="rect"/>
                   </pic:spPr>
                 </pic:pic>
               </a:graphicData>
@@ -11833,7 +11619,7 @@
         </w:rPr>
       </w:pPr>
       <w:r>
-        <w:t>Hình . Trạng thái kết nối của các node và telemetry trên ThingsBoard</w:t>
+        <w:t>Hình 8. Trạng thái kết nối của Gateway, Scanner và Tag trên ThingsBoard</w:t>
       </w:r>
     </w:p>
     <w:p>
@@ -11991,27 +11777,9 @@
           <w:szCs w:val="26"/>
         </w:rPr>
       </w:pPr>
-      <w:bookmarkStart w:id="351" w:name="_Toc236264391"/>
-      <w:bookmarkStart w:id="352" w:name="_Toc236574189"/>
-      <w:r>
-        <w:rPr>
-          <w:szCs w:val="26"/>
-        </w:rPr>
-        <w:t xml:space="preserve">Hình </w:t>
-      </w:r>
-      <w:fldSimple w:instr=" SEQ Hình \* ARABIC ">
-        <w:r>
-          <w:t>13</w:t>
-        </w:r>
-      </w:fldSimple>
-      <w:r>
-        <w:rPr>
-          <w:szCs w:val="26"/>
-        </w:rPr>
-        <w:t>. Sơ đồ mặt bằng thí nghiệm</w:t>
-      </w:r>
-      <w:bookmarkEnd w:id="351"/>
-      <w:bookmarkEnd w:id="352"/>
+      <w:r>
+        <w:t>Hình 9. Sơ đồ mặt bằng thí nghiệm</w:t>
+      </w:r>
     </w:p>
     <w:p>
       <w:pPr>
@@ -12069,28 +11837,9 @@
           <w:szCs w:val="26"/>
         </w:rPr>
       </w:pPr>
-      <w:bookmarkStart w:id="356" w:name="_Toc236264402"/>
-      <w:bookmarkStart w:id="357" w:name="_Toc236574201"/>
-      <w:r>
-        <w:rPr>
-          <w:szCs w:val="26"/>
-        </w:rPr>
-        <w:lastRenderedPageBreak/>
-        <w:t xml:space="preserve">Bảng </w:t>
-      </w:r>
-      <w:fldSimple w:instr=" SEQ Bảng \* ARABIC ">
-        <w:r>
-          <w:t>7</w:t>
-        </w:r>
-      </w:fldSimple>
-      <w:r>
-        <w:rPr>
-          <w:szCs w:val="26"/>
-        </w:rPr>
-        <w:t>. Bố trí thí nghiệm của cấu hình 3 phòng–3 Scanner</w:t>
-      </w:r>
-      <w:bookmarkEnd w:id="356"/>
-      <w:bookmarkEnd w:id="357"/>
+      <w:r>
+        <w:t>Bảng 5. Bố trí thí nghiệm của cấu hình 3 phòng–3 Scanner</w:t>
+      </w:r>
     </w:p>
     <w:tbl>
       <w:tblPr>
@@ -12574,27 +12323,9 @@
           <w:szCs w:val="26"/>
         </w:rPr>
       </w:pPr>
-      <w:bookmarkStart w:id="361" w:name="_Toc236264392"/>
-      <w:bookmarkStart w:id="362" w:name="_Toc236574190"/>
-      <w:r>
-        <w:rPr>
-          <w:szCs w:val="26"/>
-        </w:rPr>
-        <w:t xml:space="preserve">Hình </w:t>
-      </w:r>
-      <w:fldSimple w:instr=" SEQ Hình \* ARABIC ">
-        <w:r>
-          <w:t>14</w:t>
-        </w:r>
-      </w:fldSimple>
-      <w:r>
-        <w:rPr>
-          <w:szCs w:val="26"/>
-        </w:rPr>
-        <w:t>. Quy trình ghi ground truth và tạo cửa sổ đánh giá sau Grace 30 giây</w:t>
-      </w:r>
-      <w:bookmarkEnd w:id="361"/>
-      <w:bookmarkEnd w:id="362"/>
+      <w:r>
+        <w:t>Hình 10. Quy trình ghi ground truth và tạo cửa sổ đánh giá sau Grace 30 giây</w:t>
+      </w:r>
     </w:p>
     <w:p>
       <w:pPr>
@@ -12730,27 +12461,9 @@
           <w:szCs w:val="26"/>
         </w:rPr>
       </w:pPr>
-      <w:bookmarkStart w:id="372" w:name="_Toc236264403"/>
-      <w:bookmarkStart w:id="373" w:name="_Toc236574202"/>
-      <w:r>
-        <w:rPr>
-          <w:szCs w:val="26"/>
-        </w:rPr>
-        <w:t xml:space="preserve">Bảng </w:t>
-      </w:r>
-      <w:fldSimple w:instr=" SEQ Bảng \* ARABIC ">
-        <w:r>
-          <w:t>8</w:t>
-        </w:r>
-      </w:fldSimple>
-      <w:r>
-        <w:rPr>
-          <w:szCs w:val="26"/>
-        </w:rPr>
-        <w:t>. Các phiên ground truth được sử dụng</w:t>
-      </w:r>
-      <w:bookmarkEnd w:id="372"/>
-      <w:bookmarkEnd w:id="373"/>
+      <w:r>
+        <w:t>Bảng 6. Các phiên ground truth được sử dụng</w:t>
+      </w:r>
     </w:p>
     <w:p>
       <w:pPr>
@@ -13251,27 +12964,9 @@
           <w:szCs w:val="26"/>
         </w:rPr>
       </w:pPr>
-      <w:bookmarkStart w:id="377" w:name="_Toc236264404"/>
-      <w:bookmarkStart w:id="378" w:name="_Toc236574203"/>
-      <w:r>
-        <w:rPr>
-          <w:szCs w:val="26"/>
-        </w:rPr>
-        <w:t xml:space="preserve">Bảng </w:t>
-      </w:r>
-      <w:fldSimple w:instr=" SEQ Bảng \* ARABIC ">
-        <w:r>
-          <w:t>9</w:t>
-        </w:r>
-      </w:fldSimple>
-      <w:r>
-        <w:rPr>
-          <w:szCs w:val="26"/>
-        </w:rPr>
-        <w:t>. Phân bố mẫu đánh giá và coverage theo phòng của ba phiên</w:t>
-      </w:r>
-      <w:bookmarkEnd w:id="377"/>
-      <w:bookmarkEnd w:id="378"/>
+      <w:r>
+        <w:t>Bảng 7. Phân bố mẫu đánh giá và coverage theo phòng của ba phiên</w:t>
+      </w:r>
     </w:p>
     <w:p>
       <w:pPr>
@@ -14200,28 +13895,9 @@
           <w:szCs w:val="26"/>
         </w:rPr>
       </w:pPr>
-      <w:bookmarkStart w:id="385" w:name="_Toc236264405"/>
-      <w:bookmarkStart w:id="386" w:name="_Toc236574204"/>
-      <w:r>
-        <w:rPr>
-          <w:szCs w:val="26"/>
-        </w:rPr>
-        <w:lastRenderedPageBreak/>
-        <w:t xml:space="preserve">Bảng </w:t>
-      </w:r>
-      <w:fldSimple w:instr=" SEQ Bảng \* ARABIC ">
-        <w:r>
-          <w:t>10</w:t>
-        </w:r>
-      </w:fldSimple>
-      <w:r>
-        <w:rPr>
-          <w:szCs w:val="26"/>
-        </w:rPr>
-        <w:t>. Thống kê RSSI của ba scanner khi Tag được đặt cố định theo phòng</w:t>
-      </w:r>
-      <w:bookmarkEnd w:id="385"/>
-      <w:bookmarkEnd w:id="386"/>
+      <w:r>
+        <w:t>Bảng 8. Thống kê RSSI của ba scanner khi Tag được đặt cố định theo phòng</w:t>
+      </w:r>
     </w:p>
     <w:tbl>
       <w:tblPr>
@@ -15944,27 +15620,9 @@
           <w:szCs w:val="26"/>
         </w:rPr>
       </w:pPr>
-      <w:bookmarkStart w:id="387" w:name="_Toc236264393"/>
-      <w:bookmarkStart w:id="388" w:name="_Toc236574191"/>
-      <w:r>
-        <w:rPr>
-          <w:szCs w:val="26"/>
-        </w:rPr>
-        <w:t xml:space="preserve">Hình </w:t>
-      </w:r>
-      <w:fldSimple w:instr=" SEQ Hình \* ARABIC ">
-        <w:r>
-          <w:t>15</w:t>
-        </w:r>
-      </w:fldSimple>
-      <w:r>
-        <w:rPr>
-          <w:szCs w:val="26"/>
-        </w:rPr>
-        <w:t>. RSSI của ba scanner khi Tag được đặt cố định tại Phòng 2</w:t>
-      </w:r>
-      <w:bookmarkEnd w:id="387"/>
-      <w:bookmarkEnd w:id="388"/>
+      <w:r>
+        <w:t>Hình 11. RSSI của ba scanner khi Tag được đặt cố định tại Phòng 2</w:t>
+      </w:r>
     </w:p>
     <w:p>
       <w:pPr>
@@ -16029,27 +15687,9 @@
           <w:szCs w:val="26"/>
         </w:rPr>
       </w:pPr>
-      <w:bookmarkStart w:id="389" w:name="_Toc236264394"/>
-      <w:bookmarkStart w:id="390" w:name="_Toc236574192"/>
-      <w:r>
-        <w:rPr>
-          <w:szCs w:val="26"/>
-        </w:rPr>
-        <w:t xml:space="preserve">Hình </w:t>
-      </w:r>
-      <w:fldSimple w:instr=" SEQ Hình \* ARABIC ">
-        <w:r>
-          <w:t>16</w:t>
-        </w:r>
-      </w:fldSimple>
-      <w:r>
-        <w:rPr>
-          <w:szCs w:val="26"/>
-        </w:rPr>
-        <w:t>. RSSI của ba scanner khi Tag được đặt cố định tại Phòng 3</w:t>
-      </w:r>
-      <w:bookmarkEnd w:id="389"/>
-      <w:bookmarkEnd w:id="390"/>
+      <w:r>
+        <w:t>Hình 12. RSSI của ba scanner khi Tag được đặt cố định tại Phòng 3</w:t>
+      </w:r>
     </w:p>
     <w:p>
       <w:r>
@@ -16120,27 +15760,9 @@
           <w:szCs w:val="26"/>
         </w:rPr>
       </w:pPr>
-      <w:bookmarkStart w:id="391" w:name="_Toc236264395"/>
-      <w:bookmarkStart w:id="392" w:name="_Toc236574193"/>
-      <w:r>
-        <w:rPr>
-          <w:szCs w:val="26"/>
-        </w:rPr>
-        <w:t xml:space="preserve">Hình </w:t>
-      </w:r>
-      <w:fldSimple w:instr=" SEQ Hình \* ARABIC ">
-        <w:r>
-          <w:t>17</w:t>
-        </w:r>
-      </w:fldSimple>
-      <w:r>
-        <w:rPr>
-          <w:szCs w:val="26"/>
-        </w:rPr>
-        <w:t>. RSSI của ba scanner khi Tag được đặt cố định tại Phòng 1</w:t>
-      </w:r>
-      <w:bookmarkEnd w:id="391"/>
-      <w:bookmarkEnd w:id="392"/>
+      <w:r>
+        <w:t>Hình 13. RSSI của ba scanner khi Tag được đặt cố định tại Phòng 1</w:t>
+      </w:r>
     </w:p>
     <w:p>
       <w:pPr>
@@ -16199,27 +15821,9 @@
           <w:szCs w:val="26"/>
         </w:rPr>
       </w:pPr>
-      <w:bookmarkStart w:id="395" w:name="_Toc236264406"/>
-      <w:bookmarkStart w:id="396" w:name="_Toc236574205"/>
-      <w:r>
-        <w:rPr>
-          <w:szCs w:val="26"/>
-        </w:rPr>
-        <w:t xml:space="preserve">Bảng </w:t>
-      </w:r>
-      <w:fldSimple w:instr=" SEQ Bảng \* ARABIC ">
-        <w:r>
-          <w:t>11</w:t>
-        </w:r>
-      </w:fldSimple>
-      <w:r>
-        <w:rPr>
-          <w:szCs w:val="26"/>
-        </w:rPr>
-        <w:t>. Thời gian khởi động và đưa hệ thống vào hoạt động</w:t>
-      </w:r>
-      <w:bookmarkEnd w:id="395"/>
-      <w:bookmarkEnd w:id="396"/>
+      <w:r>
+        <w:t>Bảng 9. Thời gian khởi động và đưa hệ thống vào hoạt động</w:t>
+      </w:r>
     </w:p>
     <w:p>
       <w:pPr>
@@ -16592,27 +16196,9 @@
           <w:szCs w:val="26"/>
         </w:rPr>
       </w:pPr>
-      <w:bookmarkStart w:id="403" w:name="_Toc236264407"/>
-      <w:bookmarkStart w:id="404" w:name="_Toc236574206"/>
-      <w:r>
-        <w:rPr>
-          <w:szCs w:val="26"/>
-        </w:rPr>
-        <w:t xml:space="preserve">Bảng </w:t>
-      </w:r>
-      <w:fldSimple w:instr=" SEQ Bảng \* ARABIC ">
-        <w:r>
-          <w:t>12</w:t>
-        </w:r>
-      </w:fldSimple>
-      <w:r>
-        <w:rPr>
-          <w:szCs w:val="26"/>
-        </w:rPr>
-        <w:t>. Tóm tắt kết quả định vị của Phiên 1</w:t>
-      </w:r>
-      <w:bookmarkEnd w:id="403"/>
-      <w:bookmarkEnd w:id="404"/>
+      <w:r>
+        <w:t>Bảng 10. Tóm tắt kết quả định vị của Phiên 1</w:t>
+      </w:r>
     </w:p>
     <w:p>
       <w:pPr>
@@ -17288,27 +16874,9 @@
           <w:szCs w:val="26"/>
         </w:rPr>
       </w:pPr>
-      <w:bookmarkStart w:id="405" w:name="_Toc236264408"/>
-      <w:bookmarkStart w:id="406" w:name="_Toc236574207"/>
-      <w:r>
-        <w:rPr>
-          <w:szCs w:val="26"/>
-        </w:rPr>
-        <w:t xml:space="preserve">Bảng </w:t>
-      </w:r>
-      <w:fldSimple w:instr=" SEQ Bảng \* ARABIC ">
-        <w:r>
-          <w:t>13</w:t>
-        </w:r>
-      </w:fldSimple>
-      <w:r>
-        <w:rPr>
-          <w:szCs w:val="26"/>
-        </w:rPr>
-        <w:t>. Tóm tắt kết quả định vị của Phiên 2</w:t>
-      </w:r>
-      <w:bookmarkEnd w:id="405"/>
-      <w:bookmarkEnd w:id="406"/>
+      <w:r>
+        <w:t>Bảng 11. Tóm tắt kết quả định vị của Phiên 2</w:t>
+      </w:r>
     </w:p>
     <w:tbl>
       <w:tblPr>
@@ -17961,27 +17529,9 @@
           <w:szCs w:val="26"/>
         </w:rPr>
       </w:pPr>
-      <w:bookmarkStart w:id="407" w:name="_Toc236264409"/>
-      <w:bookmarkStart w:id="408" w:name="_Toc236574208"/>
-      <w:r>
-        <w:rPr>
-          <w:szCs w:val="26"/>
-        </w:rPr>
-        <w:t xml:space="preserve">Bảng </w:t>
-      </w:r>
-      <w:fldSimple w:instr=" SEQ Bảng \* ARABIC ">
-        <w:r>
-          <w:t>14</w:t>
-        </w:r>
-      </w:fldSimple>
-      <w:r>
-        <w:rPr>
-          <w:szCs w:val="26"/>
-        </w:rPr>
-        <w:t>. Tóm tắt kết quả định vị của Phiên 3</w:t>
-      </w:r>
-      <w:bookmarkEnd w:id="407"/>
-      <w:bookmarkEnd w:id="408"/>
+      <w:r>
+        <w:t>Bảng 12. Tóm tắt kết quả định vị của Phiên 3</w:t>
+      </w:r>
     </w:p>
     <w:tbl>
       <w:tblPr>
@@ -18687,27 +18237,9 @@
           <w:szCs w:val="26"/>
         </w:rPr>
       </w:pPr>
-      <w:bookmarkStart w:id="409" w:name="_Toc236264410"/>
-      <w:bookmarkStart w:id="410" w:name="_Toc236574209"/>
-      <w:r>
-        <w:rPr>
-          <w:szCs w:val="26"/>
-        </w:rPr>
-        <w:t xml:space="preserve">Bảng </w:t>
-      </w:r>
-      <w:fldSimple w:instr=" SEQ Bảng \* ARABIC ">
-        <w:r>
-          <w:t>15</w:t>
-        </w:r>
-      </w:fldSimple>
-      <w:r>
-        <w:rPr>
-          <w:szCs w:val="26"/>
-        </w:rPr>
-        <w:t>. Ma trận nhầm lẫn gộp của ba phiên đo</w:t>
-      </w:r>
-      <w:bookmarkEnd w:id="409"/>
-      <w:bookmarkEnd w:id="410"/>
+      <w:r>
+        <w:t>Bảng 13. Ma trận nhầm lẫn gộp của ba phiên đo</w:t>
+      </w:r>
     </w:p>
     <w:p>
       <w:pPr>
@@ -18790,27 +18322,9 @@
           <w:szCs w:val="26"/>
         </w:rPr>
       </w:pPr>
-      <w:bookmarkStart w:id="411" w:name="_Toc236264411"/>
-      <w:bookmarkStart w:id="412" w:name="_Toc236574210"/>
-      <w:r>
-        <w:rPr>
-          <w:szCs w:val="26"/>
-        </w:rPr>
-        <w:t xml:space="preserve">Bảng </w:t>
-      </w:r>
-      <w:fldSimple w:instr=" SEQ Bảng \* ARABIC ">
-        <w:r>
-          <w:t>16</w:t>
-        </w:r>
-      </w:fldSimple>
-      <w:r>
-        <w:rPr>
-          <w:szCs w:val="26"/>
-        </w:rPr>
-        <w:t>. Precision, recall và F1-score theo từng phòng</w:t>
-      </w:r>
-      <w:bookmarkEnd w:id="411"/>
-      <w:bookmarkEnd w:id="412"/>
+      <w:r>
+        <w:t>Bảng 14. Precision, recall và F1-score theo từng phòng</w:t>
+      </w:r>
     </w:p>
     <w:tbl>
       <w:tblPr>
@@ -19663,27 +19177,9 @@
           <w:szCs w:val="26"/>
         </w:rPr>
       </w:pPr>
-      <w:bookmarkStart w:id="417" w:name="_Toc236264412"/>
-      <w:bookmarkStart w:id="418" w:name="_Toc236574211"/>
-      <w:r>
-        <w:rPr>
-          <w:szCs w:val="26"/>
-        </w:rPr>
-        <w:t xml:space="preserve">Bảng </w:t>
-      </w:r>
-      <w:fldSimple w:instr=" SEQ Bảng \* ARABIC ">
-        <w:r>
-          <w:t>17</w:t>
-        </w:r>
-      </w:fldSimple>
-      <w:r>
-        <w:rPr>
-          <w:szCs w:val="26"/>
-        </w:rPr>
-        <w:t>. Số lần flap trong 5 phút tại biên phòng</w:t>
-      </w:r>
-      <w:bookmarkEnd w:id="417"/>
-      <w:bookmarkEnd w:id="418"/>
+      <w:r>
+        <w:t>Bảng 15. Số lần flap trong 5 phút tại biên phòng</w:t>
+      </w:r>
     </w:p>
     <w:tbl>
       <w:tblPr>
@@ -20064,25 +19560,9 @@
         <w:spacing w:before="60" w:after="120"/>
         <w:jc w:val="center"/>
       </w:pPr>
-      <w:bookmarkStart w:id="420" w:name="_Toc236574212"/>
-      <w:r>
-        <w:rPr>
-          <w:szCs w:val="26"/>
-        </w:rPr>
-        <w:t xml:space="preserve">Bảng </w:t>
-      </w:r>
-      <w:fldSimple w:instr=" SEQ Bảng \* ARABIC ">
-        <w:r>
-          <w:t>18</w:t>
-        </w:r>
-      </w:fldSimple>
-      <w:r>
-        <w:rPr>
-          <w:szCs w:val="26"/>
-        </w:rPr>
-        <w:t>. Thống kê độ trễ chuyển phòng của ba phiên đo</w:t>
-      </w:r>
-      <w:bookmarkEnd w:id="420"/>
+      <w:r>
+        <w:t>Bảng 16. Thống kê độ trễ chuyển phòng của ba phiên đo</w:t>
+      </w:r>
     </w:p>
     <w:tbl>
       <w:tblPr>
@@ -20543,25 +20023,9 @@
         <w:spacing w:before="60" w:after="120"/>
         <w:jc w:val="center"/>
       </w:pPr>
-      <w:bookmarkStart w:id="421" w:name="_Toc236574194"/>
-      <w:r>
-        <w:rPr>
-          <w:szCs w:val="26"/>
-        </w:rPr>
-        <w:t xml:space="preserve">Hình </w:t>
-      </w:r>
-      <w:fldSimple w:instr=" SEQ Hình \* ARABIC ">
-        <w:r>
-          <w:t>18</w:t>
-        </w:r>
-      </w:fldSimple>
-      <w:r>
-        <w:rPr>
-          <w:szCs w:val="26"/>
-        </w:rPr>
-        <w:t>. Độ trễ chuyển phòng theo từng sự kiện trong ba phiên đo</w:t>
-      </w:r>
-      <w:bookmarkEnd w:id="421"/>
+      <w:r>
+        <w:t>Hình 14. Độ trễ chuyển phòng theo từng sự kiện trong ba phiên đo</w:t>
+      </w:r>
     </w:p>
     <w:p>
       <w:pPr>
@@ -20613,25 +20077,9 @@
         <w:spacing w:before="60" w:after="120"/>
         <w:jc w:val="center"/>
       </w:pPr>
-      <w:bookmarkStart w:id="423" w:name="_Toc236574213"/>
-      <w:r>
-        <w:rPr>
-          <w:szCs w:val="26"/>
-        </w:rPr>
-        <w:t xml:space="preserve">Bảng </w:t>
-      </w:r>
-      <w:fldSimple w:instr=" SEQ Bảng \* ARABIC ">
-        <w:r>
-          <w:t>19</w:t>
-        </w:r>
-      </w:fldSimple>
-      <w:r>
-        <w:rPr>
-          <w:szCs w:val="26"/>
-        </w:rPr>
-        <w:t>. Kết quả flapping trong 35 cửa sổ sau Grace</w:t>
-      </w:r>
-      <w:bookmarkEnd w:id="423"/>
+      <w:r>
+        <w:t>Bảng 17. Kết quả flapping trong 35 cửa sổ sau Grace</w:t>
+      </w:r>
     </w:p>
     <w:tbl>
       <w:tblPr>
@@ -21660,27 +21108,9 @@
           <w:szCs w:val="26"/>
         </w:rPr>
       </w:pPr>
-      <w:bookmarkStart w:id="442" w:name="_Toc236264413"/>
-      <w:bookmarkStart w:id="443" w:name="_Toc236574214"/>
-      <w:r>
-        <w:rPr>
-          <w:szCs w:val="26"/>
-        </w:rPr>
-        <w:t xml:space="preserve">Bảng </w:t>
-      </w:r>
-      <w:fldSimple w:instr=" SEQ Bảng \* ARABIC ">
-        <w:r>
-          <w:t>20</w:t>
-        </w:r>
-      </w:fldSimple>
-      <w:r>
-        <w:rPr>
-          <w:szCs w:val="26"/>
-        </w:rPr>
-        <w:t>. Thời gian OTA (giây)</w:t>
-      </w:r>
-      <w:bookmarkEnd w:id="442"/>
-      <w:bookmarkEnd w:id="443"/>
+      <w:r>
+        <w:t>Bảng 18. Thời gian OTA (giây)</w:t>
+      </w:r>
     </w:p>
     <w:tbl>
       <w:tblPr>
@@ -22285,27 +21715,9 @@
           <w:szCs w:val="26"/>
         </w:rPr>
       </w:pPr>
-      <w:bookmarkStart w:id="476" w:name="_Toc236264414"/>
-      <w:bookmarkStart w:id="477" w:name="_Toc236574215"/>
-      <w:r>
-        <w:rPr>
-          <w:szCs w:val="26"/>
-        </w:rPr>
-        <w:t xml:space="preserve">Bảng </w:t>
-      </w:r>
-      <w:fldSimple w:instr=" SEQ Bảng \* ARABIC ">
-        <w:r>
-          <w:t>21</w:t>
-        </w:r>
-      </w:fldSimple>
-      <w:r>
-        <w:rPr>
-          <w:szCs w:val="26"/>
-        </w:rPr>
-        <w:t>. So sánh định tính với một số giải pháp thương mại</w:t>
-      </w:r>
-      <w:bookmarkEnd w:id="476"/>
-      <w:bookmarkEnd w:id="477"/>
+      <w:r>
+        <w:t>Bảng 19. So sánh định tính với một số giải pháp thương mại</w:t>
+      </w:r>
     </w:p>
     <w:tbl>
       <w:tblPr>
@@ -23572,25 +22984,9 @@
         <w:spacing w:before="60" w:after="120"/>
         <w:jc w:val="center"/>
       </w:pPr>
-      <w:bookmarkStart w:id="507" w:name="_Toc236574216"/>
-      <w:r>
-        <w:rPr>
-          <w:szCs w:val="26"/>
-        </w:rPr>
-        <w:t xml:space="preserve">Bảng </w:t>
-      </w:r>
-      <w:fldSimple w:instr=" SEQ Bảng \* ARABIC ">
-        <w:r>
-          <w:t>22</w:t>
-        </w:r>
-      </w:fldSimple>
-      <w:r>
-        <w:rPr>
-          <w:szCs w:val="26"/>
-        </w:rPr>
-        <w:t>. Các vendor opcode của hệ thống</w:t>
-      </w:r>
-      <w:bookmarkEnd w:id="507"/>
+      <w:r>
+        <w:t>Bảng 20. Các vendor opcode của hệ thống</w:t>
+      </w:r>
     </w:p>
     <w:tbl>
       <w:tblPr>
@@ -23821,25 +23217,9 @@
         <w:spacing w:before="60" w:after="120"/>
         <w:jc w:val="center"/>
       </w:pPr>
-      <w:bookmarkStart w:id="508" w:name="_Toc236574217"/>
-      <w:r>
-        <w:rPr>
-          <w:szCs w:val="26"/>
-        </w:rPr>
-        <w:t xml:space="preserve">Bảng </w:t>
-      </w:r>
-      <w:fldSimple w:instr=" SEQ Bảng \* ARABIC ">
-        <w:r>
-          <w:t>23</w:t>
-        </w:r>
-      </w:fldSimple>
-      <w:r>
-        <w:rPr>
-          <w:szCs w:val="26"/>
-        </w:rPr>
-        <w:t>. Các mã định danh Bluetooth dùng trong hệ thống</w:t>
-      </w:r>
-      <w:bookmarkEnd w:id="508"/>
+      <w:r>
+        <w:t>Bảng 21. Các mã định danh Bluetooth dùng trong hệ thống</w:t>
+      </w:r>
     </w:p>
     <w:tbl>
       <w:tblPr>

</xml_diff>

<commit_message>
[FIX] remove blank page between thesis covers
</commit_message>
<xml_diff>
--- a/22207073-phan-B.docx
+++ b/22207073-phan-B.docx
@@ -523,11 +523,6 @@
       </w:r>
     </w:p>
     <w:p>
-      <w:r>
-        <w:br w:type="page"/>
-      </w:r>
-    </w:p>
-    <w:p>
       <w:pPr>
         <w:tabs>
           <w:tab w:val="left" w:pos="3630"/>
@@ -990,17 +985,6 @@
         </w:rPr>
         <w:t xml:space="preserve"> HỮU THUẬN</w:t>
       </w:r>
-    </w:p>
-    <w:p>
-      <w:pPr>
-        <w:spacing w:after="200"/>
-        <w:jc w:val="center"/>
-        <w:rPr>
-          <w:b/>
-          <w:color w:val="000080"/>
-          <w:lang w:val="vi-VN"/>
-        </w:rPr>
-      </w:pPr>
     </w:p>
     <w:p>
       <w:pPr>

</xml_diff>

<commit_message>
[FIX] remove internal part labels and separate major sections
</commit_message>
<xml_diff>
--- a/22207073-phan-B.docx
+++ b/22207073-phan-B.docx
@@ -1036,6 +1036,7 @@
     <w:p>
       <w:pPr>
         <w:pStyle w:val="Heading1"/>
+        <w:pageBreakBefore/>
         <w:rPr>
           <w:rFonts w:ascii="Times New Roman" w:hAnsi="Times New Roman" w:cs="Times New Roman"/>
         </w:rPr>
@@ -1105,13 +1106,9 @@
       </w:r>
     </w:p>
     <w:p>
-      <w:r>
-        <w:br w:type="page"/>
-      </w:r>
-    </w:p>
-    <w:p>
       <w:pPr>
         <w:pStyle w:val="Heading1"/>
+        <w:pageBreakBefore/>
         <w:spacing w:after="120" w:line="240" w:lineRule="auto"/>
         <w:rPr>
           <w:rFonts w:ascii="Times New Roman" w:hAnsi="Times New Roman" w:cs="Times New Roman"/>
@@ -1145,7 +1142,7 @@
         <w:ind w:firstLine="567"/>
       </w:pPr>
       <w:r>
-        <w:t>Khóa luận xây dựng hệ thống định vị mức phòng gồm Tag, ba Scanner, Relay và Gateway. Trong phạm vi phần B, kiến trúc tổng thể và BLE Mesh được giữ làm nội dung chung; trọng tâm là Gateway nhận TAG_STATUS, tách callback và MQTTS bằng hàng đợi FreeRTOS, rồi chuyển telemetry lên ThingsBoard. Rule Chain dùng độ tươi dữ liệu, hysteresis và debounce để quyết định phòng. Mỗi Tag được quản lý bằng child device và state độc lập; dashboard hỗ trợ chọn Tag để xem trạng thái và lịch sử.</w:t>
+        <w:t>Khóa luận xây dựng hệ thống định vị mức phòng gồm Tag, ba Scanner, Relay và Gateway. Gateway nhận TAG_STATUS, tách callback và MQTTS bằng hàng đợi FreeRTOS, rồi chuyển telemetry lên ThingsBoard. Rule Chain dùng độ tươi dữ liệu, hysteresis và debounce để quyết định phòng. Mỗi Tag được quản lý bằng child device và trạng thái độc lập; dashboard hỗ trợ chọn Tag để xem trạng thái và lịch sử.</w:t>
       </w:r>
     </w:p>
     <w:p>
@@ -1171,6 +1168,7 @@
     <w:p>
       <w:pPr>
         <w:pStyle w:val="Heading1"/>
+        <w:pageBreakBefore/>
         <w:spacing w:after="120" w:line="240" w:lineRule="auto"/>
         <w:rPr>
           <w:rFonts w:ascii="Times New Roman" w:hAnsi="Times New Roman" w:cs="Times New Roman"/>
@@ -1196,7 +1194,7 @@
       <w:r>
         <w:t>CHƯƠNG 1: GIỚI THIỆU</w:t>
         <w:tab/>
-        <w:t>2</w:t>
+        <w:t>3</w:t>
       </w:r>
     </w:p>
     <w:p>
@@ -1206,7 +1204,7 @@
       <w:r>
         <w:t>1.1 Bối cảnh và động lực thực hiện</w:t>
         <w:tab/>
-        <w:t>2</w:t>
+        <w:t>3</w:t>
       </w:r>
     </w:p>
     <w:p>
@@ -1226,7 +1224,7 @@
       <w:r>
         <w:t>1.3 Phạm vi</w:t>
         <w:tab/>
-        <w:t>3</w:t>
+        <w:t>4</w:t>
       </w:r>
     </w:p>
     <w:p>
@@ -1234,7 +1232,7 @@
         <w:pStyle w:val="TOC3"/>
       </w:pPr>
       <w:r>
-        <w:t>1.3.1 Phạm vi nội dung phần B</w:t>
+        <w:t>1.3.1 Phạm vi thu nhận và xử lý dữ liệu</w:t>
         <w:tab/>
         <w:t>4</w:t>
       </w:r>
@@ -1246,7 +1244,7 @@
       <w:r>
         <w:t>1.4 Các công cụ và board mạch phát triển</w:t>
         <w:tab/>
-        <w:t>4</w:t>
+        <w:t>5</w:t>
       </w:r>
     </w:p>
     <w:p>
@@ -1256,7 +1254,7 @@
       <w:r>
         <w:t>1.4.1 Framework ESP-IDF v6.0.1</w:t>
         <w:tab/>
-        <w:t>4</w:t>
+        <w:t>5</w:t>
       </w:r>
     </w:p>
     <w:p>
@@ -1276,7 +1274,7 @@
       <w:r>
         <w:t>1.4.3 ThingsBoard CE</w:t>
         <w:tab/>
-        <w:t>5</w:t>
+        <w:t>6</w:t>
       </w:r>
     </w:p>
     <w:p>
@@ -1296,7 +1294,7 @@
       <w:r>
         <w:t>1.5 Cấu trúc của khóa luận</w:t>
         <w:tab/>
-        <w:t>6</w:t>
+        <w:t>7</w:t>
       </w:r>
     </w:p>
     <w:p>
@@ -1306,7 +1304,7 @@
       <w:r>
         <w:t>CHƯƠNG 2: TỔNG QUAN NGHIÊN CỨU</w:t>
         <w:tab/>
-        <w:t>7</w:t>
+        <w:t>8</w:t>
       </w:r>
     </w:p>
     <w:p>
@@ -1316,7 +1314,7 @@
       <w:r>
         <w:t>2.1 Các phương pháp định vị trong nhà</w:t>
         <w:tab/>
-        <w:t>7</w:t>
+        <w:t>8</w:t>
       </w:r>
     </w:p>
     <w:p>
@@ -1326,7 +1324,7 @@
       <w:r>
         <w:t>2.1.1 Fingerprinting bằng Wi-Fi RSSI</w:t>
         <w:tab/>
-        <w:t>7</w:t>
+        <w:t>8</w:t>
       </w:r>
     </w:p>
     <w:p>
@@ -1336,7 +1334,7 @@
       <w:r>
         <w:t>2.1.2 BLE beacon với một đầu quét</w:t>
         <w:tab/>
-        <w:t>7</w:t>
+        <w:t>8</w:t>
       </w:r>
     </w:p>
     <w:p>
@@ -1346,7 +1344,7 @@
       <w:r>
         <w:t>2.1.3 Ultra-Wideband (UWB)</w:t>
         <w:tab/>
-        <w:t>7</w:t>
+        <w:t>8</w:t>
       </w:r>
     </w:p>
     <w:p>
@@ -1356,7 +1354,7 @@
       <w:r>
         <w:t>2.1.4 Hệ thống hybrid</w:t>
         <w:tab/>
-        <w:t>8</w:t>
+        <w:t>9</w:t>
       </w:r>
     </w:p>
     <w:p>
@@ -1366,7 +1364,7 @@
       <w:r>
         <w:t>2.2 So sánh giải pháp thương mại</w:t>
         <w:tab/>
-        <w:t>8</w:t>
+        <w:t>9</w:t>
       </w:r>
     </w:p>
     <w:p>
@@ -1376,7 +1374,7 @@
       <w:r>
         <w:t>2.2.1 Estimote</w:t>
         <w:tab/>
-        <w:t>8</w:t>
+        <w:t>9</w:t>
       </w:r>
     </w:p>
     <w:p>
@@ -1386,7 +1384,7 @@
       <w:r>
         <w:t>2.2.2 Kontakt.io</w:t>
         <w:tab/>
-        <w:t>8</w:t>
+        <w:t>9</w:t>
       </w:r>
     </w:p>
     <w:p>
@@ -1396,7 +1394,7 @@
       <w:r>
         <w:t>2.2.3 Aruba Meridian</w:t>
         <w:tab/>
-        <w:t>8</w:t>
+        <w:t>9</w:t>
       </w:r>
     </w:p>
     <w:p>
@@ -1406,7 +1404,7 @@
       <w:r>
         <w:t>2.3 Các nghiên cứu học thuật liên quan</w:t>
         <w:tab/>
-        <w:t>9</w:t>
+        <w:t>10</w:t>
       </w:r>
     </w:p>
     <w:p>
@@ -1416,7 +1414,7 @@
       <w:r>
         <w:t>2.3.1 Bluetooth Mesh cho IoT</w:t>
         <w:tab/>
-        <w:t>9</w:t>
+        <w:t>10</w:t>
       </w:r>
     </w:p>
     <w:p>
@@ -1426,7 +1424,7 @@
       <w:r>
         <w:t>2.4 Khoảng trống nghiên cứu</w:t>
         <w:tab/>
-        <w:t>9</w:t>
+        <w:t>10</w:t>
       </w:r>
     </w:p>
     <w:p>
@@ -1436,7 +1434,7 @@
       <w:r>
         <w:t>CHƯƠNG 3: CƠ SỞ LÝ THUYẾT</w:t>
         <w:tab/>
-        <w:t>9</w:t>
+        <w:t>11</w:t>
       </w:r>
     </w:p>
     <w:p>
@@ -1446,7 +1444,7 @@
       <w:r>
         <w:t>3.1 BLE Mesh</w:t>
         <w:tab/>
-        <w:t>9</w:t>
+        <w:t>11</w:t>
       </w:r>
     </w:p>
     <w:p>
@@ -1456,7 +1454,7 @@
       <w:r>
         <w:t>3.1.1 Provisioner và Node</w:t>
         <w:tab/>
-        <w:t>9</w:t>
+        <w:t>11</w:t>
       </w:r>
     </w:p>
     <w:p>
@@ -1466,7 +1464,7 @@
       <w:r>
         <w:t>3.1.2 Khóa và các layer</w:t>
         <w:tab/>
-        <w:t>10</w:t>
+        <w:t>11</w:t>
       </w:r>
     </w:p>
     <w:p>
@@ -1476,7 +1474,7 @@
       <w:r>
         <w:t>3.1.3 Provisioning và Static OOB</w:t>
         <w:tab/>
-        <w:t>10</w:t>
+        <w:t>11</w:t>
       </w:r>
     </w:p>
     <w:p>
@@ -1486,7 +1484,7 @@
       <w:r>
         <w:t>3.1.4 Vendor Model và opcode</w:t>
         <w:tab/>
-        <w:t>11</w:t>
+        <w:t>12</w:t>
       </w:r>
     </w:p>
     <w:p>
@@ -1496,7 +1494,7 @@
       <w:r>
         <w:t>3.1.5 Relay feature</w:t>
         <w:tab/>
-        <w:t>11</w:t>
+        <w:t>12</w:t>
       </w:r>
     </w:p>
     <w:p>
@@ -1506,7 +1504,7 @@
       <w:r>
         <w:t>3.2 Quyết định zone</w:t>
         <w:tab/>
-        <w:t>11</w:t>
+        <w:t>12</w:t>
       </w:r>
     </w:p>
     <w:p>
@@ -1516,7 +1514,7 @@
       <w:r>
         <w:t>3.2.1 Chọn Scanner mạnh nhất</w:t>
         <w:tab/>
-        <w:t>11</w:t>
+        <w:t>13</w:t>
       </w:r>
     </w:p>
     <w:p>
@@ -1526,7 +1524,7 @@
       <w:r>
         <w:t>3.2.2 Hysteresis chống flapping</w:t>
         <w:tab/>
-        <w:t>11</w:t>
+        <w:t>13</w:t>
       </w:r>
     </w:p>
     <w:p>
@@ -1536,7 +1534,7 @@
       <w:r>
         <w:t>3.2.3 Debounce leaky-bucket</w:t>
         <w:tab/>
-        <w:t>12</w:t>
+        <w:t>13</w:t>
       </w:r>
     </w:p>
     <w:p>
@@ -1546,7 +1544,7 @@
       <w:r>
         <w:t>3.3 MQTT và TLS</w:t>
         <w:tab/>
-        <w:t>12</w:t>
+        <w:t>13</w:t>
       </w:r>
     </w:p>
     <w:p>
@@ -1556,7 +1554,7 @@
       <w:r>
         <w:t>3.3.1 MQTT</w:t>
         <w:tab/>
-        <w:t>12</w:t>
+        <w:t>13</w:t>
       </w:r>
     </w:p>
     <w:p>
@@ -1566,7 +1564,7 @@
       <w:r>
         <w:t>3.3.2 TLS</w:t>
         <w:tab/>
-        <w:t>13</w:t>
+        <w:t>14</w:t>
       </w:r>
     </w:p>
     <w:p>
@@ -1576,7 +1574,7 @@
       <w:r>
         <w:t>3.4 Giao thức ThingsBoard Gateway API</w:t>
         <w:tab/>
-        <w:t>16</w:t>
+        <w:t>17</w:t>
       </w:r>
     </w:p>
     <w:p>
@@ -1586,7 +1584,7 @@
       <w:r>
         <w:t>3.4.1 Kiến trúc Gateway/Sub-device</w:t>
         <w:tab/>
-        <w:t>16</w:t>
+        <w:t>17</w:t>
       </w:r>
     </w:p>
     <w:p>
@@ -1596,7 +1594,7 @@
       <w:r>
         <w:t>3.4.2 Các topic MQTT</w:t>
         <w:tab/>
-        <w:t>16</w:t>
+        <w:t>17</w:t>
       </w:r>
     </w:p>
     <w:p>
@@ -1606,7 +1604,7 @@
       <w:r>
         <w:t>3.4.3 Rule Chain Engine</w:t>
         <w:tab/>
-        <w:t>16</w:t>
+        <w:t>17</w:t>
       </w:r>
     </w:p>
     <w:p>
@@ -1616,7 +1614,7 @@
       <w:r>
         <w:t>CHƯƠNG 4: TRIỂN KHAI HỆ THỐNG</w:t>
         <w:tab/>
-        <w:t>18</w:t>
+        <w:t>19</w:t>
       </w:r>
     </w:p>
     <w:p>
@@ -1626,7 +1624,7 @@
       <w:r>
         <w:t>4.1 Kiến trúc tổng thể</w:t>
         <w:tab/>
-        <w:t>18</w:t>
+        <w:t>19</w:t>
       </w:r>
     </w:p>
     <w:p>
@@ -1636,7 +1634,7 @@
       <w:r>
         <w:t>4.2 Firmware Relay và BLE Mesh dùng chung</w:t>
         <w:tab/>
-        <w:t>18</w:t>
+        <w:t>19</w:t>
       </w:r>
     </w:p>
     <w:p>
@@ -1646,7 +1644,7 @@
       <w:r>
         <w:t>4.2.1 Relay feature ở Network Layer</w:t>
         <w:tab/>
-        <w:t>19</w:t>
+        <w:t>20</w:t>
       </w:r>
     </w:p>
     <w:p>
@@ -1656,7 +1654,7 @@
       <w:r>
         <w:t>4.2.2 Bind AppKey cho vendor model dùng chung</w:t>
         <w:tab/>
-        <w:t>19</w:t>
+        <w:t>20</w:t>
       </w:r>
     </w:p>
     <w:p>
@@ -1666,7 +1664,7 @@
       <w:r>
         <w:t>4.3 Firmware Gateway</w:t>
         <w:tab/>
-        <w:t>19</w:t>
+        <w:t>20</w:t>
       </w:r>
     </w:p>
     <w:p>
@@ -1676,7 +1674,7 @@
       <w:r>
         <w:t>4.3.1 Provisioner AUTO mode</w:t>
         <w:tab/>
-        <w:t>19</w:t>
+        <w:t>20</w:t>
       </w:r>
     </w:p>
     <w:p>
@@ -1686,7 +1684,7 @@
       <w:r>
         <w:t>4.3.2 MQTT worker và hàng đợi Tag report</w:t>
         <w:tab/>
-        <w:t>20</w:t>
+        <w:t>21</w:t>
       </w:r>
     </w:p>
     <w:p>
@@ -1696,7 +1694,7 @@
       <w:r>
         <w:t>4.3.3 Data watchdog và tự phục hồi</w:t>
         <w:tab/>
-        <w:t>21</w:t>
+        <w:t>22</w:t>
       </w:r>
     </w:p>
     <w:p>
@@ -1706,7 +1704,7 @@
       <w:r>
         <w:t>4.3.4 Kết nối Wi-Fi, MQTTS và xác thực ThingsBoard</w:t>
         <w:tab/>
-        <w:t>21</w:t>
+        <w:t>22</w:t>
       </w:r>
     </w:p>
     <w:p>
@@ -1716,7 +1714,7 @@
       <w:r>
         <w:t>4.3.5 Phát hiện out_of_range và phục hồi sau mất MQTT</w:t>
         <w:tab/>
-        <w:t>21</w:t>
+        <w:t>22</w:t>
       </w:r>
     </w:p>
     <w:p>
@@ -1726,7 +1724,7 @@
       <w:r>
         <w:t>4.3.6 Giới hạn và chính sách mất dữ liệu</w:t>
         <w:tab/>
-        <w:t>22</w:t>
+        <w:t>23</w:t>
       </w:r>
     </w:p>
     <w:p>
@@ -1736,7 +1734,7 @@
       <w:r>
         <w:t>4.4 Server-side ThingsBoard</w:t>
         <w:tab/>
-        <w:t>22</w:t>
+        <w:t>23</w:t>
       </w:r>
     </w:p>
     <w:p>
@@ -1746,7 +1744,7 @@
       <w:r>
         <w:t>4.4.1 Rule Chain ble_tag_zone_detection</w:t>
         <w:tab/>
-        <w:t>22</w:t>
+        <w:t>23</w:t>
       </w:r>
     </w:p>
     <w:p>
@@ -1756,7 +1754,7 @@
       <w:r>
         <w:t>4.4.2 Dashboard Indoor Tracking</w:t>
         <w:tab/>
-        <w:t>25</w:t>
+        <w:t>26</w:t>
       </w:r>
     </w:p>
     <w:p>
@@ -1766,7 +1764,7 @@
       <w:r>
         <w:t>4.4.3 Attributes, timeseries và định danh child device</w:t>
         <w:tab/>
-        <w:t>25</w:t>
+        <w:t>26</w:t>
       </w:r>
     </w:p>
     <w:p>
@@ -1776,7 +1774,7 @@
       <w:r>
         <w:t>4.5 Hỗ trợ nhiều Tag ở Gateway và ThingsBoard</w:t>
         <w:tab/>
-        <w:t>26</w:t>
+        <w:t>27</w:t>
       </w:r>
     </w:p>
     <w:p>
@@ -1786,7 +1784,7 @@
       <w:r>
         <w:t>4.5.1 Quản lý trạng thái từng Tag tại Gateway</w:t>
         <w:tab/>
-        <w:t>26</w:t>
+        <w:t>27</w:t>
       </w:r>
     </w:p>
     <w:p>
@@ -1796,7 +1794,7 @@
       <w:r>
         <w:t>4.5.2 Tách child device và state trong Rule Chain</w:t>
         <w:tab/>
-        <w:t>26</w:t>
+        <w:t>27</w:t>
       </w:r>
     </w:p>
     <w:p>
@@ -1806,7 +1804,7 @@
       <w:r>
         <w:t>4.5.3 Dashboard tổng quan–chi tiết</w:t>
         <w:tab/>
-        <w:t>26</w:t>
+        <w:t>27</w:t>
       </w:r>
     </w:p>
     <w:p>
@@ -1814,9 +1812,9 @@
         <w:pStyle w:val="TOC2"/>
       </w:pPr>
       <w:r>
-        <w:t>4.6 Cấu trúc source code phần B</w:t>
+        <w:t>4.6 Cấu trúc source code Gateway và ThingsBoard</w:t>
         <w:tab/>
-        <w:t>27</w:t>
+        <w:t>28</w:t>
       </w:r>
     </w:p>
     <w:p>
@@ -1824,9 +1822,9 @@
         <w:pStyle w:val="TOC3"/>
       </w:pPr>
       <w:r>
-        <w:t>4.6.1 Firmware Gateway và các component phần B</w:t>
+        <w:t>4.6.1 Firmware Gateway và các component liên quan</w:t>
         <w:tab/>
-        <w:t>27</w:t>
+        <w:t>28</w:t>
       </w:r>
     </w:p>
     <w:p>
@@ -1836,7 +1834,7 @@
       <w:r>
         <w:t>4.6.2 Giao diện với Scanner và Relay dùng chung</w:t>
         <w:tab/>
-        <w:t>27</w:t>
+        <w:t>28</w:t>
       </w:r>
     </w:p>
     <w:p>
@@ -1846,7 +1844,7 @@
       <w:r>
         <w:t>4.6.3 ThingsBoard</w:t>
         <w:tab/>
-        <w:t>27</w:t>
+        <w:t>28</w:t>
       </w:r>
     </w:p>
     <w:p>
@@ -1856,7 +1854,7 @@
       <w:r>
         <w:t>CHƯƠNG 5: KẾT QUẢ THỰC NGHIỆM</w:t>
         <w:tab/>
-        <w:t>29</w:t>
+        <w:t>30</w:t>
       </w:r>
     </w:p>
     <w:p>
@@ -1866,7 +1864,7 @@
       <w:r>
         <w:t>5.1 Thiết lập đo của kiến trúc hiện tại</w:t>
         <w:tab/>
-        <w:t>29</w:t>
+        <w:t>30</w:t>
       </w:r>
     </w:p>
     <w:p>
@@ -1876,7 +1874,7 @@
       <w:r>
         <w:t>5.1.1 Cấu hình hệ thống và biến quan sát</w:t>
         <w:tab/>
-        <w:t>29</w:t>
+        <w:t>30</w:t>
       </w:r>
     </w:p>
     <w:p>
@@ -1886,7 +1884,7 @@
       <w:r>
         <w:t>5.1.2 Bố trí ba phòng và ba Scanner</w:t>
         <w:tab/>
-        <w:t>29</w:t>
+        <w:t>30</w:t>
       </w:r>
     </w:p>
     <w:p>
@@ -1896,7 +1894,7 @@
       <w:r>
         <w:t>5.1.3 Nguồn dữ liệu và quy trình Grace 30 giây</w:t>
         <w:tab/>
-        <w:t>30</w:t>
+        <w:t>31</w:t>
       </w:r>
     </w:p>
     <w:p>
@@ -1906,7 +1904,7 @@
       <w:r>
         <w:t>5.1.4 Quy tắc tạo tập đánh giá</w:t>
         <w:tab/>
-        <w:t>31</w:t>
+        <w:t>32</w:t>
       </w:r>
     </w:p>
     <w:p>
@@ -1916,7 +1914,7 @@
       <w:r>
         <w:t>5.2 Tập ground truth của cấu hình 3 Scanner</w:t>
         <w:tab/>
-        <w:t>32</w:t>
+        <w:t>33</w:t>
       </w:r>
     </w:p>
     <w:p>
@@ -1926,7 +1924,7 @@
       <w:r>
         <w:t>5.2.1 Phạm vi bản ghi và tách phiên đo</w:t>
         <w:tab/>
-        <w:t>32</w:t>
+        <w:t>33</w:t>
       </w:r>
     </w:p>
     <w:p>
@@ -1936,7 +1934,7 @@
       <w:r>
         <w:t>5.2.2 Phân bố thời gian và telemetry theo phòng</w:t>
         <w:tab/>
-        <w:t>32</w:t>
+        <w:t>33</w:t>
       </w:r>
     </w:p>
     <w:p>
@@ -1946,7 +1944,7 @@
       <w:r>
         <w:t>5.2.3 Giá trị sử dụng và giới hạn của tập ground truth</w:t>
         <w:tab/>
-        <w:t>33</w:t>
+        <w:t>34</w:t>
       </w:r>
     </w:p>
     <w:p>
@@ -1956,7 +1954,7 @@
       <w:r>
         <w:t>5.3 Đánh giá đặc trưng RSSI theo phòng</w:t>
         <w:tab/>
-        <w:t>33</w:t>
+        <w:t>34</w:t>
       </w:r>
     </w:p>
     <w:p>
@@ -1966,7 +1964,7 @@
       <w:r>
         <w:t>5.3.1 Cách thu thập và xử lý dữ liệu RSSI</w:t>
         <w:tab/>
-        <w:t>33</w:t>
+        <w:t>34</w:t>
       </w:r>
     </w:p>
     <w:p>
@@ -1976,7 +1974,7 @@
       <w:r>
         <w:t>5.4 Thời gian khởi động và đưa hệ thống vào hoạt động</w:t>
         <w:tab/>
-        <w:t>36</w:t>
+        <w:t>37</w:t>
       </w:r>
     </w:p>
     <w:p>
@@ -2006,7 +2004,7 @@
       <w:r>
         <w:t>5.5.2 Kết quả định lượng</w:t>
         <w:tab/>
-        <w:t>37</w:t>
+        <w:t>38</w:t>
       </w:r>
     </w:p>
     <w:p>
@@ -2016,7 +2014,7 @@
       <w:r>
         <w:t>5.5.3 Phân tích sai số và giới hạn</w:t>
         <w:tab/>
-        <w:t>39</w:t>
+        <w:t>40</w:t>
       </w:r>
     </w:p>
     <w:p>
@@ -2026,7 +2024,7 @@
       <w:r>
         <w:t>5.6 Độ trễ chuyển phòng và flapping</w:t>
         <w:tab/>
-        <w:t>40</w:t>
+        <w:t>41</w:t>
       </w:r>
     </w:p>
     <w:p>
@@ -2036,7 +2034,7 @@
       <w:r>
         <w:t>5.6.1 Phép thử độc lập tại biên phòng</w:t>
         <w:tab/>
-        <w:t>40</w:t>
+        <w:t>41</w:t>
       </w:r>
     </w:p>
     <w:p>
@@ -2046,7 +2044,7 @@
       <w:r>
         <w:t>5.6.2 Độ trễ chuyển phòng trong ba phiên</w:t>
         <w:tab/>
-        <w:t>41</w:t>
+        <w:t>42</w:t>
       </w:r>
     </w:p>
     <w:p>
@@ -2056,7 +2054,7 @@
       <w:r>
         <w:t>5.6.3 Flapping trong ba phiên ground truth</w:t>
         <w:tab/>
-        <w:t>42</w:t>
+        <w:t>43</w:t>
       </w:r>
     </w:p>
     <w:p>
@@ -2096,7 +2094,7 @@
       <w:r>
         <w:t>5.7.3 Rút Relay</w:t>
         <w:tab/>
-        <w:t>43</w:t>
+        <w:t>44</w:t>
       </w:r>
     </w:p>
     <w:p>
@@ -2106,7 +2104,7 @@
       <w:r>
         <w:t>5.8 OTA</w:t>
         <w:tab/>
-        <w:t>43</w:t>
+        <w:t>44</w:t>
       </w:r>
     </w:p>
     <w:p>
@@ -2116,7 +2114,7 @@
       <w:r>
         <w:t>5.8.1 Thời gian OTA</w:t>
         <w:tab/>
-        <w:t>43</w:t>
+        <w:t>44</w:t>
       </w:r>
     </w:p>
     <w:p>
@@ -2156,7 +2154,7 @@
       <w:r>
         <w:t>5.9 Bảo mật beacon</w:t>
         <w:tab/>
-        <w:t>44</w:t>
+        <w:t>45</w:t>
       </w:r>
     </w:p>
     <w:p>
@@ -2166,7 +2164,7 @@
       <w:r>
         <w:t>5.9.1 Giả beacon bằng smartphone</w:t>
         <w:tab/>
-        <w:t>44</w:t>
+        <w:t>45</w:t>
       </w:r>
     </w:p>
     <w:p>
@@ -2176,7 +2174,7 @@
       <w:r>
         <w:t>5.9.2 Replay attack</w:t>
         <w:tab/>
-        <w:t>44</w:t>
+        <w:t>45</w:t>
       </w:r>
     </w:p>
     <w:p>
@@ -2216,7 +2214,7 @@
       <w:r>
         <w:t>5.10.2 Hạn chế</w:t>
         <w:tab/>
-        <w:t>45</w:t>
+        <w:t>46</w:t>
       </w:r>
     </w:p>
     <w:p>
@@ -2236,7 +2234,7 @@
       <w:r>
         <w:t>CHƯƠNG 6: KẾT LUẬN</w:t>
         <w:tab/>
-        <w:t>47</w:t>
+        <w:t>48</w:t>
       </w:r>
     </w:p>
     <w:p>
@@ -2246,7 +2244,7 @@
       <w:r>
         <w:t>6.1 Tóm tắt đóng góp</w:t>
         <w:tab/>
-        <w:t>47</w:t>
+        <w:t>48</w:t>
       </w:r>
     </w:p>
     <w:p>
@@ -2256,7 +2254,7 @@
       <w:r>
         <w:t>6.2 Hạn chế</w:t>
         <w:tab/>
-        <w:t>48</w:t>
+        <w:t>49</w:t>
       </w:r>
     </w:p>
     <w:p>
@@ -2286,7 +2284,7 @@
       <w:r>
         <w:t>6.3.2 Chống nhiễu 2.4 GHz</w:t>
         <w:tab/>
-        <w:t>49</w:t>
+        <w:t>50</w:t>
       </w:r>
     </w:p>
     <w:p>
@@ -2296,7 +2294,7 @@
       <w:r>
         <w:t>TÀI LIỆU THAM KHẢO</w:t>
         <w:tab/>
-        <w:t>49</w:t>
+        <w:t>51</w:t>
       </w:r>
     </w:p>
     <w:p>
@@ -2306,12 +2304,13 @@
       <w:r>
         <w:t>PHỤ LỤC A: OPCODE VÀ MÃ ĐỊNH DANH BLUETOOTH</w:t>
         <w:tab/>
-        <w:t>50</w:t>
+        <w:t>52</w:t>
       </w:r>
     </w:p>
     <w:p>
       <w:pPr>
         <w:pStyle w:val="Heading1"/>
+        <w:pageBreakBefore/>
         <w:spacing w:before="240" w:after="120" w:line="240" w:lineRule="auto"/>
         <w:rPr>
           <w:rFonts w:ascii="Times New Roman" w:hAnsi="Times New Roman" w:cs="Times New Roman"/>
@@ -6543,6 +6542,7 @@
     <w:p>
       <w:pPr>
         <w:pStyle w:val="Heading1"/>
+        <w:pageBreakBefore/>
         <w:spacing w:before="240" w:after="120" w:line="240" w:lineRule="auto"/>
         <w:rPr>
           <w:rFonts w:ascii="Times New Roman" w:hAnsi="Times New Roman" w:cs="Times New Roman"/>
@@ -6570,7 +6570,7 @@
       <w:r>
         <w:t>Hình 1. Mô hình mô tả hoạt động của TLS</w:t>
         <w:tab/>
-        <w:t>14</w:t>
+        <w:t>15</w:t>
       </w:r>
     </w:p>
     <w:p>
@@ -6580,7 +6580,7 @@
       <w:r>
         <w:t>Hình 2. Chuỗi thiết lập kênh MQTTS/TLS giữa Gateway và ThingsBoard</w:t>
         <w:tab/>
-        <w:t>15</w:t>
+        <w:t>16</w:t>
       </w:r>
     </w:p>
     <w:p>
@@ -6590,7 +6590,7 @@
       <w:r>
         <w:t>Hình 3. Mô hình kiến trúc hệ thống định vị theo phòng ở phiên bản hiện tại</w:t>
         <w:tab/>
-        <w:t>18</w:t>
+        <w:t>19</w:t>
       </w:r>
     </w:p>
     <w:p>
@@ -6600,7 +6600,7 @@
       <w:r>
         <w:t>Hình 4. Luồng Gateway tự động provision và cấu hình Scanner/Relay</w:t>
         <w:tab/>
-        <w:t>20</w:t>
+        <w:t>21</w:t>
       </w:r>
     </w:p>
     <w:p>
@@ -6610,7 +6610,7 @@
       <w:r>
         <w:t>Hình 5. Luồng xử lý dữ liệu và quyết định phòng từ Tag đến ThingsBoard</w:t>
         <w:tab/>
-        <w:t>24</w:t>
+        <w:t>25</w:t>
       </w:r>
     </w:p>
     <w:p>
@@ -6620,7 +6620,7 @@
       <w:r>
         <w:t>Hình 6. Dashboard tổng quan nhiều Tag và thông tin chi tiết của Tag được chọn</w:t>
         <w:tab/>
-        <w:t>25</w:t>
+        <w:t>26</w:t>
       </w:r>
     </w:p>
     <w:p>
@@ -6630,7 +6630,7 @@
       <w:r>
         <w:t>Hình 7. Widget hiển thị lịch sử phòng được hệ thống dự đoán theo thời gian</w:t>
         <w:tab/>
-        <w:t>26</w:t>
+        <w:t>27</w:t>
       </w:r>
     </w:p>
     <w:p>
@@ -6640,7 +6640,7 @@
       <w:r>
         <w:t>Hình 8. Trạng thái kết nối của Gateway, Scanner và Tag trên ThingsBoard</w:t>
         <w:tab/>
-        <w:t>27</w:t>
+        <w:t>28</w:t>
       </w:r>
     </w:p>
     <w:p>
@@ -6650,7 +6650,7 @@
       <w:r>
         <w:t>Hình 9. Sơ đồ mặt bằng thí nghiệm</w:t>
         <w:tab/>
-        <w:t>29</w:t>
+        <w:t>30</w:t>
       </w:r>
     </w:p>
     <w:p>
@@ -6660,7 +6660,7 @@
       <w:r>
         <w:t>Hình 10. Quy trình ghi ground truth và tạo cửa sổ đánh giá sau Grace 30 giây</w:t>
         <w:tab/>
-        <w:t>31</w:t>
+        <w:t>32</w:t>
       </w:r>
     </w:p>
     <w:p>
@@ -6670,7 +6670,7 @@
       <w:r>
         <w:t>Hình 11. RSSI của ba scanner khi Tag được đặt cố định tại Phòng 2</w:t>
         <w:tab/>
-        <w:t>35</w:t>
+        <w:t>36</w:t>
       </w:r>
     </w:p>
     <w:p>
@@ -6680,7 +6680,7 @@
       <w:r>
         <w:t>Hình 12. RSSI của ba scanner khi Tag được đặt cố định tại Phòng 3</w:t>
         <w:tab/>
-        <w:t>35</w:t>
+        <w:t>36</w:t>
       </w:r>
     </w:p>
     <w:p>
@@ -6706,6 +6706,7 @@
     <w:p>
       <w:pPr>
         <w:pStyle w:val="Heading1"/>
+        <w:pageBreakBefore/>
         <w:spacing w:after="120" w:line="240" w:lineRule="auto"/>
         <w:rPr>
           <w:rFonts w:ascii="Times New Roman" w:hAnsi="Times New Roman" w:cs="Times New Roman"/>
@@ -6748,7 +6749,7 @@
       <w:r>
         <w:t>Bảng 2. So sánh các giải pháp indoor positioning thương mại</w:t>
         <w:tab/>
-        <w:t>8</w:t>
+        <w:t>9</w:t>
       </w:r>
     </w:p>
     <w:p>
@@ -6758,7 +6759,7 @@
       <w:r>
         <w:t>Bảng 3. Các opcode Vendor Model dùng trong đề tài</w:t>
         <w:tab/>
-        <w:t>11</w:t>
+        <w:t>12</w:t>
       </w:r>
     </w:p>
     <w:p>
@@ -6768,7 +6769,7 @@
       <w:r>
         <w:t>Bảng 4. Các topic MQTT dùng trong ThingsBoard Gateway API</w:t>
         <w:tab/>
-        <w:t>16</w:t>
+        <w:t>17</w:t>
       </w:r>
     </w:p>
     <w:p>
@@ -6778,7 +6779,7 @@
       <w:r>
         <w:t>Bảng 5. Bố trí thí nghiệm của cấu hình 3 phòng–3 Scanner</w:t>
         <w:tab/>
-        <w:t>30</w:t>
+        <w:t>31</w:t>
       </w:r>
     </w:p>
     <w:p>
@@ -6788,7 +6789,7 @@
       <w:r>
         <w:t>Bảng 6. Các phiên ground truth được sử dụng</w:t>
         <w:tab/>
-        <w:t>32</w:t>
+        <w:t>33</w:t>
       </w:r>
     </w:p>
     <w:p>
@@ -6798,7 +6799,7 @@
       <w:r>
         <w:t>Bảng 7. Phân bố mẫu đánh giá và coverage theo phòng của ba phiên</w:t>
         <w:tab/>
-        <w:t>32</w:t>
+        <w:t>33</w:t>
       </w:r>
     </w:p>
     <w:p>
@@ -6808,7 +6809,7 @@
       <w:r>
         <w:t>Bảng 8. Thống kê RSSI của ba scanner khi Tag được đặt cố định theo phòng</w:t>
         <w:tab/>
-        <w:t>34</w:t>
+        <w:t>35</w:t>
       </w:r>
     </w:p>
     <w:p>
@@ -6818,7 +6819,7 @@
       <w:r>
         <w:t>Bảng 9. Thời gian khởi động và đưa hệ thống vào hoạt động</w:t>
         <w:tab/>
-        <w:t>36</w:t>
+        <w:t>37</w:t>
       </w:r>
     </w:p>
     <w:p>
@@ -6828,7 +6829,7 @@
       <w:r>
         <w:t>Bảng 10. Tóm tắt kết quả định vị của Phiên 1</w:t>
         <w:tab/>
-        <w:t>37</w:t>
+        <w:t>38</w:t>
       </w:r>
     </w:p>
     <w:p>
@@ -6848,7 +6849,7 @@
       <w:r>
         <w:t>Bảng 12. Tóm tắt kết quả định vị của Phiên 3</w:t>
         <w:tab/>
-        <w:t>38</w:t>
+        <w:t>39</w:t>
       </w:r>
     </w:p>
     <w:p>
@@ -6858,7 +6859,7 @@
       <w:r>
         <w:t>Bảng 13. Ma trận nhầm lẫn gộp của ba phiên đo</w:t>
         <w:tab/>
-        <w:t>39</w:t>
+        <w:t>40</w:t>
       </w:r>
     </w:p>
     <w:p>
@@ -6868,7 +6869,7 @@
       <w:r>
         <w:t>Bảng 14. Precision, recall và F1-score theo từng phòng</w:t>
         <w:tab/>
-        <w:t>39</w:t>
+        <w:t>40</w:t>
       </w:r>
     </w:p>
     <w:p>
@@ -6878,7 +6879,7 @@
       <w:r>
         <w:t>Bảng 15. Số lần flap trong 5 phút tại biên phòng</w:t>
         <w:tab/>
-        <w:t>40</w:t>
+        <w:t>41</w:t>
       </w:r>
     </w:p>
     <w:p>
@@ -6888,7 +6889,7 @@
       <w:r>
         <w:t>Bảng 16. Thống kê độ trễ chuyển phòng của ba phiên đo</w:t>
         <w:tab/>
-        <w:t>41</w:t>
+        <w:t>42</w:t>
       </w:r>
     </w:p>
     <w:p>
@@ -6898,7 +6899,7 @@
       <w:r>
         <w:t>Bảng 17. Kết quả flapping trong 35 cửa sổ sau Grace</w:t>
         <w:tab/>
-        <w:t>2</w:t>
+        <w:t>43</w:t>
       </w:r>
     </w:p>
     <w:p>
@@ -6908,7 +6909,7 @@
       <w:r>
         <w:t>Bảng 18. Thời gian OTA (giây)</w:t>
         <w:tab/>
-        <w:t>2</w:t>
+        <w:t>44</w:t>
       </w:r>
     </w:p>
     <w:p>
@@ -6918,7 +6919,7 @@
       <w:r>
         <w:t>Bảng 19. So sánh định tính với một số giải pháp thương mại</w:t>
         <w:tab/>
-        <w:t>2</w:t>
+        <w:t>46</w:t>
       </w:r>
     </w:p>
     <w:p>
@@ -6928,7 +6929,7 @@
       <w:r>
         <w:t>Bảng 20. Các vendor opcode của hệ thống</w:t>
         <w:tab/>
-        <w:t>2</w:t>
+        <w:t>52</w:t>
       </w:r>
     </w:p>
     <w:p>
@@ -6938,12 +6939,13 @@
       <w:r>
         <w:t>Bảng 21. Các mã định danh Bluetooth dùng trong hệ thống</w:t>
         <w:tab/>
-        <w:t>2</w:t>
+        <w:t>52</w:t>
       </w:r>
     </w:p>
     <w:p>
       <w:pPr>
         <w:pStyle w:val="Heading1"/>
+        <w:pageBreakBefore/>
         <w:spacing w:after="120" w:line="240" w:lineRule="auto"/>
         <w:rPr>
           <w:rFonts w:ascii="Times New Roman" w:hAnsi="Times New Roman" w:cs="Times New Roman"/>
@@ -7084,7 +7086,7 @@
         <w:ind w:firstLine="567"/>
       </w:pPr>
       <w:r>
-        <w:t>Trong phạm vi phần B, tài liệu đặt các mục tiêu sau:</w:t>
+        <w:t>Trong phạm vi nghiên cứu, đề tài đặt các mục tiêu sau:</w:t>
       </w:r>
     </w:p>
     <w:p>
@@ -7209,19 +7211,19 @@
         <w:pStyle w:val="Heading3"/>
       </w:pPr>
       <w:r>
-        <w:t>1.3.1 Phạm vi nội dung phần B</w:t>
+        <w:t>1.3.1 Phạm vi thu nhận và xử lý dữ liệu</w:t>
       </w:r>
     </w:p>
     <w:p>
       <w:pPr/>
       <w:r>
-        <w:t>Phần B tập trung vào tuyến xử lý từ Gateway đến nền tảng ThingsBoard. Kiến trúc tổng thể, BLE Mesh và kết quả thực nghiệm là nội dung dùng chung của hai thành viên nên được giữ nguyên trong tài liệu.</w:t>
+        <w:t>Đề tài tập trung xây dựng tuyến thu nhận và xử lý dữ liệu từ mạng BLE Mesh, qua Gateway, đến máy chủ IoT ThingsBoard.</w:t>
       </w:r>
     </w:p>
     <w:p>
       <w:pPr/>
       <w:r>
-        <w:t>Các nội dung do phần B triển khai và trình bày gồm:</w:t>
+        <w:t>Các nội dung triển khai và trình bày gồm:</w:t>
       </w:r>
     </w:p>
     <w:p>
@@ -7365,7 +7367,7 @@
         <w:ind w:firstLine="567"/>
       </w:pPr>
       <w:r>
-        <w:t>Phần B cố định ESP-IDF v6.0.1 để môi trường biên dịch, FreeRTOS, Wi-Fi, TLS và API BLE Mesh nhất quán trong quá trình triển khai Gateway.</w:t>
+        <w:t>Đề tài sử dụng ESP-IDF v6.0.1 để môi trường biên dịch, FreeRTOS, Wi-Fi, TLS và API BLE Mesh nhất quán trong quá trình triển khai Gateway.</w:t>
       </w:r>
     </w:p>
     <w:p>
@@ -7894,7 +7896,7 @@
         <w:pStyle w:val="ListBullet"/>
       </w:pPr>
       <w:r>
-        <w:t>Chương 3 – Cơ sở lý thuyết phần B: BLE Mesh dùng chung; thuật toán quyết định zone; MQTT/TLS và ThingsBoard Gateway API.</w:t>
+        <w:t>Chương 3 – Cơ sở lý thuyết: BLE Mesh; thuật toán quyết định zone; MQTT/TLS và ThingsBoard Gateway API.</w:t>
       </w:r>
     </w:p>
     <w:p>
@@ -7902,7 +7904,7 @@
         <w:pStyle w:val="ListBullet"/>
       </w:pPr>
       <w:r>
-        <w:t>Chương 4 – Triển khai phần B: Giữ nguyên kiến trúc tổng thể và Relay/BLE Mesh dùng chung; đi sâu vào Gateway, hàng đợi FreeRTOS, Wi-Fi/MQTTS, ThingsBoard Gateway API, Rule Chain, dashboard nhiều Tag và cơ chế giám sát–khôi phục kết nối.</w:t>
+        <w:t>Chương 4 – Triển khai hệ thống: Trình bày kiến trúc tổng thể, Relay/BLE Mesh, Gateway, hàng đợi FreeRTOS, Wi-Fi/MQTTS, ThingsBoard Gateway API, Rule Chain, dashboard nhiều Tag và cơ chế giám sát–khôi phục kết nối.</w:t>
       </w:r>
     </w:p>
     <w:p>
@@ -7930,13 +7932,9 @@
       </w:r>
     </w:p>
     <w:p>
-      <w:r>
-        <w:br w:type="page"/>
-      </w:r>
-    </w:p>
-    <w:p>
       <w:pPr>
         <w:pStyle w:val="Heading1"/>
+        <w:pageBreakBefore/>
         <w:spacing w:after="120" w:line="240" w:lineRule="auto"/>
         <w:rPr>
           <w:rFonts w:ascii="Times New Roman" w:hAnsi="Times New Roman" w:cs="Times New Roman"/>
@@ -8949,12 +8947,13 @@
     <w:p>
       <w:pPr/>
       <w:r>
-        <w:t>Khoảng trống phần B tập trung xử lý là một Gateway tự host có ranh giới trách nhiệm rõ ràng: firmware chỉ thu nhận và chuyển telemetry; ThingsBoard chịu trách nhiệm xác định phòng, lưu trạng thái và hiển thị. Hệ thống đồng thời cần xử lý nhiều Tag độc lập và phục hồi hợp lý khi BLE Mesh, Wi-Fi hoặc MQTT gián đoạn.</w:t>
+        <w:t>Khoảng trống đề tài tập trung xử lý là một Gateway tự host có ranh giới trách nhiệm rõ ràng: firmware chỉ thu nhận và chuyển telemetry; ThingsBoard chịu trách nhiệm xác định phòng, lưu trạng thái và hiển thị. Hệ thống đồng thời cần xử lý nhiều Tag độc lập và phục hồi hợp lý khi BLE Mesh, Wi-Fi hoặc MQTT gián đoạn.</w:t>
       </w:r>
     </w:p>
     <w:p>
       <w:pPr>
         <w:pStyle w:val="Heading1"/>
+        <w:pageBreakBefore/>
         <w:spacing w:after="120" w:line="240" w:lineRule="auto"/>
         <w:rPr>
           <w:rFonts w:ascii="Times New Roman" w:hAnsi="Times New Roman" w:cs="Times New Roman"/>
@@ -10572,13 +10571,9 @@
       </w:r>
     </w:p>
     <w:p>
-      <w:r>
-        <w:br w:type="page"/>
-      </w:r>
-    </w:p>
-    <w:p>
       <w:pPr>
         <w:pStyle w:val="Heading1"/>
+        <w:pageBreakBefore/>
         <w:spacing w:after="120" w:line="240" w:lineRule="auto"/>
         <w:rPr>
           <w:rFonts w:ascii="Times New Roman" w:hAnsi="Times New Roman" w:cs="Times New Roman"/>
@@ -10817,7 +10812,7 @@
         <w:ind w:firstLine="567"/>
       </w:pPr>
       <w:r>
-        <w:t>Gateway (ESP32-S3) là cầu nối giữa mạng BLE Mesh và ThingsBoard: vừa provision các node, vừa nhận TAG_STATUS, tách xử lý bằng hàng đợi FreeRTOS và truyền telemetry qua MQTTS. Đây là khối triển khai trung tâm của phần B.</w:t>
+        <w:t>Gateway (ESP32-S3) là cầu nối giữa mạng BLE Mesh và ThingsBoard: vừa provision các node, vừa nhận TAG_STATUS, tách xử lý bằng hàng đợi FreeRTOS và truyền telemetry qua MQTTS. Đây là khối trung tâm của tuyến thu nhận và chuyển tiếp dữ liệu.</w:t>
       </w:r>
     </w:p>
     <w:p>
@@ -11409,7 +11404,7 @@
         <w:ind w:firstLine="567"/>
       </w:pPr>
       <w:r>
-        <w:t>Luồng phần B không gắn telemetry vào một Tag cố định. Gateway, ThingsBoard Gateway API, Rule Chain và Dashboard đều giữ định danh Tag xuyên suốt để các Tag được xử lý độc lập.</w:t>
+        <w:t>Luồng xử lý không gắn telemetry vào một Tag cố định. Gateway, ThingsBoard Gateway API, Rule Chain và Dashboard đều giữ định danh Tag xuyên suốt để các Tag được xử lý độc lập.</w:t>
       </w:r>
     </w:p>
     <w:p>
@@ -11481,7 +11476,7 @@
         </w:rPr>
       </w:pPr>
       <w:r>
-        <w:t>4.6 Cấu trúc source code phần B</w:t>
+        <w:t>4.6 Cấu trúc source code Gateway và ThingsBoard</w:t>
       </w:r>
     </w:p>
     <w:p>
@@ -11501,7 +11496,7 @@
         </w:rPr>
       </w:pPr>
       <w:r>
-        <w:t>4.6.1 Firmware Gateway và các component phần B</w:t>
+        <w:t>4.6.1 Firmware Gateway và các component liên quan</w:t>
       </w:r>
     </w:p>
     <w:p>
@@ -11509,7 +11504,7 @@
         <w:ind w:firstLine="567"/>
       </w:pPr>
       <w:r>
-        <w:t>Phần B tập trung tại apps/gateway. bmt_mesh nhận BLE Mesh message, provision và ping node; bmt_wifi quản lý Wi-Fi STA; bmt_mqtt triển khai queue, worker và MQTTS; bmt_thingsboard đóng gói Gateway API, child device và out_of_range; bmt_zone giữ bảng tối đa 16 Tag; bmt_watchdog giám sát traffic mesh; bmt_node_table persist tối đa 10 node trong NVS. Firmware Tag/Scanner chỉ là đầu vào của giao diện tích hợp.</w:t>
+        <w:t>Mã nguồn Gateway tập trung tại apps/gateway. bmt_mesh nhận BLE Mesh message, provision và ping node; bmt_wifi quản lý Wi-Fi STA; bmt_mqtt triển khai queue, worker và MQTTS; bmt_thingsboard đóng gói Gateway API, child device và out_of_range; bmt_zone giữ bảng tối đa 16 Tag; bmt_watchdog giám sát traffic mesh; bmt_node_table lưu tối đa 10 node trong NVS. Firmware Tag/Scanner cung cấp dữ liệu đầu vào cho giao diện tích hợp.</w:t>
       </w:r>
     </w:p>
     <w:p>
@@ -11529,7 +11524,7 @@
         <w:ind w:firstLine="567"/>
       </w:pPr>
       <w:r>
-        <w:t>Định dạng TAG_STATUS và các opcode vendor là hợp đồng giao tiếp giữa firmware edge và Gateway. Việc giám sát node được thực hiện bằng Config Client DEFAULT_TTL_GET của BLE Mesh, không dùng một opcode heartbeat riêng. BLE Mesh, cơ chế provision và Relay được giữ như nội dung chung; phần B bắt đầu tại điểm Gateway nhận, xác thực cấu trúc và xếp hàng message.</w:t>
+        <w:t>Định dạng TAG_STATUS và các opcode vendor là hợp đồng giao tiếp giữa firmware edge và Gateway. Việc giám sát node được thực hiện bằng Config Client DEFAULT_TTL_GET của BLE Mesh, không dùng một opcode heartbeat riêng. Sau khi nhận dữ liệu, Gateway xác thực cấu trúc và xếp hàng message để chuyển lên máy chủ.</w:t>
       </w:r>
     </w:p>
     <w:p>
@@ -11619,13 +11614,9 @@
     <w:p/>
     <w:p/>
     <w:p>
-      <w:r>
-        <w:br w:type="page"/>
-      </w:r>
-    </w:p>
-    <w:p>
       <w:pPr>
         <w:pStyle w:val="Heading1"/>
+        <w:pageBreakBefore/>
         <w:spacing w:before="240" w:after="120" w:line="240" w:lineRule="auto"/>
         <w:rPr>
           <w:rFonts w:ascii="Times New Roman" w:hAnsi="Times New Roman" w:cs="Times New Roman"/>
@@ -15536,11 +15527,6 @@
       </w:r>
     </w:p>
     <w:p>
-      <w:r>
-        <w:br w:type="page"/>
-      </w:r>
-    </w:p>
-    <w:p>
       <w:pPr>
         <w:keepNext/>
         <w:jc w:val="center"/>
@@ -15676,11 +15662,6 @@
       </w:r>
     </w:p>
     <w:p>
-      <w:r>
-        <w:br w:type="page"/>
-      </w:r>
-    </w:p>
-    <w:p>
       <w:pPr>
         <w:keepNext/>
         <w:jc w:val="center"/>
@@ -22530,13 +22511,9 @@
       </w:r>
     </w:p>
     <w:p>
-      <w:r>
-        <w:br w:type="page"/>
-      </w:r>
-    </w:p>
-    <w:p>
       <w:pPr>
         <w:pStyle w:val="Heading1"/>
+        <w:pageBreakBefore/>
         <w:spacing w:after="120" w:line="240" w:lineRule="auto"/>
         <w:rPr>
           <w:rFonts w:ascii="Times New Roman" w:hAnsi="Times New Roman" w:cs="Times New Roman"/>
@@ -22582,7 +22559,7 @@
         <w:ind w:firstLine="567"/>
       </w:pPr>
       <w:r>
-        <w:t>Đề tài xây dựng một hệ thống định vị trong nhà mức phòng, mã nguồn mở, tự host được từ đầu tới cuối. Kiến trúc, BLE Mesh và kết quả Chương 5 là thành quả chung. Trong đó, đóng góp cá nhân của phần B là Gateway và tuyến xử lý server-side; các đóng góp của toàn hệ thống gồm:</w:t>
+        <w:t>Đề tài xây dựng một hệ thống định vị trong nhà mức phòng, mã nguồn mở và có thể tự host từ đầu tới cuối. Các đóng góp chính của hệ thống gồm:</w:t>
       </w:r>
     </w:p>
     <w:p>
@@ -22605,7 +22582,7 @@
         <w:pStyle w:val="ListBullet"/>
       </w:pPr>
       <w:r>
-        <w:t>Đóng góp riêng của phần B: triển khai Gateway nhận TAG_STATUS qua callback BLE Mesh, tách callback và MQTTS bằng hàng đợi FreeRTOS, kết nối Wi-Fi/TLS, đóng gói Gateway API, chủ động thăm dò node bằng Config Client, duy trì data watchdog và phục hồi out_of_range; xây dựng Rule Chain cùng dashboard hỗ trợ nhiều Tag. OTA không thuộc đóng góp cá nhân phần B.</w:t>
+        <w:t>Triển khai Gateway nhận TAG_STATUS qua callback BLE Mesh, tách callback và MQTTS bằng hàng đợi FreeRTOS, kết nối Wi-Fi/TLS, đóng gói Gateway API, chủ động thăm dò node bằng Config Client, duy trì data watchdog và phục hồi out_of_range; xây dựng Rule Chain cùng dashboard hỗ trợ nhiều Tag.</w:t>
       </w:r>
     </w:p>
     <w:p>
@@ -22802,6 +22779,7 @@
     <w:p>
       <w:pPr>
         <w:pStyle w:val="Heading1"/>
+        <w:pageBreakBefore/>
         <w:spacing w:after="120" w:line="240" w:lineRule="auto"/>
         <w:rPr>
           <w:rFonts w:ascii="Times New Roman" w:hAnsi="Times New Roman" w:cs="Times New Roman"/>
@@ -22938,6 +22916,7 @@
     <w:p>
       <w:pPr>
         <w:pStyle w:val="Heading1"/>
+        <w:pageBreakBefore/>
         <w:spacing w:before="120" w:after="60"/>
         <w:rPr>
           <w:rFonts w:ascii="Times New Roman" w:eastAsia="Times New Roman" w:hAnsi="Times New Roman" w:cs="Times New Roman"/>

</xml_diff>